<commit_message>
feat(tesis): escenario base del FMI de mayo de 2026, capitulo de Datos corto (59 paginas)
- extraer_escenario_base_fmi_cr26105.py: Table 6 y 7 del Informe 26/105 leidas por coordenadas
- fase25: --escenario cr26105 (principal, umbral 1%) / cr2595 (robustez, 3%); lam = GFN/deuda
  promedio de los seis primeros anios del escenario (0,28)
- Resultados, Discusion, Conclusiones, Resumen, Metodologia e Introduccion con las cifras nuevas
- H1a con deuda bruta deja de ser significativa: corregido el texto que decia que se mantenia
- fase25c_canales_fed.py: descomposicion del efecto FED (61% costo directo)
- Datos: version corta en la tesis; el detalle completo pasa a informe_construccion_de_datos.md
- Apendice: estadisticos descriptivos de la muestra de estimacion
- Guia de defensa y plan de labor actualizados

Co-Authored-By: Claude Opus 5.5 <noreply@anthropic.com>
</commit_message>
<xml_diff>
--- a/tesis_oficial_borradores/para_el_grupo/Guia_de_defensa.docx
+++ b/tesis_oficial_borradores/para_el_grupo/Guia_de_defensa.docx
@@ -100,7 +100,7 @@
         <w:t xml:space="preserve"> </w:t>
       </w:r>
       <w:r>
-        <w:t xml:space="preserve">compara nuestra probabilidad de no estabilización con el 3% del FMI.</w:t>
+        <w:t xml:space="preserve">compara nuestra probabilidad de no estabilización con la del FMI: 1% a mediano plazo y menos de 3% a diez años.</w:t>
       </w:r>
     </w:p>
     <w:p>
@@ -138,13 +138,13 @@
           <w:b/>
           <w:bCs/>
         </w:rPr>
-        <w:t xml:space="preserve">Por qué el 3% del FMI como umbral:</w:t>
-      </w:r>
-      <w:r>
-        <w:t xml:space="preserve"> </w:t>
-      </w:r>
-      <w:r>
-        <w:t xml:space="preserve">es el diagnóstico oficial vigente (FMI, 2025, anexo II: probabilidad de estabilización de alrededor de 97%). El umbral de 100% del PIB que había antes no tenía fuente y se sacó.</w:t>
+        <w:t xml:space="preserve">Por qué los umbrales del FMI:</w:t>
+      </w:r>
+      <w:r>
+        <w:t xml:space="preserve"> </w:t>
+      </w:r>
+      <w:r>
+        <w:t xml:space="preserve">son el diagnóstico oficial vigente, del análisis de sostenibilidad más reciente (FMI, 2026, Artículo IV y segunda revisión, mayo de 2026): probabilidad de estabilización de alrededor de 99% a mediano plazo y superior a 97% en el abanico de diez años. El umbral de 100% del PIB que había antes no tenía fuente y se sacó. Hasta octubre de 2026 se usaba el informe de abril de 2025 (3%), que quedó como robustez.</w:t>
       </w:r>
     </w:p>
     <w:bookmarkEnd w:id="9"/>
@@ -802,7 +802,7 @@
         <w:t xml:space="preserve"> </w:t>
       </w:r>
       <w:r>
-        <w:t xml:space="preserve">La deuda neta da 119,0% del PIB en 2023 y 61,1% en 2024, contra 110,8% y 51,5% del FMI (2025, anexo II, cuadro 2). La diferencia, de 8 a 10 puntos, viene sobre todo de los títulos en cartera del FGS, que el FMI descuenta y nosotros todavía no (Capítulo 5).</w:t>
+        <w:t xml:space="preserve">La deuda neta da 119,0% del PIB en 2023, 61,1% en 2024 y 61,0% en 2025, contra 111,1%, 53,6% y 52,1% del FMI (2026, cuadro 2). La diferencia, de 8 a 9 puntos y estable, viene sobre todo de los títulos en cartera del FGS, que el FMI descuenta y nosotros todavía no (Capítulo 5).</w:t>
       </w:r>
     </w:p>
     <w:bookmarkEnd w:id="10"/>
@@ -1125,7 +1125,7 @@
         <w:t xml:space="preserve">“arquitectura A”</w:t>
       </w:r>
       <w:r>
-        <w:t xml:space="preserve">), la probabilidad a 2030 pasa de 11,8% a 11,6%. Los dos efectos se compensan.</w:t>
+        <w:t xml:space="preserve">), la probabilidad a 2030 queda igual (11,5%) y el abanico se ensancha un poco. Los dos efectos se compensan.</w:t>
       </w:r>
     </w:p>
     <w:bookmarkEnd w:id="13"/>
@@ -1191,7 +1191,7 @@
         <w:t xml:space="preserve"> </w:t>
       </w:r>
       <w:r>
-        <w:t xml:space="preserve">el del FMI (2025, anexo II, cuadro 6). En promedio para 2026-2035 tiene crecimiento real de 3,3%, deflactor de 8,4%, tasa efectiva de 4,0% y superávit primario de 2,5% del PIB. Se usa el del FMI para que la comparación con su 3% sea directa.</w:t>
+        <w:t xml:space="preserve">el del FMI (2026, cuadro 6). En promedio para 2026-2035 tiene crecimiento real de 3,3%, deflactor de 10,8% (30,2% en 2026, 7,5% desde 2029), tasa efectiva de 4,4% y superávit primario de 2,1% del PIB. Se usa el del FMI para que la comparación con su probabilidad sea directa.</w:t>
       </w:r>
     </w:p>
     <w:p>
@@ -1235,7 +1235,7 @@
         <w:t xml:space="preserve"> </w:t>
       </w:r>
       <w:r>
-        <w:t xml:space="preserve">el tipo de cambio real revalúa el 58% de la deuda que está en moneda extranjera. La tasa en dólares (FED más EMBI+) se reprecia de a poco, a medida que vence la deuda: cada año se refinancia el 20%, que es el cociente entre las necesidades de financiamiento y la deuda del escenario del FMI.</w:t>
+        <w:t xml:space="preserve">el tipo de cambio real revalúa el 58% de la deuda que está en moneda extranjera. La tasa en dólares (FED más EMBI+) se reprecia de a poco, a medida que vence la deuda: cada año se refinancia el 28%, que es el cociente entre las necesidades de financiamiento promedio y la deuda promedio de los seis primeros años del escenario del FMI.</w:t>
       </w:r>
     </w:p>
     <w:p>
@@ -1510,22 +1510,22 @@
                 <w:rFonts w:ascii="Calibri" w:hAnsi="Calibri"/>
                 <w:sz w:val="20"/>
               </w:rPr>
-              <w:t xml:space="preserve">El límite inferior del intervalo de 90% supera el 3% (contraste unilateral al 5%)</w:t>
-            </w:r>
-          </w:p>
-        </w:tc>
-        <w:tc>
-          <w:tcPr/>
-          <w:p>
-            <w:pPr>
-              <w:pStyle w:val="Compact"/>
-            </w:pPr>
-            <w:r>
-              <w:rPr>
-                <w:rFonts w:ascii="Calibri" w:hAnsi="Calibri"/>
-                <w:sz w:val="20"/>
-              </w:rPr>
-              <w:t xml:space="preserve">Es la misma métrica y el mismo umbral del FMI</w:t>
+              <w:t xml:space="preserve">El límite inferior del intervalo de 90% supera la cifra del FMI para el mismo horizonte: 1% a cinco años y 3% a diez (contraste unilateral al 5%)</w:t>
+            </w:r>
+          </w:p>
+        </w:tc>
+        <w:tc>
+          <w:tcPr/>
+          <w:p>
+            <w:pPr>
+              <w:pStyle w:val="Compact"/>
+            </w:pPr>
+            <w:r>
+              <w:rPr>
+                <w:rFonts w:ascii="Calibri" w:hAnsi="Calibri"/>
+                <w:sz w:val="20"/>
+              </w:rPr>
+              <w:t xml:space="preserve">Es la misma métrica y son las mismas cifras del FMI</w:t>
             </w:r>
           </w:p>
         </w:tc>
@@ -1719,52 +1719,52 @@
                 <w:rFonts w:ascii="Calibri" w:hAnsi="Calibri"/>
                 <w:sz w:val="20"/>
               </w:rPr>
-              <w:t xml:space="preserve">Principal</w:t>
-            </w:r>
-          </w:p>
-        </w:tc>
-        <w:tc>
-          <w:tcPr/>
-          <w:p>
-            <w:pPr>
-              <w:pStyle w:val="Compact"/>
-            </w:pPr>
-            <w:r>
-              <w:rPr>
-                <w:rFonts w:ascii="Calibri" w:hAnsi="Calibri"/>
-                <w:sz w:val="20"/>
-              </w:rPr>
-              <w:t xml:space="preserve">11,8% [8,0; 15,8]</w:t>
-            </w:r>
-          </w:p>
-        </w:tc>
-        <w:tc>
-          <w:tcPr/>
-          <w:p>
-            <w:pPr>
-              <w:pStyle w:val="Compact"/>
-            </w:pPr>
-            <w:r>
-              <w:rPr>
-                <w:rFonts w:ascii="Calibri" w:hAnsi="Calibri"/>
-                <w:sz w:val="20"/>
-              </w:rPr>
-              <w:t xml:space="preserve">6,0% [3,0; 9,8]</w:t>
-            </w:r>
-          </w:p>
-        </w:tc>
-        <w:tc>
-          <w:tcPr/>
-          <w:p>
-            <w:pPr>
-              <w:pStyle w:val="Compact"/>
-            </w:pPr>
-            <w:r>
-              <w:rPr>
-                <w:rFonts w:ascii="Calibri" w:hAnsi="Calibri"/>
-                <w:sz w:val="20"/>
-              </w:rPr>
-              <w:t xml:space="preserve">61 [18; 93]</w:t>
+              <w:t xml:space="preserve">Principal (escenario FMI 2026)</w:t>
+            </w:r>
+          </w:p>
+        </w:tc>
+        <w:tc>
+          <w:tcPr/>
+          <w:p>
+            <w:pPr>
+              <w:pStyle w:val="Compact"/>
+            </w:pPr>
+            <w:r>
+              <w:rPr>
+                <w:rFonts w:ascii="Calibri" w:hAnsi="Calibri"/>
+                <w:sz w:val="20"/>
+              </w:rPr>
+              <w:t xml:space="preserve">11,5% [7,7; 15,2]</w:t>
+            </w:r>
+          </w:p>
+        </w:tc>
+        <w:tc>
+          <w:tcPr/>
+          <w:p>
+            <w:pPr>
+              <w:pStyle w:val="Compact"/>
+            </w:pPr>
+            <w:r>
+              <w:rPr>
+                <w:rFonts w:ascii="Calibri" w:hAnsi="Calibri"/>
+                <w:sz w:val="20"/>
+              </w:rPr>
+              <w:t xml:space="preserve">6,6% [3,3; 10,5]</w:t>
+            </w:r>
+          </w:p>
+        </w:tc>
+        <w:tc>
+          <w:tcPr/>
+          <w:p>
+            <w:pPr>
+              <w:pStyle w:val="Compact"/>
+            </w:pPr>
+            <w:r>
+              <w:rPr>
+                <w:rFonts w:ascii="Calibri" w:hAnsi="Calibri"/>
+                <w:sz w:val="20"/>
+              </w:rPr>
+              <w:t xml:space="preserve">58 [13; 92]</w:t>
             </w:r>
           </w:p>
         </w:tc>
@@ -1796,37 +1796,37 @@
                 <w:rFonts w:ascii="Calibri" w:hAnsi="Calibri"/>
                 <w:sz w:val="20"/>
               </w:rPr>
-              <w:t xml:space="preserve">13,0%</w:t>
-            </w:r>
-          </w:p>
-        </w:tc>
-        <w:tc>
-          <w:tcPr/>
-          <w:p>
-            <w:pPr>
-              <w:pStyle w:val="Compact"/>
-            </w:pPr>
-            <w:r>
-              <w:rPr>
-                <w:rFonts w:ascii="Calibri" w:hAnsi="Calibri"/>
-                <w:sz w:val="20"/>
-              </w:rPr>
-              <w:t xml:space="preserve">6,8%</w:t>
-            </w:r>
-          </w:p>
-        </w:tc>
-        <w:tc>
-          <w:tcPr/>
-          <w:p>
-            <w:pPr>
-              <w:pStyle w:val="Compact"/>
-            </w:pPr>
-            <w:r>
-              <w:rPr>
-                <w:rFonts w:ascii="Calibri" w:hAnsi="Calibri"/>
-                <w:sz w:val="20"/>
-              </w:rPr>
-              <w:t xml:space="preserve">63 [22; 93]</w:t>
+              <w:t xml:space="preserve">12,7%</w:t>
+            </w:r>
+          </w:p>
+        </w:tc>
+        <w:tc>
+          <w:tcPr/>
+          <w:p>
+            <w:pPr>
+              <w:pStyle w:val="Compact"/>
+            </w:pPr>
+            <w:r>
+              <w:rPr>
+                <w:rFonts w:ascii="Calibri" w:hAnsi="Calibri"/>
+                <w:sz w:val="20"/>
+              </w:rPr>
+              <w:t xml:space="preserve">7,4%</w:t>
+            </w:r>
+          </w:p>
+        </w:tc>
+        <w:tc>
+          <w:tcPr/>
+          <w:p>
+            <w:pPr>
+              <w:pStyle w:val="Compact"/>
+            </w:pPr>
+            <w:r>
+              <w:rPr>
+                <w:rFonts w:ascii="Calibri" w:hAnsi="Calibri"/>
+                <w:sz w:val="20"/>
+              </w:rPr>
+              <w:t xml:space="preserve">59 [17; 91]</w:t>
             </w:r>
           </w:p>
         </w:tc>
@@ -1858,37 +1858,37 @@
                 <w:rFonts w:ascii="Calibri" w:hAnsi="Calibri"/>
                 <w:sz w:val="20"/>
               </w:rPr>
-              <w:t xml:space="preserve">12,7%</w:t>
-            </w:r>
-          </w:p>
-        </w:tc>
-        <w:tc>
-          <w:tcPr/>
-          <w:p>
-            <w:pPr>
-              <w:pStyle w:val="Compact"/>
-            </w:pPr>
-            <w:r>
-              <w:rPr>
-                <w:rFonts w:ascii="Calibri" w:hAnsi="Calibri"/>
-                <w:sz w:val="20"/>
-              </w:rPr>
-              <w:t xml:space="preserve">7,3%</w:t>
-            </w:r>
-          </w:p>
-        </w:tc>
-        <w:tc>
-          <w:tcPr/>
-          <w:p>
-            <w:pPr>
-              <w:pStyle w:val="Compact"/>
-            </w:pPr>
-            <w:r>
-              <w:rPr>
-                <w:rFonts w:ascii="Calibri" w:hAnsi="Calibri"/>
-                <w:sz w:val="20"/>
-              </w:rPr>
-              <w:t xml:space="preserve">57 [0,1; 95]</w:t>
+              <w:t xml:space="preserve">12,3%</w:t>
+            </w:r>
+          </w:p>
+        </w:tc>
+        <w:tc>
+          <w:tcPr/>
+          <w:p>
+            <w:pPr>
+              <w:pStyle w:val="Compact"/>
+            </w:pPr>
+            <w:r>
+              <w:rPr>
+                <w:rFonts w:ascii="Calibri" w:hAnsi="Calibri"/>
+                <w:sz w:val="20"/>
+              </w:rPr>
+              <w:t xml:space="preserve">7,8%</w:t>
+            </w:r>
+          </w:p>
+        </w:tc>
+        <w:tc>
+          <w:tcPr/>
+          <w:p>
+            <w:pPr>
+              <w:pStyle w:val="Compact"/>
+            </w:pPr>
+            <w:r>
+              <w:rPr>
+                <w:rFonts w:ascii="Calibri" w:hAnsi="Calibri"/>
+                <w:sz w:val="20"/>
+              </w:rPr>
+              <w:t xml:space="preserve">53 [-7; 94]</w:t>
             </w:r>
           </w:p>
         </w:tc>
@@ -1935,22 +1935,22 @@
                 <w:rFonts w:ascii="Calibri" w:hAnsi="Calibri"/>
                 <w:sz w:val="20"/>
               </w:rPr>
-              <w:t xml:space="preserve">7,6%</w:t>
-            </w:r>
-          </w:p>
-        </w:tc>
-        <w:tc>
-          <w:tcPr/>
-          <w:p>
-            <w:pPr>
-              <w:pStyle w:val="Compact"/>
-            </w:pPr>
-            <w:r>
-              <w:rPr>
-                <w:rFonts w:ascii="Calibri" w:hAnsi="Calibri"/>
-                <w:sz w:val="20"/>
-              </w:rPr>
-              <w:t xml:space="preserve">66 [22; 95]</w:t>
+              <w:t xml:space="preserve">8,8%</w:t>
+            </w:r>
+          </w:p>
+        </w:tc>
+        <w:tc>
+          <w:tcPr/>
+          <w:p>
+            <w:pPr>
+              <w:pStyle w:val="Compact"/>
+            </w:pPr>
+            <w:r>
+              <w:rPr>
+                <w:rFonts w:ascii="Calibri" w:hAnsi="Calibri"/>
+                <w:sz w:val="20"/>
+              </w:rPr>
+              <w:t xml:space="preserve">64 [17; 94]</w:t>
             </w:r>
           </w:p>
         </w:tc>
@@ -1982,37 +1982,37 @@
                 <w:rFonts w:ascii="Calibri" w:hAnsi="Calibri"/>
                 <w:sz w:val="20"/>
               </w:rPr>
-              <w:t xml:space="preserve">11,6%</w:t>
-            </w:r>
-          </w:p>
-        </w:tc>
-        <w:tc>
-          <w:tcPr/>
-          <w:p>
-            <w:pPr>
-              <w:pStyle w:val="Compact"/>
-            </w:pPr>
-            <w:r>
-              <w:rPr>
-                <w:rFonts w:ascii="Calibri" w:hAnsi="Calibri"/>
-                <w:sz w:val="20"/>
-              </w:rPr>
-              <w:t xml:space="preserve">5,7%</w:t>
-            </w:r>
-          </w:p>
-        </w:tc>
-        <w:tc>
-          <w:tcPr/>
-          <w:p>
-            <w:pPr>
-              <w:pStyle w:val="Compact"/>
-            </w:pPr>
-            <w:r>
-              <w:rPr>
-                <w:rFonts w:ascii="Calibri" w:hAnsi="Calibri"/>
-                <w:sz w:val="20"/>
-              </w:rPr>
-              <w:t xml:space="preserve">61 [17; 93]</w:t>
+              <w:t xml:space="preserve">11,5%</w:t>
+            </w:r>
+          </w:p>
+        </w:tc>
+        <w:tc>
+          <w:tcPr/>
+          <w:p>
+            <w:pPr>
+              <w:pStyle w:val="Compact"/>
+            </w:pPr>
+            <w:r>
+              <w:rPr>
+                <w:rFonts w:ascii="Calibri" w:hAnsi="Calibri"/>
+                <w:sz w:val="20"/>
+              </w:rPr>
+              <w:t xml:space="preserve">6,1%</w:t>
+            </w:r>
+          </w:p>
+        </w:tc>
+        <w:tc>
+          <w:tcPr/>
+          <w:p>
+            <w:pPr>
+              <w:pStyle w:val="Compact"/>
+            </w:pPr>
+            <w:r>
+              <w:rPr>
+                <w:rFonts w:ascii="Calibri" w:hAnsi="Calibri"/>
+                <w:sz w:val="20"/>
+              </w:rPr>
+              <w:t xml:space="preserve">58 [12; 92]</w:t>
             </w:r>
           </w:p>
         </w:tc>
@@ -2029,7 +2029,7 @@
                 <w:rFonts w:ascii="Calibri" w:hAnsi="Calibri"/>
                 <w:sz w:val="20"/>
               </w:rPr>
-              <w:t xml:space="preserve">Cholesky en el orden de Santiago</w:t>
+              <w:t xml:space="preserve">Escenario del FMI de 2025</w:t>
             </w:r>
           </w:p>
         </w:tc>
@@ -2074,7 +2074,7 @@
                 <w:rFonts w:ascii="Calibri" w:hAnsi="Calibri"/>
                 <w:sz w:val="20"/>
               </w:rPr>
-              <w:t xml:space="preserve">79 [38; 96]</w:t>
+              <w:t xml:space="preserve">61 [18; 93]</w:t>
             </w:r>
           </w:p>
         </w:tc>
@@ -2091,52 +2091,52 @@
                 <w:rFonts w:ascii="Calibri" w:hAnsi="Calibri"/>
                 <w:sz w:val="20"/>
               </w:rPr>
-              <w:t xml:space="preserve">Cholesky con el fiscal primero</w:t>
-            </w:r>
-          </w:p>
-        </w:tc>
-        <w:tc>
-          <w:tcPr/>
-          <w:p>
-            <w:pPr>
-              <w:pStyle w:val="Compact"/>
-            </w:pPr>
-            <w:r>
-              <w:rPr>
-                <w:rFonts w:ascii="Calibri" w:hAnsi="Calibri"/>
-                <w:sz w:val="20"/>
-              </w:rPr>
-              <w:t xml:space="preserve">11,8%</w:t>
-            </w:r>
-          </w:p>
-        </w:tc>
-        <w:tc>
-          <w:tcPr/>
-          <w:p>
-            <w:pPr>
-              <w:pStyle w:val="Compact"/>
-            </w:pPr>
-            <w:r>
-              <w:rPr>
-                <w:rFonts w:ascii="Calibri" w:hAnsi="Calibri"/>
-                <w:sz w:val="20"/>
-              </w:rPr>
-              <w:t xml:space="preserve">6,0%</w:t>
-            </w:r>
-          </w:p>
-        </w:tc>
-        <w:tc>
-          <w:tcPr/>
-          <w:p>
-            <w:pPr>
-              <w:pStyle w:val="Compact"/>
-            </w:pPr>
-            <w:r>
-              <w:rPr>
-                <w:rFonts w:ascii="Calibri" w:hAnsi="Calibri"/>
-                <w:sz w:val="20"/>
-              </w:rPr>
-              <w:t xml:space="preserve">34 [-43; 87]</w:t>
+              <w:t xml:space="preserve">Cholesky en el orden de Santiago</w:t>
+            </w:r>
+          </w:p>
+        </w:tc>
+        <w:tc>
+          <w:tcPr/>
+          <w:p>
+            <w:pPr>
+              <w:pStyle w:val="Compact"/>
+            </w:pPr>
+            <w:r>
+              <w:rPr>
+                <w:rFonts w:ascii="Calibri" w:hAnsi="Calibri"/>
+                <w:sz w:val="20"/>
+              </w:rPr>
+              <w:t xml:space="preserve">11,6%</w:t>
+            </w:r>
+          </w:p>
+        </w:tc>
+        <w:tc>
+          <w:tcPr/>
+          <w:p>
+            <w:pPr>
+              <w:pStyle w:val="Compact"/>
+            </w:pPr>
+            <w:r>
+              <w:rPr>
+                <w:rFonts w:ascii="Calibri" w:hAnsi="Calibri"/>
+                <w:sz w:val="20"/>
+              </w:rPr>
+              <w:t xml:space="preserve">6,6%</w:t>
+            </w:r>
+          </w:p>
+        </w:tc>
+        <w:tc>
+          <w:tcPr/>
+          <w:p>
+            <w:pPr>
+              <w:pStyle w:val="Compact"/>
+            </w:pPr>
+            <w:r>
+              <w:rPr>
+                <w:rFonts w:ascii="Calibri" w:hAnsi="Calibri"/>
+                <w:sz w:val="20"/>
+              </w:rPr>
+              <w:t xml:space="preserve">78 [35; 96]</w:t>
             </w:r>
           </w:p>
         </w:tc>
@@ -2153,6 +2153,68 @@
                 <w:rFonts w:ascii="Calibri" w:hAnsi="Calibri"/>
                 <w:sz w:val="20"/>
               </w:rPr>
+              <w:t xml:space="preserve">Cholesky con el fiscal primero</w:t>
+            </w:r>
+          </w:p>
+        </w:tc>
+        <w:tc>
+          <w:tcPr/>
+          <w:p>
+            <w:pPr>
+              <w:pStyle w:val="Compact"/>
+            </w:pPr>
+            <w:r>
+              <w:rPr>
+                <w:rFonts w:ascii="Calibri" w:hAnsi="Calibri"/>
+                <w:sz w:val="20"/>
+              </w:rPr>
+              <w:t xml:space="preserve">11,5%</w:t>
+            </w:r>
+          </w:p>
+        </w:tc>
+        <w:tc>
+          <w:tcPr/>
+          <w:p>
+            <w:pPr>
+              <w:pStyle w:val="Compact"/>
+            </w:pPr>
+            <w:r>
+              <w:rPr>
+                <w:rFonts w:ascii="Calibri" w:hAnsi="Calibri"/>
+                <w:sz w:val="20"/>
+              </w:rPr>
+              <w:t xml:space="preserve">6,6%</w:t>
+            </w:r>
+          </w:p>
+        </w:tc>
+        <w:tc>
+          <w:tcPr/>
+          <w:p>
+            <w:pPr>
+              <w:pStyle w:val="Compact"/>
+            </w:pPr>
+            <w:r>
+              <w:rPr>
+                <w:rFonts w:ascii="Calibri" w:hAnsi="Calibri"/>
+                <w:sz w:val="20"/>
+              </w:rPr>
+              <w:t xml:space="preserve">33 [-48; 87]</w:t>
+            </w:r>
+          </w:p>
+        </w:tc>
+      </w:tr>
+      <w:tr>
+        <w:tc>
+          <w:tcPr/>
+          <w:p>
+            <w:pPr>
+              <w:pStyle w:val="Compact"/>
+            </w:pPr>
+            <w:r>
+              <w:rPr>
+                <w:rFonts w:ascii="Calibri" w:hAnsi="Calibri"/>
+                <w:sz w:val="20"/>
+              </w:rPr>
               <w:t xml:space="preserve">Shocks a la manera del FMI</w:t>
             </w:r>
           </w:p>
@@ -2168,22 +2230,22 @@
                 <w:rFonts w:ascii="Calibri" w:hAnsi="Calibri"/>
                 <w:sz w:val="20"/>
               </w:rPr>
-              <w:t xml:space="preserve">23,5%</w:t>
-            </w:r>
-          </w:p>
-        </w:tc>
-        <w:tc>
-          <w:tcPr/>
-          <w:p>
-            <w:pPr>
-              <w:pStyle w:val="Compact"/>
-            </w:pPr>
-            <w:r>
-              <w:rPr>
-                <w:rFonts w:ascii="Calibri" w:hAnsi="Calibri"/>
-                <w:sz w:val="20"/>
-              </w:rPr>
-              <w:t xml:space="preserve">15,1%</w:t>
+              <w:t xml:space="preserve">23,0%</w:t>
+            </w:r>
+          </w:p>
+        </w:tc>
+        <w:tc>
+          <w:tcPr/>
+          <w:p>
+            <w:pPr>
+              <w:pStyle w:val="Compact"/>
+            </w:pPr>
+            <w:r>
+              <w:rPr>
+                <w:rFonts w:ascii="Calibri" w:hAnsi="Calibri"/>
+                <w:sz w:val="20"/>
+              </w:rPr>
+              <w:t xml:space="preserve">15,2%</w:t>
             </w:r>
           </w:p>
         </w:tc>
@@ -2223,7 +2285,7 @@
         <w:t xml:space="preserve"> </w:t>
       </w:r>
       <w:r>
-        <w:t xml:space="preserve">se sostiene a cinco años en todas las especificaciones.</w:t>
+        <w:t xml:space="preserve">se sostiene a cinco y a diez años en todas las especificaciones con el escenario de 2026.</w:t>
       </w:r>
     </w:p>
     <w:p>
@@ -2267,7 +2329,7 @@
         <w:t xml:space="preserve"> </w:t>
       </w:r>
       <w:r>
-        <w:t xml:space="preserve">se sostiene en todas menos en la de Cholesky con el fiscal primero.</w:t>
+        <w:t xml:space="preserve">se sostiene en todas menos en dos: la deuda bruta (intervalo de [-7; 94]) y Cholesky con el fiscal primero.</w:t>
       </w:r>
     </w:p>
     <w:bookmarkEnd w:id="17"/>
@@ -2343,7 +2405,7 @@
         <w:t xml:space="preserve"> </w:t>
       </w:r>
       <w:r>
-        <w:t xml:space="preserve">Con Cholesky ordenando el fiscal primero, que es el orden más favorable a lo fiscal, el intervalo de la diferencia incluye el cero. La mayoría de las réplicas (78%) igual da lo no fiscal por encima.</w:t>
+        <w:t xml:space="preserve">Con Cholesky ordenando el fiscal primero, que es el orden más favorable a lo fiscal, el intervalo de la diferencia incluye el cero. La mayoría de las réplicas (77%) igual da lo no fiscal por encima. Con la deuda bruta pasa algo parecido: 92% de las réplicas da lo no fiscal por encima, pero el intervalo también incluye el cero.</w:t>
       </w:r>
       <w:r>
         <w:t xml:space="preserve"> </w:t>
@@ -2413,7 +2475,7 @@
           <w:b/>
           <w:bCs/>
         </w:rPr>
-        <w:t xml:space="preserve">“El escenario base del FMI es de abril de 2025 y ya está viejo.”</w:t>
+        <w:t xml:space="preserve">“¿Por qué ese escenario del FMI y no otro?”</w:t>
       </w:r>
       <w:r>
         <w:t xml:space="preserve"> </w:t>
@@ -2429,13 +2491,223 @@
           <w:b/>
           <w:bCs/>
         </w:rPr>
+        <w:t xml:space="preserve">Respuesta:</w:t>
+      </w:r>
+      <w:r>
+        <w:t xml:space="preserve"> </w:t>
+      </w:r>
+      <w:r>
+        <w:t xml:space="preserve">es el análisis de sostenibilidad más reciente del FMI (mayo de 2026). Hasta octubre de 2026 se usaba el de abril de 2025, y con ese escenario los resultados son casi los mismos (11,8% a cinco años), así que la conclusión no depende de cuál se use.</w:t>
+      </w:r>
+      <w:r>
+        <w:t xml:space="preserve"> </w:t>
+      </w:r>
+      <w:r>
+        <w:t xml:space="preserve">-</w:t>
+      </w:r>
+      <w:r>
+        <w:t xml:space="preserve"> </w:t>
+      </w:r>
+      <w:r>
+        <w:rPr>
+          <w:b/>
+          <w:bCs/>
+        </w:rPr>
+        <w:t xml:space="preserve">Cuidado:</w:t>
+      </w:r>
+      <w:r>
+        <w:t xml:space="preserve"> </w:t>
+      </w:r>
+      <w:r>
+        <w:t xml:space="preserve">el escenario y el umbral tienen que salir del mismo informe. Por eso con el escenario de 2026 se compara contra 1%, y con el de 2025, contra 3%.</w:t>
+      </w:r>
+    </w:p>
+    <w:p>
+      <w:pPr>
+        <w:pStyle w:val="BodyText"/>
+      </w:pPr>
+      <w:r>
+        <w:rPr>
+          <w:b/>
+          <w:bCs/>
+        </w:rPr>
+        <w:t xml:space="preserve">3.</w:t>
+      </w:r>
+      <w:r>
+        <w:rPr>
+          <w:b/>
+          <w:bCs/>
+        </w:rPr>
+        <w:t xml:space="preserve"> </w:t>
+      </w:r>
+      <w:r>
+        <w:rPr>
+          <w:b/>
+          <w:bCs/>
+        </w:rPr>
+        <w:t xml:space="preserve">“Comparan su deuda consolidada neta con la deuda federal bruta del FMI.”</w:t>
+      </w:r>
+      <w:r>
+        <w:t xml:space="preserve"> </w:t>
+      </w:r>
+      <w:r>
+        <w:t xml:space="preserve">-</w:t>
+      </w:r>
+      <w:r>
+        <w:t xml:space="preserve"> </w:t>
+      </w:r>
+      <w:r>
+        <w:rPr>
+          <w:b/>
+          <w:bCs/>
+        </w:rPr>
+        <w:t xml:space="preserve">Es cierto.</w:t>
+      </w:r>
+      <w:r>
+        <w:t xml:space="preserve"> </w:t>
+      </w:r>
+      <w:r>
+        <w:t xml:space="preserve">Por eso se reporta también la bruta, y el resultado de H1b no cambia (12,3%).</w:t>
+      </w:r>
+      <w:r>
+        <w:t xml:space="preserve"> </w:t>
+      </w:r>
+      <w:r>
+        <w:t xml:space="preserve">-</w:t>
+      </w:r>
+      <w:r>
+        <w:t xml:space="preserve"> </w:t>
+      </w:r>
+      <w:r>
+        <w:rPr>
+          <w:b/>
+          <w:bCs/>
+        </w:rPr>
+        <w:t xml:space="preserve">Además:</w:t>
+      </w:r>
+      <w:r>
+        <w:t xml:space="preserve"> </w:t>
+      </w:r>
+      <w:r>
+        <w:t xml:space="preserve">con el procedimiento del FMI aplicado a nuestros datos sale 23,0%, no 1%. La diferencia con el FMI no es solo de perímetro. Su 3% no se puede reproducir porque el FMI no publica sus datos de entrada.</w:t>
+      </w:r>
+    </w:p>
+    <w:p>
+      <w:pPr>
+        <w:pStyle w:val="BodyText"/>
+      </w:pPr>
+      <w:r>
+        <w:rPr>
+          <w:b/>
+          <w:bCs/>
+        </w:rPr>
+        <w:t xml:space="preserve">4.</w:t>
+      </w:r>
+      <w:r>
+        <w:rPr>
+          <w:b/>
+          <w:bCs/>
+        </w:rPr>
+        <w:t xml:space="preserve"> </w:t>
+      </w:r>
+      <w:r>
+        <w:rPr>
+          <w:b/>
+          <w:bCs/>
+        </w:rPr>
+        <w:t xml:space="preserve">“La tasa efectiva y el ajuste stock-flujo del escenario son de la deuda federal bruta, no de la consolidada neta.”</w:t>
+      </w:r>
+      <w:r>
+        <w:t xml:space="preserve"> </w:t>
+      </w:r>
+      <w:r>
+        <w:t xml:space="preserve">-</w:t>
+      </w:r>
+      <w:r>
+        <w:t xml:space="preserve"> </w:t>
+      </w:r>
+      <w:r>
+        <w:rPr>
+          <w:b/>
+          <w:bCs/>
+        </w:rPr>
+        <w:t xml:space="preserve">Es cierto.</w:t>
+      </w:r>
+      <w:r>
+        <w:t xml:space="preserve"> </w:t>
+      </w:r>
+      <w:r>
+        <w:t xml:space="preserve">Es una aproximación. El ajuste stock-flujo del FMI (4,2 y 4,7 puntos en 2026 y 2027, por la indexación de bonos y los intereses capitalizados) se suma igual a nuestra deuda.</w:t>
+      </w:r>
+      <w:r>
+        <w:t xml:space="preserve"> </w:t>
+      </w:r>
+      <w:r>
+        <w:t xml:space="preserve">-</w:t>
+      </w:r>
+      <w:r>
+        <w:t xml:space="preserve"> </w:t>
+      </w:r>
+      <w:r>
+        <w:rPr>
+          <w:b/>
+          <w:bCs/>
+        </w:rPr>
+        <w:t xml:space="preserve">Mejora:</w:t>
+      </w:r>
+      <w:r>
+        <w:t xml:space="preserve"> </w:t>
+      </w:r>
+      <w:r>
+        <w:t xml:space="preserve">correr una variante con el ajuste stock-flujo en cero para mostrar que no cambia la conclusión.</w:t>
+      </w:r>
+    </w:p>
+    <w:p>
+      <w:pPr>
+        <w:pStyle w:val="BodyText"/>
+      </w:pPr>
+      <w:r>
+        <w:rPr>
+          <w:b/>
+          <w:bCs/>
+        </w:rPr>
+        <w:t xml:space="preserve">5.</w:t>
+      </w:r>
+      <w:r>
+        <w:rPr>
+          <w:b/>
+          <w:bCs/>
+        </w:rPr>
+        <w:t xml:space="preserve"> </w:t>
+      </w:r>
+      <w:r>
+        <w:rPr>
+          <w:b/>
+          <w:bCs/>
+        </w:rPr>
+        <w:t xml:space="preserve">“Los coeficientes son los mismos en convertibilidad, default, alta inflación y desinflación.”</w:t>
+      </w:r>
+      <w:r>
+        <w:t xml:space="preserve"> </w:t>
+      </w:r>
+      <w:r>
+        <w:t xml:space="preserve">-</w:t>
+      </w:r>
+      <w:r>
+        <w:t xml:space="preserve"> </w:t>
+      </w:r>
+      <w:r>
+        <w:rPr>
+          <w:b/>
+          <w:bCs/>
+        </w:rPr>
         <w:t xml:space="preserve">Es cierto:</w:t>
       </w:r>
       <w:r>
         <w:t xml:space="preserve"> </w:t>
       </w:r>
       <w:r>
-        <w:t xml:space="preserve">proyecta un deflactor de 14,5% para 2026 y estabilidad del tipo de cambio real.</w:t>
+        <w:t xml:space="preserve">las binarias de quiebre solo mueven el nivel, no las pendientes.</w:t>
       </w:r>
       <w:r>
         <w:t xml:space="preserve"> </w:t>
@@ -2457,7 +2729,7 @@
         <w:t xml:space="preserve"> </w:t>
       </w:r>
       <w:r>
-        <w:t xml:space="preserve">se eligió para comparar con el 3% del mismo informe. Cambiar el escenario sin cambiar el umbral rompe la comparación.</w:t>
+        <w:t xml:space="preserve">con 111 trimestres no hay grados de libertad para estimar cuatro modelos distintos. Los quiebres sí capturan los cambios de nivel.</w:t>
       </w:r>
       <w:r>
         <w:t xml:space="preserve"> </w:t>
@@ -2479,7 +2751,7 @@
         <w:t xml:space="preserve"> </w:t>
       </w:r>
       <w:r>
-        <w:t xml:space="preserve">si el FMI publicó un análisis posterior (se está verificando), usar ese escenario y su probabilidad.</w:t>
+        <w:t xml:space="preserve">estimar desde 2004 como robustez (pierde el default pero gana homogeneidad).</w:t>
       </w:r>
     </w:p>
     <w:p>
@@ -2491,21 +2763,21 @@
           <w:b/>
           <w:bCs/>
         </w:rPr>
-        <w:t xml:space="preserve">3.</w:t>
-      </w:r>
-      <w:r>
-        <w:rPr>
-          <w:b/>
-          <w:bCs/>
-        </w:rPr>
-        <w:t xml:space="preserve"> </w:t>
-      </w:r>
-      <w:r>
-        <w:rPr>
-          <w:b/>
-          <w:bCs/>
-        </w:rPr>
-        <w:t xml:space="preserve">“Comparan su deuda consolidada neta con la deuda federal bruta del FMI.”</w:t>
+        <w:t xml:space="preserve">6.</w:t>
+      </w:r>
+      <w:r>
+        <w:rPr>
+          <w:b/>
+          <w:bCs/>
+        </w:rPr>
+        <w:t xml:space="preserve"> </w:t>
+      </w:r>
+      <w:r>
+        <w:rPr>
+          <w:b/>
+          <w:bCs/>
+        </w:rPr>
+        <w:t xml:space="preserve">“El EMBI+ de 2002-2005 no es un costo de financiamiento: el país estaba en default.”</w:t>
       </w:r>
       <w:r>
         <w:t xml:space="preserve"> </w:t>
@@ -2527,7 +2799,7 @@
         <w:t xml:space="preserve"> </w:t>
       </w:r>
       <w:r>
-        <w:t xml:space="preserve">Por eso se reporta también la bruta, y el resultado no cambia (12,7%).</w:t>
+        <w:t xml:space="preserve">El quiebre de 2001T4 y el de 2006T2 absorben el nivel, pero las fluctuaciones de ese período igual entran en la estimación.</w:t>
       </w:r>
       <w:r>
         <w:t xml:space="preserve"> </w:t>
@@ -2543,13 +2815,13 @@
           <w:b/>
           <w:bCs/>
         </w:rPr>
-        <w:t xml:space="preserve">Además:</w:t>
-      </w:r>
-      <w:r>
-        <w:t xml:space="preserve"> </w:t>
-      </w:r>
-      <w:r>
-        <w:t xml:space="preserve">con el procedimiento del FMI aplicado a nuestros datos sale 23,5%, no 3%. La diferencia con el FMI no es solo de perímetro. Su 3% no se puede reproducir porque el FMI no publica sus datos de entrada.</w:t>
+        <w:t xml:space="preserve">Mejora:</w:t>
+      </w:r>
+      <w:r>
+        <w:t xml:space="preserve"> </w:t>
+      </w:r>
+      <w:r>
+        <w:t xml:space="preserve">la misma robustez desde 2004, o una binaria por el período de default.</w:t>
       </w:r>
     </w:p>
     <w:p>
@@ -2561,21 +2833,21 @@
           <w:b/>
           <w:bCs/>
         </w:rPr>
-        <w:t xml:space="preserve">4.</w:t>
-      </w:r>
-      <w:r>
-        <w:rPr>
-          <w:b/>
-          <w:bCs/>
-        </w:rPr>
-        <w:t xml:space="preserve"> </w:t>
-      </w:r>
-      <w:r>
-        <w:rPr>
-          <w:b/>
-          <w:bCs/>
-        </w:rPr>
-        <w:t xml:space="preserve">“La tasa efectiva y el ajuste stock-flujo del escenario son de la deuda federal bruta, no de la consolidada neta.”</w:t>
+        <w:t xml:space="preserve">7.</w:t>
+      </w:r>
+      <w:r>
+        <w:rPr>
+          <w:b/>
+          <w:bCs/>
+        </w:rPr>
+        <w:t xml:space="preserve"> </w:t>
+      </w:r>
+      <w:r>
+        <w:rPr>
+          <w:b/>
+          <w:bCs/>
+        </w:rPr>
+        <w:t xml:space="preserve">“La variación de la tasa de la FED no es un shock: es en parte anticipada.”</w:t>
       </w:r>
       <w:r>
         <w:t xml:space="preserve"> </w:t>
@@ -2597,7 +2869,7 @@
         <w:t xml:space="preserve"> </w:t>
       </w:r>
       <w:r>
-        <w:t xml:space="preserve">Es una aproximación. El ajuste stock-flujo del FMI (2,5 a 2,8 puntos en 2026-2028) se suma igual a nuestra deuda.</w:t>
+        <w:t xml:space="preserve">Santiago ya proponía usar shocks identificados por la literatura (de alta frecuencia o narrativos).</w:t>
       </w:r>
       <w:r>
         <w:t xml:space="preserve"> </w:t>
@@ -2613,13 +2885,35 @@
           <w:b/>
           <w:bCs/>
         </w:rPr>
+        <w:t xml:space="preserve">Respuesta:</w:t>
+      </w:r>
+      <w:r>
+        <w:t xml:space="preserve"> </w:t>
+      </w:r>
+      <w:r>
+        <w:t xml:space="preserve">la tasa es exógena para Argentina aunque sea anticipada en Estados Unidos.</w:t>
+      </w:r>
+      <w:r>
+        <w:t xml:space="preserve"> </w:t>
+      </w:r>
+      <w:r>
+        <w:t xml:space="preserve">-</w:t>
+      </w:r>
+      <w:r>
+        <w:t xml:space="preserve"> </w:t>
+      </w:r>
+      <w:r>
+        <w:rPr>
+          <w:b/>
+          <w:bCs/>
+        </w:rPr>
         <w:t xml:space="preserve">Mejora:</w:t>
       </w:r>
       <w:r>
         <w:t xml:space="preserve"> </w:t>
       </w:r>
       <w:r>
-        <w:t xml:space="preserve">correr una variante con el ajuste stock-flujo en cero para mostrar que no cambia la conclusión.</w:t>
+        <w:t xml:space="preserve">reemplazarla por una serie de shocks monetarios de alta frecuencia publicada. Quedó en las líneas futuras.</w:t>
       </w:r>
     </w:p>
     <w:p>
@@ -2631,21 +2925,21 @@
           <w:b/>
           <w:bCs/>
         </w:rPr>
-        <w:t xml:space="preserve">5.</w:t>
-      </w:r>
-      <w:r>
-        <w:rPr>
-          <w:b/>
-          <w:bCs/>
-        </w:rPr>
-        <w:t xml:space="preserve"> </w:t>
-      </w:r>
-      <w:r>
-        <w:rPr>
-          <w:b/>
-          <w:bCs/>
-        </w:rPr>
-        <w:t xml:space="preserve">“Los coeficientes son los mismos en convertibilidad, default, alta inflación y desinflación.”</w:t>
+        <w:t xml:space="preserve">8.</w:t>
+      </w:r>
+      <w:r>
+        <w:rPr>
+          <w:b/>
+          <w:bCs/>
+        </w:rPr>
+        <w:t xml:space="preserve"> </w:t>
+      </w:r>
+      <w:r>
+        <w:rPr>
+          <w:b/>
+          <w:bCs/>
+        </w:rPr>
+        <w:t xml:space="preserve">“Las respuestas a la FED no son significativas, pero H2 sí.”</w:t>
       </w:r>
       <w:r>
         <w:t xml:space="preserve"> </w:t>
@@ -2661,267 +2955,13 @@
           <w:b/>
           <w:bCs/>
         </w:rPr>
-        <w:t xml:space="preserve">Es cierto:</w:t>
-      </w:r>
-      <w:r>
-        <w:t xml:space="preserve"> </w:t>
-      </w:r>
-      <w:r>
-        <w:t xml:space="preserve">las binarias de quiebre solo mueven el nivel, no las pendientes.</w:t>
-      </w:r>
-      <w:r>
-        <w:t xml:space="preserve"> </w:t>
-      </w:r>
-      <w:r>
-        <w:t xml:space="preserve">-</w:t>
-      </w:r>
-      <w:r>
-        <w:t xml:space="preserve"> </w:t>
-      </w:r>
-      <w:r>
-        <w:rPr>
-          <w:b/>
-          <w:bCs/>
-        </w:rPr>
-        <w:t xml:space="preserve">Respuesta:</w:t>
-      </w:r>
-      <w:r>
-        <w:t xml:space="preserve"> </w:t>
-      </w:r>
-      <w:r>
-        <w:t xml:space="preserve">con 111 trimestres no hay grados de libertad para estimar cuatro modelos distintos. Los quiebres sí capturan los cambios de nivel.</w:t>
-      </w:r>
-      <w:r>
-        <w:t xml:space="preserve"> </w:t>
-      </w:r>
-      <w:r>
-        <w:t xml:space="preserve">-</w:t>
-      </w:r>
-      <w:r>
-        <w:t xml:space="preserve"> </w:t>
-      </w:r>
-      <w:r>
-        <w:rPr>
-          <w:b/>
-          <w:bCs/>
-        </w:rPr>
-        <w:t xml:space="preserve">Mejora:</w:t>
-      </w:r>
-      <w:r>
-        <w:t xml:space="preserve"> </w:t>
-      </w:r>
-      <w:r>
-        <w:t xml:space="preserve">estimar desde 2004 como robustez (pierde el default pero gana homogeneidad).</w:t>
-      </w:r>
-    </w:p>
-    <w:p>
-      <w:pPr>
-        <w:pStyle w:val="BodyText"/>
-      </w:pPr>
-      <w:r>
-        <w:rPr>
-          <w:b/>
-          <w:bCs/>
-        </w:rPr>
-        <w:t xml:space="preserve">6.</w:t>
-      </w:r>
-      <w:r>
-        <w:rPr>
-          <w:b/>
-          <w:bCs/>
-        </w:rPr>
-        <w:t xml:space="preserve"> </w:t>
-      </w:r>
-      <w:r>
-        <w:rPr>
-          <w:b/>
-          <w:bCs/>
-        </w:rPr>
-        <w:t xml:space="preserve">“El EMBI+ de 2002-2005 no es un costo de financiamiento: el país estaba en default.”</w:t>
-      </w:r>
-      <w:r>
-        <w:t xml:space="preserve"> </w:t>
-      </w:r>
-      <w:r>
-        <w:t xml:space="preserve">-</w:t>
-      </w:r>
-      <w:r>
-        <w:t xml:space="preserve"> </w:t>
-      </w:r>
-      <w:r>
-        <w:rPr>
-          <w:b/>
-          <w:bCs/>
-        </w:rPr>
-        <w:t xml:space="preserve">Es cierto.</w:t>
-      </w:r>
-      <w:r>
-        <w:t xml:space="preserve"> </w:t>
-      </w:r>
-      <w:r>
-        <w:t xml:space="preserve">El quiebre de 2001T4 y el de 2006T2 absorben el nivel, pero las fluctuaciones de ese período igual entran en la estimación.</w:t>
-      </w:r>
-      <w:r>
-        <w:t xml:space="preserve"> </w:t>
-      </w:r>
-      <w:r>
-        <w:t xml:space="preserve">-</w:t>
-      </w:r>
-      <w:r>
-        <w:t xml:space="preserve"> </w:t>
-      </w:r>
-      <w:r>
-        <w:rPr>
-          <w:b/>
-          <w:bCs/>
-        </w:rPr>
-        <w:t xml:space="preserve">Mejora:</w:t>
-      </w:r>
-      <w:r>
-        <w:t xml:space="preserve"> </w:t>
-      </w:r>
-      <w:r>
-        <w:t xml:space="preserve">la misma robustez desde 2004, o una binaria por el período de default.</w:t>
-      </w:r>
-    </w:p>
-    <w:p>
-      <w:pPr>
-        <w:pStyle w:val="BodyText"/>
-      </w:pPr>
-      <w:r>
-        <w:rPr>
-          <w:b/>
-          <w:bCs/>
-        </w:rPr>
-        <w:t xml:space="preserve">7.</w:t>
-      </w:r>
-      <w:r>
-        <w:rPr>
-          <w:b/>
-          <w:bCs/>
-        </w:rPr>
-        <w:t xml:space="preserve"> </w:t>
-      </w:r>
-      <w:r>
-        <w:rPr>
-          <w:b/>
-          <w:bCs/>
-        </w:rPr>
-        <w:t xml:space="preserve">“La variación de la tasa de la FED no es un shock: es en parte anticipada.”</w:t>
-      </w:r>
-      <w:r>
-        <w:t xml:space="preserve"> </w:t>
-      </w:r>
-      <w:r>
-        <w:t xml:space="preserve">-</w:t>
-      </w:r>
-      <w:r>
-        <w:t xml:space="preserve"> </w:t>
-      </w:r>
-      <w:r>
-        <w:rPr>
-          <w:b/>
-          <w:bCs/>
-        </w:rPr>
-        <w:t xml:space="preserve">Es cierto.</w:t>
-      </w:r>
-      <w:r>
-        <w:t xml:space="preserve"> </w:t>
-      </w:r>
-      <w:r>
-        <w:t xml:space="preserve">Santiago ya proponía usar shocks identificados por la literatura (de alta frecuencia o narrativos).</w:t>
-      </w:r>
-      <w:r>
-        <w:t xml:space="preserve"> </w:t>
-      </w:r>
-      <w:r>
-        <w:t xml:space="preserve">-</w:t>
-      </w:r>
-      <w:r>
-        <w:t xml:space="preserve"> </w:t>
-      </w:r>
-      <w:r>
-        <w:rPr>
-          <w:b/>
-          <w:bCs/>
-        </w:rPr>
-        <w:t xml:space="preserve">Respuesta:</w:t>
-      </w:r>
-      <w:r>
-        <w:t xml:space="preserve"> </w:t>
-      </w:r>
-      <w:r>
-        <w:t xml:space="preserve">la tasa es exógena para Argentina aunque sea anticipada en Estados Unidos.</w:t>
-      </w:r>
-      <w:r>
-        <w:t xml:space="preserve"> </w:t>
-      </w:r>
-      <w:r>
-        <w:t xml:space="preserve">-</w:t>
-      </w:r>
-      <w:r>
-        <w:t xml:space="preserve"> </w:t>
-      </w:r>
-      <w:r>
-        <w:rPr>
-          <w:b/>
-          <w:bCs/>
-        </w:rPr>
-        <w:t xml:space="preserve">Mejora:</w:t>
-      </w:r>
-      <w:r>
-        <w:t xml:space="preserve"> </w:t>
-      </w:r>
-      <w:r>
-        <w:t xml:space="preserve">reemplazarla por una serie de shocks monetarios de alta frecuencia publicada. Quedó en las líneas futuras.</w:t>
-      </w:r>
-    </w:p>
-    <w:p>
-      <w:pPr>
-        <w:pStyle w:val="BodyText"/>
-      </w:pPr>
-      <w:r>
-        <w:rPr>
-          <w:b/>
-          <w:bCs/>
-        </w:rPr>
-        <w:t xml:space="preserve">8.</w:t>
-      </w:r>
-      <w:r>
-        <w:rPr>
-          <w:b/>
-          <w:bCs/>
-        </w:rPr>
-        <w:t xml:space="preserve"> </w:t>
-      </w:r>
-      <w:r>
-        <w:rPr>
-          <w:b/>
-          <w:bCs/>
-        </w:rPr>
-        <w:t xml:space="preserve">“Las respuestas a la FED no son significativas, pero H2 sí.”</w:t>
-      </w:r>
-      <w:r>
-        <w:t xml:space="preserve"> </w:t>
-      </w:r>
-      <w:r>
-        <w:t xml:space="preserve">-</w:t>
-      </w:r>
-      <w:r>
-        <w:t xml:space="preserve"> </w:t>
-      </w:r>
-      <w:r>
-        <w:rPr>
-          <w:b/>
-          <w:bCs/>
-        </w:rPr>
         <w:t xml:space="preserve">Es cierto, y está explicado.</w:t>
       </w:r>
       <w:r>
         <w:t xml:space="preserve"> </w:t>
       </w:r>
       <w:r>
-        <w:t xml:space="preserve">El efecto significativo de H2 viene en dos tercios del costo directo de refinanciar la deuda en dólares, no de los canales indirectos.</w:t>
+        <w:t xml:space="preserve">El efecto significativo de H2 viene en tres quintos (61%) del costo directo de refinanciar la deuda en dólares, no de los canales indirectos.</w:t>
       </w:r>
     </w:p>
     <w:p>
@@ -3167,7 +3207,7 @@
         <w:t xml:space="preserve"> </w:t>
       </w:r>
       <w:r>
-        <w:t xml:space="preserve">Los resultados casi no cambian (11,8% contra 13,0%).</w:t>
+        <w:t xml:space="preserve">Los resultados casi no cambian (11,5% contra 12,7%).</w:t>
       </w:r>
     </w:p>
     <w:p>
@@ -3369,7 +3409,7 @@
           <w:b/>
           <w:bCs/>
         </w:rPr>
-        <w:t xml:space="preserve">“La velocidad de refinanciación (20% por año) está calibrada, no estimada.”</w:t>
+        <w:t xml:space="preserve">“La velocidad de refinanciación (28% por año) está calibrada, no estimada.”</w:t>
       </w:r>
       <w:r>
         <w:t xml:space="preserve"> </w:t>
@@ -3461,7 +3501,7 @@
         <w:t xml:space="preserve"> </w:t>
       </w:r>
       <w:r>
-        <w:t xml:space="preserve">La variante con el superávit simulado da más alto (14,3% a 2030), así que la elección es conservadora.</w:t>
+        <w:t xml:space="preserve">La variante con el superávit simulado da más alto (14,6% a 2030), así que la elección es conservadora.</w:t>
       </w:r>
     </w:p>
     <w:p>
@@ -3656,13 +3696,13 @@
           <w:b/>
           <w:bCs/>
         </w:rPr>
-        <w:t xml:space="preserve">Decidir cómo se presenta la robustez de H1a a la identificación</w:t>
-      </w:r>
-      <w:r>
-        <w:t xml:space="preserve"> </w:t>
-      </w:r>
-      <w:r>
-        <w:t xml:space="preserve">(crítica 1).</w:t>
+        <w:t xml:space="preserve">Decidir cómo se presenta la robustez de H1a</w:t>
+      </w:r>
+      <w:r>
+        <w:t xml:space="preserve"> </w:t>
+      </w:r>
+      <w:r>
+        <w:t xml:space="preserve">a la identificación y al perímetro (crítica 1). Lo de la deuda bruta ya está escrito en Resultados; lo de Cholesky con el fiscal primero, todavía no.</w:t>
       </w:r>
     </w:p>
     <w:p>
@@ -3700,13 +3740,13 @@
           <w:b/>
           <w:bCs/>
         </w:rPr>
-        <w:t xml:space="preserve">Actualizar el escenario base</w:t>
-      </w:r>
-      <w:r>
-        <w:t xml:space="preserve"> </w:t>
-      </w:r>
-      <w:r>
-        <w:t xml:space="preserve">si el FMI publicó un análisis posterior al de abril de 2025 (crítica 2).</w:t>
+        <w:t xml:space="preserve">Hecho:</w:t>
+      </w:r>
+      <w:r>
+        <w:t xml:space="preserve"> </w:t>
+      </w:r>
+      <w:r>
+        <w:t xml:space="preserve">el escenario base pasó al análisis del FMI de mayo de 2026, y el de abril de 2025 quedó como robustez.</w:t>
       </w:r>
     </w:p>
     <w:p>
@@ -4007,7 +4047,7 @@
                 <w:rFonts w:ascii="Calibri" w:hAnsi="Calibri"/>
                 <w:sz w:val="20"/>
               </w:rPr>
-              <w:t xml:space="preserve">59% / 22% / 19%</w:t>
+              <w:t xml:space="preserve">60% / 19% / 21%</w:t>
             </w:r>
           </w:p>
         </w:tc>
@@ -4039,22 +4079,22 @@
                 <w:rFonts w:ascii="Calibri" w:hAnsi="Calibri"/>
                 <w:sz w:val="20"/>
               </w:rPr>
-              <w:t xml:space="preserve">11,8% [8,0; 15,8]</w:t>
-            </w:r>
-          </w:p>
-        </w:tc>
-        <w:tc>
-          <w:tcPr/>
-          <w:p>
-            <w:pPr>
-              <w:pStyle w:val="Compact"/>
-            </w:pPr>
-            <w:r>
-              <w:rPr>
-                <w:rFonts w:ascii="Calibri" w:hAnsi="Calibri"/>
-                <w:sz w:val="20"/>
-              </w:rPr>
-              <w:t xml:space="preserve">No estabilización a cinco años (FMI: 3%)</w:t>
+              <w:t xml:space="preserve">11,5% [7,7; 15,2]</w:t>
+            </w:r>
+          </w:p>
+        </w:tc>
+        <w:tc>
+          <w:tcPr/>
+          <w:p>
+            <w:pPr>
+              <w:pStyle w:val="Compact"/>
+            </w:pPr>
+            <w:r>
+              <w:rPr>
+                <w:rFonts w:ascii="Calibri" w:hAnsi="Calibri"/>
+                <w:sz w:val="20"/>
+              </w:rPr>
+              <w:t xml:space="preserve">No estabilización a cinco años (FMI: 1%)</w:t>
             </w:r>
           </w:p>
         </w:tc>
@@ -4071,22 +4111,22 @@
                 <w:rFonts w:ascii="Calibri" w:hAnsi="Calibri"/>
                 <w:sz w:val="20"/>
               </w:rPr>
-              <w:t xml:space="preserve">6,0% [3,0; 9,8]</w:t>
-            </w:r>
-          </w:p>
-        </w:tc>
-        <w:tc>
-          <w:tcPr/>
-          <w:p>
-            <w:pPr>
-              <w:pStyle w:val="Compact"/>
-            </w:pPr>
-            <w:r>
-              <w:rPr>
-                <w:rFonts w:ascii="Calibri" w:hAnsi="Calibri"/>
-                <w:sz w:val="20"/>
-              </w:rPr>
-              <w:t xml:space="preserve">No estabilización a diez años</w:t>
+              <w:t xml:space="preserve">6,6% [3,3; 10,5]</w:t>
+            </w:r>
+          </w:p>
+        </w:tc>
+        <w:tc>
+          <w:tcPr/>
+          <w:p>
+            <w:pPr>
+              <w:pStyle w:val="Compact"/>
+            </w:pPr>
+            <w:r>
+              <w:rPr>
+                <w:rFonts w:ascii="Calibri" w:hAnsi="Calibri"/>
+                <w:sz w:val="20"/>
+              </w:rPr>
+              <w:t xml:space="preserve">No estabilización a diez años (FMI: menos de 3%)</w:t>
             </w:r>
           </w:p>
         </w:tc>
@@ -4103,7 +4143,7 @@
                 <w:rFonts w:ascii="Calibri" w:hAnsi="Calibri"/>
                 <w:sz w:val="20"/>
               </w:rPr>
-              <w:t xml:space="preserve">+7,0 pp del PIB, +7,7 pp de probabilidad</w:t>
+              <w:t xml:space="preserve">+7,8 pp del PIB, +9,5 pp de probabilidad</w:t>
             </w:r>
           </w:p>
         </w:tc>
@@ -4135,7 +4175,7 @@
                 <w:rFonts w:ascii="Calibri" w:hAnsi="Calibri"/>
                 <w:sz w:val="20"/>
               </w:rPr>
-              <w:t xml:space="preserve">19,4 contra 74,2</w:t>
+              <w:t xml:space="preserve">18,6 contra 71,5</w:t>
             </w:r>
           </w:p>
         </w:tc>

</xml_diff>

<commit_message>
feat(tesis): robustez de identificacion (Cholesky), propiedades de las series y trazabilidad
- Resultados 6.6: Cholesky con el orden que deja al fiscal ultimo (H1a 78,5 [34,7; 96,2]) y con
  el fiscal primero (32,6 [-47,5; 87,4]); Limitaciones y Conclusiones ajustadas
- fase24b_propiedades_series.py: ADF, KPSS, Zivot-Andrews, Bai-Perron y Johansen (objetivo 2,
  protocolo de la metodologia de Paez); Apendice A.1 y parrafo en 6.1
- Johansen sobre variables en niveles (sin el crecimiento, que es I(0) por construccion)
- Referencias: Dickey y Fuller, KPSS, Zivot y Andrews, Johansen
- Nota 3b para el grupo: que se hizo con cada comentario de Pablo y cada propuesta de Santiago

Co-Authored-By: Claude Opus 5.5 <noreply@anthropic.com>
</commit_message>
<xml_diff>
--- a/tesis_oficial_borradores/para_el_grupo/Guia_de_defensa.docx
+++ b/tesis_oficial_borradores/para_el_grupo/Guia_de_defensa.docx
@@ -2443,13 +2443,13 @@
           <w:b/>
           <w:bCs/>
         </w:rPr>
-        <w:t xml:space="preserve">Mejora:</w:t>
-      </w:r>
-      <w:r>
-        <w:t xml:space="preserve"> </w:t>
-      </w:r>
-      <w:r>
-        <w:t xml:space="preserve">decidir con el grupo cómo presentarlo. La propuesta es mostrarlo en Robustez y Limitaciones. Todavía no está escrito en la tesis.</w:t>
+        <w:t xml:space="preserve">Cómo quedó:</w:t>
+      </w:r>
+      <w:r>
+        <w:t xml:space="preserve"> </w:t>
+      </w:r>
+      <w:r>
+        <w:t xml:space="preserve">está en Robustez (6.6) y en Limitaciones (7.5): H1a depende de identificar el shock fiscal por su respuesta al ciclo.</w:t>
       </w:r>
     </w:p>
     <w:p>
@@ -3696,13 +3696,13 @@
           <w:b/>
           <w:bCs/>
         </w:rPr>
-        <w:t xml:space="preserve">Decidir cómo se presenta la robustez de H1a</w:t>
-      </w:r>
-      <w:r>
-        <w:t xml:space="preserve"> </w:t>
-      </w:r>
-      <w:r>
-        <w:t xml:space="preserve">a la identificación y al perímetro (crítica 1). Lo de la deuda bruta ya está escrito en Resultados; lo de Cholesky con el fiscal primero, todavía no.</w:t>
+        <w:t xml:space="preserve">Hecho:</w:t>
+      </w:r>
+      <w:r>
+        <w:t xml:space="preserve"> </w:t>
+      </w:r>
+      <w:r>
+        <w:t xml:space="preserve">la robustez de H1a a la identificación y al perímetro está escrita en Robustez y en Limitaciones (crítica 1).</w:t>
       </w:r>
     </w:p>
     <w:p>

</xml_diff>

<commit_message>
fix(tesis): revision adversarial completa (metodo, datos, criterio academico) y atribucion neutral
- Revision critica consolidada para el equipo (revision_critica.md)
- Transparencia sobre criterios revisados, H2 respaldada solo en parte,
  suficiencia descripta como desplazamiento anual, escenarios de la FED
  como cambios permanentes, autovalor corregido 0,9998, multiplicador de
  largo plazo de la reaccion fiscal, comparabilidad con el FMI acotada
- Datos: fuentes, empalme del EMBI, Letras, FGS, VIX, tablas y figuras
- Plan de labor alineado con la tesis; propuesta metodologica sin nombres

Co-Authored-By: Claude Opus 5.5 <noreply@anthropic.com>
</commit_message>
<xml_diff>
--- a/tesis_oficial_borradores/para_el_grupo/Guia_de_defensa.docx
+++ b/tesis_oficial_borradores/para_el_grupo/Guia_de_defensa.docx
@@ -56,7 +56,7 @@
         <w:t xml:space="preserve"> </w:t>
       </w:r>
       <w:r>
-        <w:t xml:space="preserve">La pregunta, los objetivos y las hipótesis salen de la Introducción corregida de Santiago (7/10/2026), con los comentarios de Pablo del 15/9 incorporados.</w:t>
+        <w:t xml:space="preserve">La pregunta, los objetivos y las hipótesis salen de la Introducción corregida del 7/10/2026, con los comentarios de Pablo del 15/9 incorporados.</w:t>
       </w:r>
     </w:p>
     <w:p>
@@ -75,10 +75,7 @@
         <w:t xml:space="preserve">H1a</w:t>
       </w:r>
       <w:r>
-        <w:t xml:space="preserve"> </w:t>
-      </w:r>
-      <w:r>
-        <w:t xml:space="preserve">(texto de Santiago): los determinantes condicionan la sostenibilidad y el superávit, por sí solo, no basta para estabilizar la deuda.</w:t>
+        <w:t xml:space="preserve">: los determinantes condicionan la sostenibilidad y el superávit, por sí solo, no basta para estabilizar la deuda.</w:t>
       </w:r>
     </w:p>
     <w:p>
@@ -138,13 +135,13 @@
           <w:b/>
           <w:bCs/>
         </w:rPr>
-        <w:t xml:space="preserve">Umbrales:</w:t>
-      </w:r>
-      <w:r>
-        <w:t xml:space="preserve"> </w:t>
-      </w:r>
-      <w:r>
-        <w:t xml:space="preserve">son los del análisis de sostenibilidad más reciente del FMI (2026, Artículo IV y segunda revisión): 1% a mediano plazo y menos de 3% en su abanico de diez años. El umbral de 100% del PIB que había antes no tenía fuente y se sacó.</w:t>
+        <w:t xml:space="preserve">Cifras de comparación:</w:t>
+      </w:r>
+      <w:r>
+        <w:t xml:space="preserve"> </w:t>
+      </w:r>
+      <w:r>
+        <w:t xml:space="preserve">son las del análisis de sostenibilidad más reciente del FMI (2026, Artículo IV y segunda revisión): 1% a mediano plazo y menos de 3% en su abanico de diez años. El 1% es la estimación puntual del FMI para Argentina, no un umbral de riesgo bajo que defina el FMI. El umbral de 100% del PIB que había antes no tenía fuente y se sacó.</w:t>
       </w:r>
     </w:p>
     <w:bookmarkEnd w:id="9"/>
@@ -162,7 +159,23 @@
         <w:pStyle w:val="FirstParagraph"/>
       </w:pPr>
       <w:r>
-        <w:t xml:space="preserve">Todas las series salen de fuentes primarias con scripts reproducibles, sin intervención manual.</w:t>
+        <w:t xml:space="preserve">Las series se construyen con scripts reproducibles. Hay dos excepciones a las fuentes primarias: el EMBI+ es un índice de J.P. Morgan que no se publica en forma libre y se toma de compilaciones secundarias, y su tramo 1996-1998 se empalma con</w:t>
+      </w:r>
+      <w:r>
+        <w:t xml:space="preserve"> </w:t>
+      </w:r>
+      <w:r>
+        <w:rPr>
+          <w:i/>
+          <w:iCs/>
+        </w:rPr>
+        <w:t xml:space="preserve">spreads</w:t>
+      </w:r>
+      <w:r>
+        <w:t xml:space="preserve"> </w:t>
+      </w:r>
+      <w:r>
+        <w:t xml:space="preserve">de bonos Brady cargados a mano.</w:t>
       </w:r>
     </w:p>
     <w:tbl>
@@ -867,7 +880,7 @@
         <w:t xml:space="preserve"> </w:t>
       </w:r>
       <w:r>
-        <w:t xml:space="preserve">(lo pedía la metodología de Santiago): ADF, KPSS, Zivot-Andrews, Bai-Perron y Johansen, en el Apéndice A.1.</w:t>
+        <w:t xml:space="preserve">(lo pedía la propuesta metodológica): ADF, KPSS, Zivot-Andrews, Bai-Perron y Johansen, en el Apéndice A.1.</w:t>
       </w:r>
     </w:p>
     <w:p>
@@ -889,7 +902,7 @@
         <w:t xml:space="preserve"> </w:t>
       </w:r>
       <w:r>
-        <w:t xml:space="preserve">el mayor orden estable que no supera al del AIC: tres. Ivanov y Kilian (2005) recomiendan el AIC para respuestas al impulso con datos trimestrales. Con dos rezagos (el que elige el AIC entre los estables) los resultados se mantienen.</w:t>
+        <w:t xml:space="preserve">el mayor orden estable que no supera al del AIC: tres (el AIC llega a su mínimo en seis, pero desde cuatro el VAR es inestable). Ivanov y Kilian (2005) recomiendan el AIC para respuestas al impulso con datos trimestrales. Entre los órdenes estables, el AIC elige dos; con dos rezagos la no estabilización es de 27,4% en 2031 y 27,9% en 2035, y está informada en la Tabla 6.6.</w:t>
       </w:r>
     </w:p>
     <w:p>
@@ -1073,7 +1086,23 @@
         <w:t xml:space="preserve"> </w:t>
       </w:r>
       <w:r>
-        <w:t xml:space="preserve">reconstruyen los mismos residuos. Solo cambia la descomposición de la varianza.</w:t>
+        <w:t xml:space="preserve">reconstruyen los mismos residuos. Sirve para separar la varianza por bloque y definir el</w:t>
+      </w:r>
+      <w:r>
+        <w:t xml:space="preserve"> </w:t>
+      </w:r>
+      <w:r>
+        <w:rPr>
+          <w:i/>
+          <w:iCs/>
+        </w:rPr>
+        <w:t xml:space="preserve">shock</w:t>
+      </w:r>
+      <w:r>
+        <w:t xml:space="preserve"> </w:t>
+      </w:r>
+      <w:r>
+        <w:t xml:space="preserve">fiscal. Las diferencias de 0,5 a 0,8 puntos entre las filas de identificación de la Tabla 6.6 vienen de las extracciones de Monte Carlo.</w:t>
       </w:r>
     </w:p>
     <w:bookmarkEnd w:id="12"/>
@@ -1103,7 +1132,7 @@
         <w:t xml:space="preserve"> </w:t>
       </w:r>
       <w:r>
-        <w:t xml:space="preserve">de Santiago: la deuda rezagada entra en las cuatro ecuaciones y, en la simulación, vuelve como desvío acumulado respecto de la senda base. La deuda se asocia con más superávit (0,051) y más crecimiento; con el EMBI+ la estimación es de 22 puntos básicos por punto de deuda, pero el intervalo incluye el cero. Sin retroalimentación (arquitectura A), las probabilidades casi no cambian.</w:t>
+        <w:t xml:space="preserve">de la propuesta metodológica: la deuda rezagada entra en las cuatro ecuaciones y, en la simulación, vuelve como desvío acumulado respecto de la senda base. La deuda se asocia con más superávit (coeficiente de impacto de 0,051 sobre el resultado primario trimestral; multiplicador de largo plazo de alrededor de 0,19 por MCO, sin intervalo) y más crecimiento; con el EMBI+ la estimación es de 22 puntos básicos por punto de deuda, pero el intervalo incluye el cero. Sin retroalimentación (arquitectura A), las probabilidades casi no cambian.</w:t>
       </w:r>
     </w:p>
     <w:bookmarkEnd w:id="13"/>
@@ -1131,7 +1160,7 @@
         <w:t xml:space="preserve"> </w:t>
       </w:r>
       <w:r>
-        <w:t xml:space="preserve">salvaje de diseño recursivo (Gonçalves y Kilian, 2004). En cada réplica se regenera también la deuda, con un VAR auxiliar que la incluye. Los coeficientes de rezago se corrigen por el sesgo de muestra chica (Kilian, 1998). Semilla fija.</w:t>
+        <w:t xml:space="preserve">salvaje de diseño recursivo (Gonçalves y Kilian, 2004). En cada réplica se regenera también la deuda, con un VAR auxiliar que la incluye. Los coeficientes de rezago se corrigen por el sesgo de muestra pequeña (Kilian, 1998). El autovalor máximo es 0,964 por MCO y 0,9998 en la estimación central corregida (corrección multiplicada por δ = 0,9). Las réplicas usan un δ menor, de modo que los intervalos percentiles no quedan centrados y la estimación central queda cerca del límite superior. Semilla fija.</w:t>
       </w:r>
     </w:p>
     <w:bookmarkEnd w:id="14"/>
@@ -1284,6 +1313,28 @@
       </w:r>
       <w:r>
         <w:t xml:space="preserve">200 réplicas con 1.000 trayectorias.</w:t>
+      </w:r>
+    </w:p>
+    <w:p>
+      <w:pPr>
+        <w:pStyle w:val="Compact"/>
+        <w:numPr>
+          <w:ilvl w:val="0"/>
+          <w:numId w:val="1004"/>
+        </w:numPr>
+      </w:pPr>
+      <w:r>
+        <w:rPr>
+          <w:b/>
+          <w:bCs/>
+        </w:rPr>
+        <w:t xml:space="preserve">Escenarios de la FED:</w:t>
+      </w:r>
+      <w:r>
+        <w:t xml:space="preserve"> </w:t>
+      </w:r>
+      <w:r>
+        <w:t xml:space="preserve">la tasa entra como variación trimestral, así que el desvío de nivel es la suma acumulada y persiste. Un desvío estándar es un nivel 0,50 puntos más alto de 2026 a 2035. La senda 2022-2025 sube el nivel 5,25 puntos, lo baja 1,43 en 2026-2029 y lo deja 3,82 puntos por encima del base hasta 2035.</w:t>
       </w:r>
     </w:p>
     <w:bookmarkEnd w:id="15"/>
@@ -1393,7 +1444,7 @@
                 <w:rFonts w:ascii="Calibri" w:hAnsi="Calibri"/>
                 <w:sz w:val="20"/>
               </w:rPr>
-              <w:t xml:space="preserve">Superávit necesario en 2031 para llevar la probabilidad al 1% del FMI; descomposición de la varianza como complemento</w:t>
+              <w:t xml:space="preserve">Superávit necesario en 2031, desplazando el resultado primario de todos los años, para llevar la probabilidad de 2031 al 1% que estima el FMI; descomposición de la varianza como complemento (era el criterio original)</w:t>
             </w:r>
           </w:p>
         </w:tc>
@@ -1531,13 +1582,29 @@
           <w:b/>
           <w:bCs/>
         </w:rPr>
-        <w:t xml:space="preserve">H1b, respaldada y robusta.</w:t>
-      </w:r>
-      <w:r>
-        <w:t xml:space="preserve"> </w:t>
-      </w:r>
-      <w:r>
-        <w:t xml:space="preserve">No estabilización de 25,2% en 2031 [19,0; 27,7] y 22,3% en 2035 [15,6; 24,9]. Se cumple en las 18 especificaciones y con el método del FMI (23,7%).</w:t>
+        <w:t xml:space="preserve">H1b, respaldada.</w:t>
+      </w:r>
+      <w:r>
+        <w:t xml:space="preserve"> </w:t>
+      </w:r>
+      <w:r>
+        <w:t xml:space="preserve">No estabilización de 25,2% en 2031 [19,0; 27,7] y 22,3% en 2035 [15,6; 24,9]. Se cumple en las 17 especificaciones alternativas y con</w:t>
+      </w:r>
+      <w:r>
+        <w:t xml:space="preserve"> </w:t>
+      </w:r>
+      <w:r>
+        <w:rPr>
+          <w:i/>
+          <w:iCs/>
+        </w:rPr>
+        <w:t xml:space="preserve">shocks</w:t>
+      </w:r>
+      <w:r>
+        <w:t xml:space="preserve"> </w:t>
+      </w:r>
+      <w:r>
+        <w:t xml:space="preserve">a la manera del FMI (23,7%), pero ese procedimiento no reproduce el 1% del FMI, así que la comparabilidad no está establecida.</w:t>
       </w:r>
     </w:p>
     <w:p>
@@ -1559,7 +1626,7 @@
         <w:t xml:space="preserve"> </w:t>
       </w:r>
       <w:r>
-        <w:t xml:space="preserve">Hace falta un superávit de 7,0% del PIB, el doble del máximo histórico. La descomposición de la varianza (cambiario y de riesgo 59%, fiscal 32%) no es significativa.</w:t>
+        <w:t xml:space="preserve">Hace falta subir el resultado primario de todos los años unos 4,75 puntos: 6,15% del PIB en 2026 y 7,05% en 2031, casi el doble del máximo histórico (3,6%). Con el criterio original, la descomposición de la varianza (cambiario y de riesgo 59%, fiscal 32%), no se cumple.</w:t>
       </w:r>
     </w:p>
     <w:p>
@@ -1575,13 +1642,13 @@
           <w:b/>
           <w:bCs/>
         </w:rPr>
-        <w:t xml:space="preserve">H2, respaldada de manera débil.</w:t>
-      </w:r>
-      <w:r>
-        <w:t xml:space="preserve"> </w:t>
-      </w:r>
-      <w:r>
-        <w:t xml:space="preserve">La senda de 2022-2025 suma 13 puntos de probabilidad en 2035 [1,0; 24,8]. No se sostiene con Bonferroni y el efecto sobre la deuda no es significativo. El 60% del efecto es el costo directo de la deuda en dólares.</w:t>
+        <w:t xml:space="preserve">H2, respaldada solo en parte.</w:t>
+      </w:r>
+      <w:r>
+        <w:t xml:space="preserve"> </w:t>
+      </w:r>
+      <w:r>
+        <w:t xml:space="preserve">La senda de 2022-2025 suma 13 puntos de probabilidad en 2035 [1,0; 24,8] y el nivel 0,50 puntos más alto suma 1,5 [0,1; 3,1]. El efecto sobre la deuda esperada no excluye el cero, no se sostiene con Bonferroni y solo 5 de 84 bandas de respuesta excluyen el cero (el azar daría unas ocho). El 60% del efecto es el costo directo de la deuda en dólares, que entra en la identidad por construcción.</w:t>
       </w:r>
     </w:p>
     <w:bookmarkEnd w:id="17"/>
@@ -1926,7 +1993,7 @@
                 <w:rFonts w:ascii="Calibri" w:hAnsi="Calibri"/>
                 <w:sz w:val="20"/>
               </w:rPr>
-              <w:t xml:space="preserve">Ahora repite la senda real 2022-2025 (sube y después baja)</w:t>
+              <w:t xml:space="preserve">Ahora repite las variaciones de 2022-2025: el nivel sube 5,25 puntos, baja 1,43 y queda 3,82 puntos por encima del base hasta 2035</w:t>
             </w:r>
           </w:p>
         </w:tc>
@@ -1959,20 +2026,27 @@
               </w:rPr>
               <w:t xml:space="preserve">“alcanza”</w:t>
             </w:r>
-          </w:p>
-        </w:tc>
-        <w:tc>
-          <w:tcPr/>
-          <w:p>
-            <w:pPr>
-              <w:pStyle w:val="Compact"/>
-            </w:pPr>
-            <w:r>
-              <w:rPr>
-                <w:rFonts w:ascii="Calibri" w:hAnsi="Calibri"/>
-                <w:sz w:val="20"/>
-              </w:rPr>
-              <w:t xml:space="preserve">Contraste de suficiencia como criterio principal</w:t>
+            <w:r>
+              <w:rPr>
+                <w:rFonts w:ascii="Calibri" w:hAnsi="Calibri"/>
+                <w:sz w:val="20"/>
+              </w:rPr>
+              <w:t xml:space="preserve">, y además no se cumplía</w:t>
+            </w:r>
+          </w:p>
+        </w:tc>
+        <w:tc>
+          <w:tcPr/>
+          <w:p>
+            <w:pPr>
+              <w:pStyle w:val="Compact"/>
+            </w:pPr>
+            <w:r>
+              <w:rPr>
+                <w:rFonts w:ascii="Calibri" w:hAnsi="Calibri"/>
+                <w:sz w:val="20"/>
+              </w:rPr>
+              <w:t xml:space="preserve">Contraste de suficiencia como criterio principal, adoptado después de la primera estimación y declarado en 4.7</w:t>
             </w:r>
           </w:p>
         </w:tc>
@@ -2043,13 +2117,13 @@
       </w:tr>
     </w:tbl>
     <w:bookmarkEnd w:id="19"/>
-    <w:bookmarkStart w:id="20" w:name="X0554f3801119bbcb2f590528e039617e301b2b8"/>
+    <w:bookmarkStart w:id="20" w:name="Xf479d4317ab15e08546702daa827e786e9f7414"/>
     <w:p>
       <w:pPr>
         <w:pStyle w:val="Heading2"/>
       </w:pPr>
       <w:r>
-        <w:t xml:space="preserve">Parte 3. Lo que todavía nos pueden discutir</w:t>
+        <w:t xml:space="preserve">Parte 3. Críticas que puede hacer el jurado y respuesta honesta</w:t>
       </w:r>
     </w:p>
     <w:p>
@@ -2065,13 +2139,29 @@
           <w:b/>
           <w:bCs/>
         </w:rPr>
-        <w:t xml:space="preserve">“H1a cambió de criterio.”</w:t>
-      </w:r>
-      <w:r>
-        <w:t xml:space="preserve"> </w:t>
-      </w:r>
-      <w:r>
-        <w:t xml:space="preserve">Respuesta: el criterio de varianza no mide si el superávit alcanza; el de suficiencia mide exactamente lo que dice la hipótesis. La varianza se sigue informando y la tesis dice con claridad que no es robusta.</w:t>
+        <w:t xml:space="preserve">“Cambiaron los criterios después de ver los resultados.”</w:t>
+      </w:r>
+      <w:r>
+        <w:t xml:space="preserve"> </w:t>
+      </w:r>
+      <w:r>
+        <w:t xml:space="preserve">Es cierto. En octubre de 2026, después de la primera estimación, el criterio de H1a pasó de la descomposición de la varianza, que no se cumple ([-4,8; 91,2] incluye el cero), al de suficiencia; los tamaños de los</w:t>
+      </w:r>
+      <w:r>
+        <w:t xml:space="preserve"> </w:t>
+      </w:r>
+      <w:r>
+        <w:rPr>
+          <w:i/>
+          <w:iCs/>
+        </w:rPr>
+        <w:t xml:space="preserve">shocks</w:t>
+      </w:r>
+      <w:r>
+        <w:t xml:space="preserve"> </w:t>
+      </w:r>
+      <w:r>
+        <w:t xml:space="preserve">de la FED también se fijaron entonces. La tesis lo declara en la sección 4.7 e informa los dos criterios.</w:t>
       </w:r>
     </w:p>
     <w:p>
@@ -2087,13 +2177,13 @@
           <w:b/>
           <w:bCs/>
         </w:rPr>
-        <w:t xml:space="preserve">“¿Por qué su probabilidad es 25 veces la del FMI?”</w:t>
-      </w:r>
-      <w:r>
-        <w:t xml:space="preserve"> </w:t>
-      </w:r>
-      <w:r>
-        <w:t xml:space="preserve">Respuesta: no lo explican el perímetro, el punto de partida ni la identificación; con el método del propio FMI sobre nuestros datos da casi lo mismo (23,7%). La diferencia viene de la historia argentina con la que se generan los</w:t>
+        <w:t xml:space="preserve">“H1b compara cosas que no son comparables.”</w:t>
+      </w:r>
+      <w:r>
+        <w:t xml:space="preserve"> </w:t>
+      </w:r>
+      <w:r>
+        <w:t xml:space="preserve">La comparabilidad con el FMI no está establecida. Con</w:t>
       </w:r>
       <w:r>
         <w:t xml:space="preserve"> </w:t>
@@ -2106,7 +2196,10 @@
         <w:t xml:space="preserve">shocks</w:t>
       </w:r>
       <w:r>
-        <w:t xml:space="preserve">, que el FMI no publica. La tesis no afirma más que eso.</w:t>
+        <w:t xml:space="preserve"> </w:t>
+      </w:r>
+      <w:r>
+        <w:t xml:space="preserve">a la manera del FMI nuestros datos dan 23,7% en 2031 y un abanico de 114 puntos, contra 1% y 71,5 del FMI, así que no reproducimos su número ni con su procedimiento. Los perímetros también difieren: 61,0% del PIB de deuda consolidada neta contra 80,3% de deuda federal bruta. No sabemos de dónde viene la diferencia.</w:t>
       </w:r>
     </w:p>
     <w:p>
@@ -2122,13 +2215,29 @@
           <w:b/>
           <w:bCs/>
         </w:rPr>
-        <w:t xml:space="preserve">“El escenario del FMI es para la deuda federal bruta y ustedes lo aplican a la consolidada.”</w:t>
-      </w:r>
-      <w:r>
-        <w:t xml:space="preserve"> </w:t>
-      </w:r>
-      <w:r>
-        <w:t xml:space="preserve">Es cierto; con el ajuste stock-flujo en cero, con la deuda solo del Tesoro o partiendo de la deuda del FMI, las conclusiones no cambian.</w:t>
+        <w:t xml:space="preserve">“La estimación central es casi una raíz unitaria.”</w:t>
+      </w:r>
+      <w:r>
+        <w:t xml:space="preserve"> </w:t>
+      </w:r>
+      <w:r>
+        <w:t xml:space="preserve">Es cierto: el autovalor máximo pasa de 0,964 por MCO a 0,9998 con la corrección de sesgo. Eso vuelve muy persistentes los</w:t>
+      </w:r>
+      <w:r>
+        <w:t xml:space="preserve"> </w:t>
+      </w:r>
+      <w:r>
+        <w:rPr>
+          <w:i/>
+          <w:iCs/>
+        </w:rPr>
+        <w:t xml:space="preserve">shocks</w:t>
+      </w:r>
+      <w:r>
+        <w:t xml:space="preserve"> </w:t>
+      </w:r>
+      <w:r>
+        <w:t xml:space="preserve">y eleva las probabilidades. Las réplicas usan una corrección menor, así que los intervalos no quedan centrados y la estimación central está cerca del límite superior. Está declarado en 4.5 y 6.1.</w:t>
       </w:r>
     </w:p>
     <w:p>
@@ -2144,13 +2253,13 @@
           <w:b/>
           <w:bCs/>
         </w:rPr>
-        <w:t xml:space="preserve">“La autocorrelación residual y el remuestreo independiente.”</w:t>
-      </w:r>
-      <w:r>
-        <w:t xml:space="preserve"> </w:t>
-      </w:r>
-      <w:r>
-        <w:t xml:space="preserve">Es cierto (p = 0,036); está declarado como limitación.</w:t>
+        <w:t xml:space="preserve">“La regla de rezagos es ad hoc.”</w:t>
+      </w:r>
+      <w:r>
+        <w:t xml:space="preserve"> </w:t>
+      </w:r>
+      <w:r>
+        <w:t xml:space="preserve">La regla elige el mayor orden estable que no supera al del AIC (tres). Entre los órdenes estables, el AIC elige dos. Con dos rezagos las probabilidades son algo mayores (27,4% y 27,9%) y están informadas.</w:t>
       </w:r>
     </w:p>
     <w:p>
@@ -2166,13 +2275,29 @@
           <w:b/>
           <w:bCs/>
         </w:rPr>
-        <w:t xml:space="preserve">“El EMBI+ del período de cesación de pagos.”</w:t>
-      </w:r>
-      <w:r>
-        <w:t xml:space="preserve"> </w:t>
-      </w:r>
-      <w:r>
-        <w:t xml:space="preserve">Sin esos trimestres en el remuestreo, la probabilidad baja a 23,7%; la conclusión no cambia.</w:t>
+        <w:t xml:space="preserve">“Hay autocorrelación residual y remuestrean como si no la hubiera.”</w:t>
+      </w:r>
+      <w:r>
+        <w:t xml:space="preserve"> </w:t>
+      </w:r>
+      <w:r>
+        <w:t xml:space="preserve">Es cierto (Portmanteau, p = 0,036). Los</w:t>
+      </w:r>
+      <w:r>
+        <w:t xml:space="preserve"> </w:t>
+      </w:r>
+      <w:r>
+        <w:rPr>
+          <w:i/>
+          <w:iCs/>
+        </w:rPr>
+        <w:t xml:space="preserve">shocks</w:t>
+      </w:r>
+      <w:r>
+        <w:t xml:space="preserve"> </w:t>
+      </w:r>
+      <w:r>
+        <w:t xml:space="preserve">se remuestrean como independientes entre trimestres; está declarado como limitación y no se corrigió.</w:t>
       </w:r>
     </w:p>
     <w:p>
@@ -2188,13 +2313,13 @@
           <w:b/>
           <w:bCs/>
         </w:rPr>
-        <w:t xml:space="preserve">“La elasticidad de 0,25 es de la OCDE.”</w:t>
-      </w:r>
-      <w:r>
-        <w:t xml:space="preserve"> </w:t>
-      </w:r>
-      <w:r>
-        <w:t xml:space="preserve">Solo afecta la descomposición de la varianza, no la probabilidad ni la suficiencia.</w:t>
+        <w:t xml:space="preserve">“El resultado primario incluye las utilidades del BCRA.”</w:t>
+      </w:r>
+      <w:r>
+        <w:t xml:space="preserve"> </w:t>
+      </w:r>
+      <w:r>
+        <w:t xml:space="preserve">Es cierto; la fuente no permite separarlas. Sin rentas de la propiedad, la probabilidad es de 23,4% en 2031 y 19,6% en 2035, y el máximo histórico del superávit baja a 3,29%.</w:t>
       </w:r>
     </w:p>
     <w:p>
@@ -2210,13 +2335,13 @@
           <w:b/>
           <w:bCs/>
         </w:rPr>
-        <w:t xml:space="preserve">“H2 es débil.”</w:t>
-      </w:r>
-      <w:r>
-        <w:t xml:space="preserve"> </w:t>
-      </w:r>
-      <w:r>
-        <w:t xml:space="preserve">Es cierto y así se dice: dirección correcta, poca precisión, y el efecto pasa sobre todo por el costo de la deuda en dólares.</w:t>
+        <w:t xml:space="preserve">“El escenario del FMI es para la deuda federal bruta y ustedes lo aplican a la consolidada neta.”</w:t>
+      </w:r>
+      <w:r>
+        <w:t xml:space="preserve"> </w:t>
+      </w:r>
+      <w:r>
+        <w:t xml:space="preserve">Es cierto, y no tiene una solución completa. Con el ajuste stock-flujo en cero la probabilidad es de 22,0% en 2031, y partiendo de la deuda del FMI (52,1%), de 22,8%.</w:t>
       </w:r>
     </w:p>
     <w:p>
@@ -2232,13 +2357,133 @@
           <w:b/>
           <w:bCs/>
         </w:rPr>
-        <w:t xml:space="preserve">“El autovalor corregido es 0,9998, casi una raíz unitaria.”</w:t>
-      </w:r>
-      <w:r>
-        <w:t xml:space="preserve"> </w:t>
-      </w:r>
-      <w:r>
-        <w:t xml:space="preserve">La corrección de Kilian aumenta la persistencia y se la reduce para mantener la estabilidad; con dos rezagos, el modelo es menos persistente y los resultados se mantienen.</w:t>
+        <w:t xml:space="preserve">“No restaron el FGS aunque hay datos de tenencias desde 2004.”</w:t>
+      </w:r>
+      <w:r>
+        <w:t xml:space="preserve"> </w:t>
+      </w:r>
+      <w:r>
+        <w:t xml:space="preserve">Es cierto. Hay datos anuales de la deuda en manos de organismos del sector público desde 2004, que no se usaron porque no cubren 1996-2003 ni separan al FGS. Es una decisión discutible; la única sensibilidad hecha es partir de la deuda del FMI, que sí lo descuenta.</w:t>
+      </w:r>
+    </w:p>
+    <w:p>
+      <w:pPr>
+        <w:pStyle w:val="Compact"/>
+        <w:numPr>
+          <w:ilvl w:val="0"/>
+          <w:numId w:val="1006"/>
+        </w:numPr>
+      </w:pPr>
+      <w:r>
+        <w:rPr>
+          <w:b/>
+          <w:bCs/>
+        </w:rPr>
+        <w:t xml:space="preserve">“El EMBI+ de 1996-1998 no es el EMBI+.”</w:t>
+      </w:r>
+      <w:r>
+        <w:t xml:space="preserve"> </w:t>
+      </w:r>
+      <w:r>
+        <w:t xml:space="preserve">Es cierto: son</w:t>
+      </w:r>
+      <w:r>
+        <w:t xml:space="preserve"> </w:t>
+      </w:r>
+      <w:r>
+        <w:rPr>
+          <w:i/>
+          <w:iCs/>
+        </w:rPr>
+        <w:t xml:space="preserve">spreads</w:t>
+      </w:r>
+      <w:r>
+        <w:t xml:space="preserve"> </w:t>
+      </w:r>
+      <w:r>
+        <w:t xml:space="preserve">de bonos Brady cargados a mano y empalmados en 1999 con una corrección proporcional. Son 12 de los 120 trimestres. No hay una robustez específica que los excluya.</w:t>
+      </w:r>
+    </w:p>
+    <w:p>
+      <w:pPr>
+        <w:pStyle w:val="Compact"/>
+        <w:numPr>
+          <w:ilvl w:val="0"/>
+          <w:numId w:val="1006"/>
+        </w:numPr>
+      </w:pPr>
+      <w:r>
+        <w:rPr>
+          <w:b/>
+          <w:bCs/>
+        </w:rPr>
+        <w:t xml:space="preserve">“La identificación no aporta nada a la probabilidad.”</w:t>
+      </w:r>
+      <w:r>
+        <w:t xml:space="preserve"> </w:t>
+      </w:r>
+      <w:r>
+        <w:t xml:space="preserve">Es cierto: la probabilidad de no estabilización no depende de la identificación. La identificación sirve para separar la varianza por bloque y definir el</w:t>
+      </w:r>
+      <w:r>
+        <w:t xml:space="preserve"> </w:t>
+      </w:r>
+      <w:r>
+        <w:rPr>
+          <w:i/>
+          <w:iCs/>
+        </w:rPr>
+        <w:t xml:space="preserve">shock</w:t>
+      </w:r>
+      <w:r>
+        <w:t xml:space="preserve"> </w:t>
+      </w:r>
+      <w:r>
+        <w:t xml:space="preserve">fiscal, y esa descomposición no es robusta.</w:t>
+      </w:r>
+    </w:p>
+    <w:p>
+      <w:pPr>
+        <w:pStyle w:val="Compact"/>
+        <w:numPr>
+          <w:ilvl w:val="0"/>
+          <w:numId w:val="1006"/>
+        </w:numPr>
+      </w:pPr>
+      <w:r>
+        <w:rPr>
+          <w:b/>
+          <w:bCs/>
+        </w:rPr>
+        <w:t xml:space="preserve">“H2 es débil.”</w:t>
+      </w:r>
+      <w:r>
+        <w:t xml:space="preserve"> </w:t>
+      </w:r>
+      <w:r>
+        <w:t xml:space="preserve">Es cierto y así se dice: el efecto sobre la probabilidad cumple el criterio al 90%, el efecto sobre la deuda esperada no, nada resiste Bonferroni, y la mayor parte del efecto es el costo directo de la deuda en dólares, que el modelo incorpora por construcción.</w:t>
+      </w:r>
+    </w:p>
+    <w:p>
+      <w:pPr>
+        <w:pStyle w:val="Compact"/>
+        <w:numPr>
+          <w:ilvl w:val="0"/>
+          <w:numId w:val="1006"/>
+        </w:numPr>
+      </w:pPr>
+      <w:r>
+        <w:rPr>
+          <w:b/>
+          <w:bCs/>
+        </w:rPr>
+        <w:t xml:space="preserve">“La elasticidad de 0,25 es de la OCDE.”</w:t>
+      </w:r>
+      <w:r>
+        <w:t xml:space="preserve"> </w:t>
+      </w:r>
+      <w:r>
+        <w:t xml:space="preserve">Solo afecta la descomposición de la varianza, no la probabilidad ni la suficiencia.</w:t>
       </w:r>
     </w:p>
     <w:p>
@@ -2478,7 +2723,7 @@
                 <w:rFonts w:ascii="Calibri" w:hAnsi="Calibri"/>
                 <w:sz w:val="20"/>
               </w:rPr>
-              <w:t xml:space="preserve">Reacción fiscal de Bohn</w:t>
+              <w:t xml:space="preserve">Reacción fiscal: coeficiente de impacto (largo plazo por MCO, alrededor de 0,19)</w:t>
             </w:r>
           </w:p>
         </w:tc>
@@ -2559,22 +2804,22 @@
                 <w:rFonts w:ascii="Calibri" w:hAnsi="Calibri"/>
                 <w:sz w:val="20"/>
               </w:rPr>
-              <w:t xml:space="preserve">7,0% del PIB</w:t>
-            </w:r>
-          </w:p>
-        </w:tc>
-        <w:tc>
-          <w:tcPr/>
-          <w:p>
-            <w:pPr>
-              <w:pStyle w:val="Compact"/>
-            </w:pPr>
-            <w:r>
-              <w:rPr>
-                <w:rFonts w:ascii="Calibri" w:hAnsi="Calibri"/>
-                <w:sz w:val="20"/>
-              </w:rPr>
-              <w:t xml:space="preserve">Superávit necesario para llegar al 1% del FMI (máximo histórico: 3,6%)</w:t>
+              <w:t xml:space="preserve">7,05% del PIB</w:t>
+            </w:r>
+          </w:p>
+        </w:tc>
+        <w:tc>
+          <w:tcPr/>
+          <w:p>
+            <w:pPr>
+              <w:pStyle w:val="Compact"/>
+            </w:pPr>
+            <w:r>
+              <w:rPr>
+                <w:rFonts w:ascii="Calibri" w:hAnsi="Calibri"/>
+                <w:sz w:val="20"/>
+              </w:rPr>
+              <w:t xml:space="preserve">Superávit necesario en 2031 para llegar al 1% del FMI, con 6,15% en 2026 (máximo histórico: 3,6%)</w:t>
             </w:r>
           </w:p>
         </w:tc>
@@ -2638,7 +2883,71 @@
                 <w:rFonts w:ascii="Calibri" w:hAnsi="Calibri"/>
                 <w:sz w:val="20"/>
               </w:rPr>
-              <w:t xml:space="preserve">Efecto de la senda de la FED 2022-2025 sobre la probabilidad en 2035</w:t>
+              <w:t xml:space="preserve">Efecto de la senda de la FED 2022-2025 (nivel 3,82 pp más alto desde 2029) sobre la probabilidad en 2035</w:t>
+            </w:r>
+          </w:p>
+        </w:tc>
+      </w:tr>
+      <w:tr>
+        <w:tc>
+          <w:tcPr/>
+          <w:p>
+            <w:pPr>
+              <w:pStyle w:val="Compact"/>
+            </w:pPr>
+            <w:r>
+              <w:rPr>
+                <w:rFonts w:ascii="Calibri" w:hAnsi="Calibri"/>
+                <w:sz w:val="20"/>
+              </w:rPr>
+              <w:t xml:space="preserve">0,964 / 0,9998</w:t>
+            </w:r>
+          </w:p>
+        </w:tc>
+        <w:tc>
+          <w:tcPr/>
+          <w:p>
+            <w:pPr>
+              <w:pStyle w:val="Compact"/>
+            </w:pPr>
+            <w:r>
+              <w:rPr>
+                <w:rFonts w:ascii="Calibri" w:hAnsi="Calibri"/>
+                <w:sz w:val="20"/>
+              </w:rPr>
+              <w:t xml:space="preserve">Autovalor máximo: MCO / estimación central corregida</w:t>
+            </w:r>
+          </w:p>
+        </w:tc>
+      </w:tr>
+      <w:tr>
+        <w:tc>
+          <w:tcPr/>
+          <w:p>
+            <w:pPr>
+              <w:pStyle w:val="Compact"/>
+            </w:pPr>
+            <w:r>
+              <w:rPr>
+                <w:rFonts w:ascii="Calibri" w:hAnsi="Calibri"/>
+                <w:sz w:val="20"/>
+              </w:rPr>
+              <w:t xml:space="preserve">17</w:t>
+            </w:r>
+          </w:p>
+        </w:tc>
+        <w:tc>
+          <w:tcPr/>
+          <w:p>
+            <w:pPr>
+              <w:pStyle w:val="Compact"/>
+            </w:pPr>
+            <w:r>
+              <w:rPr>
+                <w:rFonts w:ascii="Calibri" w:hAnsi="Calibri"/>
+                <w:sz w:val="20"/>
+              </w:rPr>
+              <w:t xml:space="preserve">Especificaciones alternativas de la Tabla 6.6 (más dos a la manera del FMI y la referencia del FMI)</w:t>
             </w:r>
           </w:p>
         </w:tc>

</xml_diff>

<commit_message>
fix(tesis): ventana unica 1996-2025 con empalmes validados, resultado primario sin rentas y control de consistencia
- EMBI 1996T1-1998T3 y TCRM 1996 completados con empalmes documentados y
  validados (tasa interbancaria en dolares del BCRA; tipo de cambio real
  efectivo del BIS); se eliminan los valores del EMBI escritos a mano
- Resultado primario sin rentas de la propiedad en toda la tesis: el FMI
  excluye las utilidades del BCRA (FMI, 2026, cuadro 1, nota 4)
- Nomenclatura unica (EMBI, TCRM, identificacion, perimetros) y
  verificar_consistencia.py como control automatico
- Figura A.1 y seccion A.2 con la validacion de los empalmes

Co-Authored-By: Claude Opus 5.5 <noreply@anthropic.com>
</commit_message>
<xml_diff>
--- a/tesis_oficial_borradores/para_el_grupo/Guia_de_defensa.docx
+++ b/tesis_oficial_borradores/para_el_grupo/Guia_de_defensa.docx
@@ -16,7 +16,7 @@
         <w:pStyle w:val="FirstParagraph"/>
       </w:pPr>
       <w:r>
-        <w:t xml:space="preserve">Documento interno del grupo. No forma parte de la tesis. Resume cada paso del trabajo empírico con su justificación, según la versión del modelo del 12/10/2026 (decisiones D1 a D14), las críticas que se resolvieron en esa versión y las que todavía puede hacer un jurado, con la respuesta. Todos los números salen de la hoja de números y del Apéndice.</w:t>
+        <w:t xml:space="preserve">Documento interno del grupo. No forma parte de la tesis. Resume cada paso del trabajo empírico con su justificación, según la versión del modelo reestimada con la ventana 1996-2025 (17/10/2026; decisiones D1 a D14), las críticas que se resolvieron y las que todavía puede hacer un jurado, con la respuesta. Todos los números salen de la hoja de números y del Apéndice.</w:t>
       </w:r>
     </w:p>
     <w:bookmarkStart w:id="17" w:name="parte-1.-qué-hicimos-paso-a-paso"/>
@@ -186,7 +186,7 @@
         <w:t xml:space="preserve"> </w:t>
       </w:r>
       <w:r>
-        <w:t xml:space="preserve">deuda bruta del gobierno federal, el perímetro del FMI. La simulación parte del</w:t>
+        <w:t xml:space="preserve">deuda federal bruta, el perímetro del FMI. La simulación parte del</w:t>
       </w:r>
       <w:r>
         <w:t xml:space="preserve"> </w:t>
@@ -224,7 +224,7 @@
         <w:t xml:space="preserve"> </w:t>
       </w:r>
       <w:r>
-        <w:t xml:space="preserve">deuda del sector público consolidado con el BCRA en la definición del FMI (cuadro 2, línea 5), 52,1% del PIB a fines de 2025, con 68,5% en moneda extranjera. La dinámica se estima con nuestra serie consolidada (Tesoro más BCRA, Letras a valor nominal).</w:t>
+        <w:t xml:space="preserve">deuda consolidada con el BCRA en la definición del FMI (cuadro 2, línea 5), 52,1% del PIB a fines de 2025, con 68,5% en moneda extranjera. La dinámica se estima con nuestra serie consolidada (Tesoro más BCRA, Letras a valor nominal).</w:t>
       </w:r>
     </w:p>
     <w:p>
@@ -240,13 +240,150 @@
           <w:b/>
           <w:bCs/>
         </w:rPr>
-        <w:t xml:space="preserve">Muestra (D2):</w:t>
-      </w:r>
-      <w:r>
-        <w:t xml:space="preserve"> </w:t>
-      </w:r>
-      <w:r>
-        <w:t xml:space="preserve">datos desde 1999T1; muestra efectiva común 2000T3-2025T4, 102 trimestres, para que todos los órdenes de rezago hasta seis se comparen sobre los mismos trimestres (Lütkepohl, 2005, sec. 4.3).</w:t>
+        <w:t xml:space="preserve">Ventana (D2):</w:t>
+      </w:r>
+      <w:r>
+        <w:t xml:space="preserve"> </w:t>
+      </w:r>
+      <w:r>
+        <w:t xml:space="preserve">1996-2025 para todo el estudio y 2026-2035 para la proyección, por decisión del grupo. Las ecuaciones se estiman con 1998T2-2025T4, 111 trimestres, porque los primeros trimestres de la ventana son condiciones iniciales de los rezagos: la variación de la tasa de la FED entra con dos rezagos y todos los órdenes hasta seis se comparan sobre los mismos trimestres (Lütkepohl, 2005, sec. 4.3). La ventana del estudio sigue siendo 1996-2025.</w:t>
+      </w:r>
+    </w:p>
+    <w:p>
+      <w:pPr>
+        <w:pStyle w:val="FirstParagraph"/>
+      </w:pPr>
+      <w:r>
+        <w:rPr>
+          <w:b/>
+          <w:bCs/>
+        </w:rPr>
+        <w:t xml:space="preserve">Empalmes y por qué son correctos.</w:t>
+      </w:r>
+      <w:r>
+        <w:t xml:space="preserve"> </w:t>
+      </w:r>
+      <w:r>
+        <w:t xml:space="preserve">El riesgo país, medido por el diferencial del índice EMBI de J.P. Morgan para Argentina (EMBI), tiene serie diaria pública desde el 11 de diciembre de 1998, y el índice del tipo de cambio real multilateral (TCRM) del BCRA empieza en enero de 1997. Para cubrir la ventana completa se hicieron dos empalmes, con código propio (</w:t>
+      </w:r>
+      <w:r>
+        <w:rPr>
+          <w:rStyle w:val="VerbatimChar"/>
+        </w:rPr>
+        <w:t xml:space="preserve">codigo/ingesta_datos/empalme_embi_tcrm_1996_1998.py</w:t>
+      </w:r>
+      <w:r>
+        <w:t xml:space="preserve">) y validación en el Apéndice A.2 y la Figura A.1.</w:t>
+      </w:r>
+    </w:p>
+    <w:p>
+      <w:pPr>
+        <w:pStyle w:val="Compact"/>
+        <w:numPr>
+          <w:ilvl w:val="0"/>
+          <w:numId w:val="1003"/>
+        </w:numPr>
+      </w:pPr>
+      <w:r>
+        <w:rPr>
+          <w:b/>
+          <w:bCs/>
+        </w:rPr>
+        <w:t xml:space="preserve">EMBI 1996T1-1998T3.</w:t>
+      </w:r>
+      <w:r>
+        <w:t xml:space="preserve"> </w:t>
+      </w:r>
+      <w:r>
+        <w:t xml:space="preserve">Se usa el diferencial entre la tasa de préstamos interfinancieros en dólares del BCRA (serie oficial, mensual desde octubre de 1994) y la tasa de fondos federales. Con la convertibilidad, lo que pagaba un banco en la Argentina por un dólar prestado, por encima de la tasa de Estados Unidos, medía el riesgo argentino. La relación se estima en la superposición 1998T4-2001T3, doce trimestres que terminan antes del corralito, que rompe ese mercado: EMBI = 550,3 + 1,171 × diferencial, R² = 0,89, correlación 0,944.</w:t>
+      </w:r>
+    </w:p>
+    <w:p>
+      <w:pPr>
+        <w:pStyle w:val="Compact"/>
+        <w:numPr>
+          <w:ilvl w:val="0"/>
+          <w:numId w:val="1003"/>
+        </w:numPr>
+      </w:pPr>
+      <w:r>
+        <w:rPr>
+          <w:b/>
+          <w:bCs/>
+        </w:rPr>
+        <w:t xml:space="preserve">Validación del EMBI.</w:t>
+      </w:r>
+      <w:r>
+        <w:t xml:space="preserve"> </w:t>
+      </w:r>
+      <w:r>
+        <w:t xml:space="preserve">Dejando un trimestre afuera por vez, el error típico es de 102 puntos básicos, contra un desvío del EMBI de 240. Estimando solo con 1998T4-2000T4 y pronosticando 2001, el empalme da 744, 801 y 1.033 contra 750, 973 y 1.469 observados: acierta el nivel y subestima el salto de la crisis. Si sesga, atenúa la volatilidad de 1996-1998, y con eso las probabilidades quedan del lado conservador.</w:t>
+      </w:r>
+    </w:p>
+    <w:p>
+      <w:pPr>
+        <w:pStyle w:val="Compact"/>
+        <w:numPr>
+          <w:ilvl w:val="0"/>
+          <w:numId w:val="1003"/>
+        </w:numPr>
+      </w:pPr>
+      <w:r>
+        <w:rPr>
+          <w:b/>
+          <w:bCs/>
+        </w:rPr>
+        <w:t xml:space="preserve">TCRM 1996.</w:t>
+      </w:r>
+      <w:r>
+        <w:t xml:space="preserve"> </w:t>
+      </w:r>
+      <w:r>
+        <w:t xml:space="preserve">Se encadena hacia atrás con las variaciones del tipo de cambio real efectivo amplio del BIS, invertido porque ese índice sube con la apreciación. Las variaciones trimestrales de los dos índices tienen una correlación de 0,92 en todo el período común y de 0,98 en 1997-2001. Con dos rezagos, los cuatro trimestres de 1996 solo intervienen como condiciones iniciales.</w:t>
+      </w:r>
+    </w:p>
+    <w:p>
+      <w:pPr>
+        <w:pStyle w:val="Compact"/>
+        <w:numPr>
+          <w:ilvl w:val="0"/>
+          <w:numId w:val="1003"/>
+        </w:numPr>
+      </w:pPr>
+      <w:r>
+        <w:rPr>
+          <w:b/>
+          <w:bCs/>
+        </w:rPr>
+        <w:t xml:space="preserve">Variante sin empalme.</w:t>
+      </w:r>
+      <w:r>
+        <w:t xml:space="preserve"> </w:t>
+      </w:r>
+      <w:r>
+        <w:t xml:space="preserve">Con datos desde 1999, solo con el EMBI observado, la probabilidad de no estabilización en 2031 es 32,4% [26,6; 37,0], contra 31,8% [25,2; 36,4] con la ventana completa. H1a (75,5 puntos [51,7; 86,3]) y H2 (senda de la FED, 9,6 puntos [2,5; 15,7]) no cambian (Apéndice A.9).</w:t>
+      </w:r>
+    </w:p>
+    <w:p>
+      <w:pPr>
+        <w:pStyle w:val="Compact"/>
+        <w:numPr>
+          <w:ilvl w:val="0"/>
+          <w:numId w:val="1003"/>
+        </w:numPr>
+      </w:pPr>
+      <w:r>
+        <w:rPr>
+          <w:b/>
+          <w:bCs/>
+        </w:rPr>
+        <w:t xml:space="preserve">Lo que había antes.</w:t>
+      </w:r>
+      <w:r>
+        <w:t xml:space="preserve"> </w:t>
+      </w:r>
+      <w:r>
+        <w:t xml:space="preserve">La base anterior tenía valores del EMBI de 1993-1998 escritos a mano, sin fuente. Se eliminaron y no se usan en ninguna parte. Si el jurado pregunta por versiones viejas, la respuesta es esa.</w:t>
       </w:r>
     </w:p>
     <w:tbl>
@@ -439,7 +576,7 @@
                 <w:rFonts w:ascii="Calibri" w:hAnsi="Calibri"/>
                 <w:sz w:val="20"/>
               </w:rPr>
-              <w:t xml:space="preserve">Deuda consolidada</w:t>
+              <w:t xml:space="preserve">Deuda consolidada con el BCRA</w:t>
             </w:r>
           </w:p>
         </w:tc>
@@ -531,22 +668,22 @@
                 <w:rFonts w:ascii="Calibri" w:hAnsi="Calibri"/>
                 <w:sz w:val="20"/>
               </w:rPr>
-              <w:t xml:space="preserve">Flujo trimestral anualizado; con rentas de la propiedad para la deuda federal, sin rentas para la consolidada</w:t>
-            </w:r>
-          </w:p>
-        </w:tc>
-        <w:tc>
-          <w:tcPr/>
-          <w:p>
-            <w:pPr>
-              <w:pStyle w:val="Compact"/>
-            </w:pPr>
-            <w:r>
-              <w:rPr>
-                <w:rFonts w:ascii="Calibri" w:hAnsi="Calibri"/>
-                <w:sz w:val="20"/>
-              </w:rPr>
-              <w:t xml:space="preserve">Coherencia con cada perímetro</w:t>
+              <w:t xml:space="preserve">Flujo trimestral anualizado del Sector Público Nacional, sin rentas de la propiedad, una sola definición para los dos perímetros; con rentas, como robustez</w:t>
+            </w:r>
+          </w:p>
+        </w:tc>
+        <w:tc>
+          <w:tcPr/>
+          <w:p>
+            <w:pPr>
+              <w:pStyle w:val="Compact"/>
+            </w:pPr>
+            <w:r>
+              <w:rPr>
+                <w:rFonts w:ascii="Calibri" w:hAnsi="Calibri"/>
+                <w:sz w:val="20"/>
+              </w:rPr>
+              <w:t xml:space="preserve">El FMI excluye las utilidades del BCRA de su resultado primario (FMI, 2026, cuadro 1, nota 4) y el MECON no las separa del resto de las rentas</w:t>
             </w:r>
           </w:p>
         </w:tc>
@@ -625,52 +762,52 @@
                 <w:rFonts w:ascii="Calibri" w:hAnsi="Calibri"/>
                 <w:sz w:val="20"/>
               </w:rPr>
-              <w:t xml:space="preserve">EMBI+</w:t>
-            </w:r>
-          </w:p>
-        </w:tc>
-        <w:tc>
-          <w:tcPr/>
-          <w:p>
-            <w:pPr>
-              <w:pStyle w:val="Compact"/>
-            </w:pPr>
-            <w:r>
-              <w:rPr>
-                <w:rFonts w:ascii="Calibri" w:hAnsi="Calibri"/>
-                <w:sz w:val="20"/>
-              </w:rPr>
-              <w:t xml:space="preserve">J.P. Morgan, serie diaria publicada por Ámbito Financiero</w:t>
-            </w:r>
-          </w:p>
-        </w:tc>
-        <w:tc>
-          <w:tcPr/>
-          <w:p>
-            <w:pPr>
-              <w:pStyle w:val="Compact"/>
-            </w:pPr>
-            <w:r>
-              <w:rPr>
-                <w:rFonts w:ascii="Calibri" w:hAnsi="Calibri"/>
-                <w:sz w:val="20"/>
-              </w:rPr>
-              <w:t xml:space="preserve">Promedio trimestral</w:t>
-            </w:r>
-          </w:p>
-        </w:tc>
-        <w:tc>
-          <w:tcPr/>
-          <w:p>
-            <w:pPr>
-              <w:pStyle w:val="Compact"/>
-            </w:pPr>
-            <w:r>
-              <w:rPr>
-                <w:rFonts w:ascii="Calibri" w:hAnsi="Calibri"/>
-                <w:sz w:val="20"/>
-              </w:rPr>
-              <w:t xml:space="preserve">Fuente publicada y verificable desde diciembre de 1998</w:t>
+              <w:t xml:space="preserve">EMBI</w:t>
+            </w:r>
+          </w:p>
+        </w:tc>
+        <w:tc>
+          <w:tcPr/>
+          <w:p>
+            <w:pPr>
+              <w:pStyle w:val="Compact"/>
+            </w:pPr>
+            <w:r>
+              <w:rPr>
+                <w:rFonts w:ascii="Calibri" w:hAnsi="Calibri"/>
+                <w:sz w:val="20"/>
+              </w:rPr>
+              <w:t xml:space="preserve">J.P. Morgan, serie diaria publicada por Ámbito Financiero; BCRA y Reserva Federal para el empalme</w:t>
+            </w:r>
+          </w:p>
+        </w:tc>
+        <w:tc>
+          <w:tcPr/>
+          <w:p>
+            <w:pPr>
+              <w:pStyle w:val="Compact"/>
+            </w:pPr>
+            <w:r>
+              <w:rPr>
+                <w:rFonts w:ascii="Calibri" w:hAnsi="Calibri"/>
+                <w:sz w:val="20"/>
+              </w:rPr>
+              <w:t xml:space="preserve">Promedio trimestral; 1996T1-1998T3 con el empalme validado</w:t>
+            </w:r>
+          </w:p>
+        </w:tc>
+        <w:tc>
+          <w:tcPr/>
+          <w:p>
+            <w:pPr>
+              <w:pStyle w:val="Compact"/>
+            </w:pPr>
+            <w:r>
+              <w:rPr>
+                <w:rFonts w:ascii="Calibri" w:hAnsi="Calibri"/>
+                <w:sz w:val="20"/>
+              </w:rPr>
+              <w:t xml:space="preserve">Serie diaria desde diciembre de 1998; el empalme usa series oficiales</w:t>
             </w:r>
           </w:p>
         </w:tc>
@@ -702,37 +839,37 @@
                 <w:rFonts w:ascii="Calibri" w:hAnsi="Calibri"/>
                 <w:sz w:val="20"/>
               </w:rPr>
-              <w:t xml:space="preserve">BCRA</w:t>
-            </w:r>
-          </w:p>
-        </w:tc>
-        <w:tc>
-          <w:tcPr/>
-          <w:p>
-            <w:pPr>
-              <w:pStyle w:val="Compact"/>
-            </w:pPr>
-            <w:r>
-              <w:rPr>
-                <w:rFonts w:ascii="Calibri" w:hAnsi="Calibri"/>
-                <w:sz w:val="20"/>
-              </w:rPr>
-              <w:t xml:space="preserve">Promedio trimestral</w:t>
-            </w:r>
-          </w:p>
-        </w:tc>
-        <w:tc>
-          <w:tcPr/>
-          <w:p>
-            <w:pPr>
-              <w:pStyle w:val="Compact"/>
-            </w:pPr>
-            <w:r>
-              <w:rPr>
-                <w:rFonts w:ascii="Calibri" w:hAnsi="Calibri"/>
-                <w:sz w:val="20"/>
-              </w:rPr>
-              <w:t xml:space="preserve">Índice multilateral del BCRA</w:t>
+              <w:t xml:space="preserve">BCRA; BIS para el empalme</w:t>
+            </w:r>
+          </w:p>
+        </w:tc>
+        <w:tc>
+          <w:tcPr/>
+          <w:p>
+            <w:pPr>
+              <w:pStyle w:val="Compact"/>
+            </w:pPr>
+            <w:r>
+              <w:rPr>
+                <w:rFonts w:ascii="Calibri" w:hAnsi="Calibri"/>
+                <w:sz w:val="20"/>
+              </w:rPr>
+              <w:t xml:space="preserve">Promedio trimestral; 1996 encadenado con el BIS</w:t>
+            </w:r>
+          </w:p>
+        </w:tc>
+        <w:tc>
+          <w:tcPr/>
+          <w:p>
+            <w:pPr>
+              <w:pStyle w:val="Compact"/>
+            </w:pPr>
+            <w:r>
+              <w:rPr>
+                <w:rFonts w:ascii="Calibri" w:hAnsi="Calibri"/>
+                <w:sz w:val="20"/>
+              </w:rPr>
+              <w:t xml:space="preserve">El índice del BCRA empieza en enero de 1997</w:t>
             </w:r>
           </w:p>
         </w:tc>
@@ -877,7 +1014,7 @@
         <w:t xml:space="preserve"> </w:t>
       </w:r>
       <w:r>
-        <w:t xml:space="preserve">El resultado primario federal con rentas coincide con el del FMI: 1,38% del PIB en 2025 contra 1,4%, y 1,78% en 2024 contra 1,8%. La identidad reproduce la senda de deuda del FMI con un desvío máximo de 0,12 puntos.</w:t>
+        <w:t xml:space="preserve">La identidad reproduce la senda de deuda del FMI con un desvío máximo de 0,12 puntos.</w:t>
       </w:r>
     </w:p>
     <w:bookmarkEnd w:id="10"/>
@@ -895,7 +1032,7 @@
         <w:pStyle w:val="Compact"/>
         <w:numPr>
           <w:ilvl w:val="0"/>
-          <w:numId w:val="1003"/>
+          <w:numId w:val="1004"/>
         </w:numPr>
       </w:pPr>
       <w:r>
@@ -909,15 +1046,15 @@
         <w:t xml:space="preserve"> </w:t>
       </w:r>
       <w:r>
-        <w:t xml:space="preserve">cuatro endógenas (resultado primario, crecimiento, EMBI+, TCRM); exógenas: variación de la tasa de la FED (rezagos 0 a 2), VIX, binarias estacionales y binarias de los quiebres de Bai y Perron sobre la deuda (2001T4, 2006T2, 2018T1). La deuda rezagada entra en todas las ecuaciones.</w:t>
-      </w:r>
-    </w:p>
-    <w:p>
-      <w:pPr>
-        <w:pStyle w:val="Compact"/>
-        <w:numPr>
-          <w:ilvl w:val="0"/>
-          <w:numId w:val="1003"/>
+        <w:t xml:space="preserve">cuatro endógenas (resultado primario, crecimiento, EMBI, TCRM); exógenas: variación de la tasa de la FED (rezagos 0 a 2), VIX, binarias estacionales y binarias de los quiebres de Bai y Perron sobre la deuda (2001T4, 2006T2, 2018T1). La deuda rezagada entra en todas las ecuaciones.</w:t>
+      </w:r>
+    </w:p>
+    <w:p>
+      <w:pPr>
+        <w:pStyle w:val="Compact"/>
+        <w:numPr>
+          <w:ilvl w:val="0"/>
+          <w:numId w:val="1004"/>
         </w:numPr>
       </w:pPr>
       <w:r>
@@ -939,7 +1076,7 @@
         <w:pStyle w:val="Compact"/>
         <w:numPr>
           <w:ilvl w:val="0"/>
-          <w:numId w:val="1003"/>
+          <w:numId w:val="1004"/>
         </w:numPr>
       </w:pPr>
       <w:r>
@@ -961,7 +1098,7 @@
         <w:pStyle w:val="Compact"/>
         <w:numPr>
           <w:ilvl w:val="0"/>
-          <w:numId w:val="1003"/>
+          <w:numId w:val="1004"/>
         </w:numPr>
       </w:pPr>
       <w:r>
@@ -975,7 +1112,7 @@
         <w:t xml:space="preserve"> </w:t>
       </w:r>
       <w:r>
-        <w:t xml:space="preserve">las estimaciones son consistentes sin imponer cointegración (Sims et al., 1990). Las pruebas de raíz unitaria son ambiguas para la deuda, el EMBI+ y el TCRM, y Johansen no rechaza rango cero (traza 45,0 contra 47,9). La inferencia se hace con</w:t>
+        <w:t xml:space="preserve">las estimaciones son consistentes sin imponer cointegración (Sims et al., 1990). Las pruebas de raíz unitaria son ambiguas para la deuda, el EMBI y el TCRM, y Johansen no rechaza rango cero (traza 42,7 contra 47,9). La inferencia se hace con</w:t>
       </w:r>
       <w:r>
         <w:t xml:space="preserve"> </w:t>
@@ -996,7 +1133,7 @@
         <w:pStyle w:val="Compact"/>
         <w:numPr>
           <w:ilvl w:val="0"/>
-          <w:numId w:val="1003"/>
+          <w:numId w:val="1004"/>
         </w:numPr>
       </w:pPr>
       <w:r>
@@ -1010,7 +1147,7 @@
         <w:t xml:space="preserve"> </w:t>
       </w:r>
       <w:r>
-        <w:t xml:space="preserve">criterio de Schwarz entre los órdenes estables, que Ivanov y Kilian (2005) recomiendan para datos trimestrales con menos de 120 observaciones; si sus residuos están autocorrelacionados (Portmanteau, 12 rezagos, 5%), el menor orden mayor que no lo esté (Lütkepohl, 2005, sec. 4.4). Schwarz elige 1, con residuos autocorrelacionados (p = 0,000); se usan 2 (p = 0,296), el mismo orden que elige Hannan-Quinn. Autovalor máximo 0,849.</w:t>
+        <w:t xml:space="preserve">criterio de Schwarz entre los órdenes estables, que Ivanov y Kilian (2005) recomiendan para datos trimestrales con menos de 120 observaciones; si sus residuos están autocorrelacionados (Portmanteau, 12 rezagos, 5%), el menor orden mayor que no lo esté (Lütkepohl, 2005, sec. 4.4). Schwarz elige 1, con residuos autocorrelacionados (p = 0,000); se usan 2 (p = 0,056), el mismo orden que elige Hannan-Quinn. Autovalor máximo 0,896.</w:t>
       </w:r>
     </w:p>
     <w:bookmarkEnd w:id="11"/>
@@ -1038,7 +1175,29 @@
         <w:pStyle w:val="Compact"/>
         <w:numPr>
           <w:ilvl w:val="0"/>
-          <w:numId w:val="1004"/>
+          <w:numId w:val="1005"/>
+        </w:numPr>
+      </w:pPr>
+      <w:r>
+        <w:rPr>
+          <w:b/>
+          <w:bCs/>
+        </w:rPr>
+        <w:t xml:space="preserve">Nombre (D2b):</w:t>
+      </w:r>
+      <w:r>
+        <w:t xml:space="preserve"> </w:t>
+      </w:r>
+      <w:r>
+        <w:t xml:space="preserve">restricciones de impacto en la línea de Blanchard y Perotti (2002) para el bloque fiscal y de actividad, con un bloque cambiario y de riesgo (EMBI y TCRM) identificado en conjunto. Siempre con estas palabras.</w:t>
+      </w:r>
+    </w:p>
+    <w:p>
+      <w:pPr>
+        <w:pStyle w:val="Compact"/>
+        <w:numPr>
+          <w:ilvl w:val="0"/>
+          <w:numId w:val="1005"/>
         </w:numPr>
       </w:pPr>
       <w:r>
@@ -1060,7 +1219,7 @@
         <w:pStyle w:val="Compact"/>
         <w:numPr>
           <w:ilvl w:val="0"/>
-          <w:numId w:val="1004"/>
+          <w:numId w:val="1005"/>
         </w:numPr>
       </w:pPr>
       <w:r>
@@ -1098,7 +1257,7 @@
         <w:pStyle w:val="Compact"/>
         <w:numPr>
           <w:ilvl w:val="0"/>
-          <w:numId w:val="1004"/>
+          <w:numId w:val="1005"/>
         </w:numPr>
       </w:pPr>
       <w:r>
@@ -1112,15 +1271,15 @@
         <w:t xml:space="preserve"> </w:t>
       </w:r>
       <w:r>
-        <w:t xml:space="preserve">el EMBI+ y el TCRM sin orden entre sí; solo se interpreta el efecto conjunto (Christiano et al., 1999). El resultado primario y el crecimiento no responden en el trimestre a ese bloque.</w:t>
-      </w:r>
-    </w:p>
-    <w:p>
-      <w:pPr>
-        <w:pStyle w:val="Compact"/>
-        <w:numPr>
-          <w:ilvl w:val="0"/>
-          <w:numId w:val="1004"/>
+        <w:t xml:space="preserve">el EMBI y el TCRM sin orden entre sí; solo se interpreta el efecto conjunto (Christiano et al., 1999). El resultado primario y el crecimiento no responden en el trimestre a ese bloque.</w:t>
+      </w:r>
+    </w:p>
+    <w:p>
+      <w:pPr>
+        <w:pStyle w:val="Compact"/>
+        <w:numPr>
+          <w:ilvl w:val="0"/>
+          <w:numId w:val="1005"/>
         </w:numPr>
       </w:pPr>
       <w:r>
@@ -1134,15 +1293,15 @@
         <w:t xml:space="preserve"> </w:t>
       </w:r>
       <w:r>
-        <w:t xml:space="preserve">Cholesky con el resultado primario primero y último, y elasticidades de 0 y 0,5.</w:t>
-      </w:r>
-    </w:p>
-    <w:p>
-      <w:pPr>
-        <w:pStyle w:val="Compact"/>
-        <w:numPr>
-          <w:ilvl w:val="0"/>
-          <w:numId w:val="1004"/>
+        <w:t xml:space="preserve">dos ordenamientos de Cholesky (resultado primario primero y resultado primario último), y elasticidades de 0 y 0,5.</w:t>
+      </w:r>
+    </w:p>
+    <w:p>
+      <w:pPr>
+        <w:pStyle w:val="Compact"/>
+        <w:numPr>
+          <w:ilvl w:val="0"/>
+          <w:numId w:val="1005"/>
         </w:numPr>
       </w:pPr>
       <w:r>
@@ -1172,7 +1331,7 @@
         <w:t xml:space="preserve"> </w:t>
       </w:r>
       <w:r>
-        <w:t xml:space="preserve">estructurales reconstruyen los mismos residuos. Con números aleatorios comunes, las identificaciones alternativas dan exactamente la misma probabilidad (32,8% en 2031). La identificación hace falta para dos cosas: repartir la varianza de la deuda por bloque, que es el criterio de H1a, y definir el</w:t>
+        <w:t xml:space="preserve">estructurales reconstruyen los mismos residuos. Con números aleatorios comunes, las identificaciones alternativas dan exactamente la misma probabilidad (31,8% en 2031). La identificación hace falta para dos cosas: repartir la varianza de la deuda por bloque, que es el criterio de H1a, y definir el</w:t>
       </w:r>
       <w:r>
         <w:t xml:space="preserve"> </w:t>
@@ -1206,7 +1365,7 @@
         <w:pStyle w:val="FirstParagraph"/>
       </w:pPr>
       <w:r>
-        <w:t xml:space="preserve">La deuda rezagada entra en las cuatro ecuaciones y se acumula con la identidad (Favero y Giavazzi, 2007). En la simulación se actualiza al cierre de cada año, porque la identidad del FMI es anual. La deuda se asocia con más superávit: coeficiente de impacto 0,0495 [0,0099; 0,0799] y multiplicador de largo plazo 0,167 [0,057; 0,296]. Con el EMBI+ la estimación es de 15,5 puntos básicos por punto de deuda, con un intervalo que incluye el cero ([-4,2; 29,7]). Sin retroalimentación, la probabilidad en 2031 casi no cambia (31,4%) y el abanico se abre (55,5 puntos contra 48,3).</w:t>
+        <w:t xml:space="preserve">La deuda rezagada entra en las cuatro ecuaciones y se acumula con la identidad (Favero y Giavazzi, 2007). En la simulación se actualiza al cierre de cada año, porque la identidad del FMI es anual. La deuda se asocia con más superávit: coeficiente de impacto 0,0576 [0,0220; 0,0822] y multiplicador de largo plazo 0,199 [0,112; 0,328]. Con el EMBI la estimación es de unos 15 puntos básicos por punto de deuda, con un intervalo que incluye el cero. Sin retroalimentación, la probabilidad en 2031 casi no cambia (30,4%) y el abanico se abre (54,4 puntos contra 46,6).</w:t>
       </w:r>
     </w:p>
     <w:bookmarkEnd w:id="13"/>
@@ -1224,7 +1383,7 @@
         <w:pStyle w:val="Compact"/>
         <w:numPr>
           <w:ilvl w:val="0"/>
-          <w:numId w:val="1005"/>
+          <w:numId w:val="1006"/>
         </w:numPr>
       </w:pPr>
       <w:r>
@@ -1238,15 +1397,15 @@
         <w:t xml:space="preserve"> </w:t>
       </w:r>
       <w:r>
-        <w:t xml:space="preserve">parámetros de MCO (autovalor máximo 0,849) y 20.000 trayectorias; error de Monte Carlo de 0,33 puntos.</w:t>
-      </w:r>
-    </w:p>
-    <w:p>
-      <w:pPr>
-        <w:pStyle w:val="Compact"/>
-        <w:numPr>
-          <w:ilvl w:val="0"/>
-          <w:numId w:val="1005"/>
+        <w:t xml:space="preserve">parámetros de MCO (autovalor máximo 0,896) y 20.000 trayectorias; error de Monte Carlo de 0,33 puntos.</w:t>
+      </w:r>
+    </w:p>
+    <w:p>
+      <w:pPr>
+        <w:pStyle w:val="Compact"/>
+        <w:numPr>
+          <w:ilvl w:val="0"/>
+          <w:numId w:val="1006"/>
         </w:numPr>
       </w:pPr>
       <w:r>
@@ -1286,15 +1445,15 @@
         <w:t xml:space="preserve"> </w:t>
       </w:r>
       <w:r>
-        <w:t xml:space="preserve">respecto de la estimación puntual. 200 réplicas con 1.000 trayectorias cada una. Mediana del autovalor máximo en las réplicas: 0,818.</w:t>
-      </w:r>
-    </w:p>
-    <w:p>
-      <w:pPr>
-        <w:pStyle w:val="Compact"/>
-        <w:numPr>
-          <w:ilvl w:val="0"/>
-          <w:numId w:val="1005"/>
+        <w:t xml:space="preserve">respecto de la estimación puntual. 200 réplicas con 1.000 trayectorias cada una. Mediana del autovalor máximo en las réplicas: 0,842.</w:t>
+      </w:r>
+    </w:p>
+    <w:p>
+      <w:pPr>
+        <w:pStyle w:val="Compact"/>
+        <w:numPr>
+          <w:ilvl w:val="0"/>
+          <w:numId w:val="1006"/>
         </w:numPr>
       </w:pPr>
       <w:r>
@@ -1346,7 +1505,7 @@
         <w:pStyle w:val="Compact"/>
         <w:numPr>
           <w:ilvl w:val="0"/>
-          <w:numId w:val="1005"/>
+          <w:numId w:val="1006"/>
         </w:numPr>
       </w:pPr>
       <w:r>
@@ -1368,7 +1527,7 @@
         <w:pStyle w:val="Compact"/>
         <w:numPr>
           <w:ilvl w:val="0"/>
-          <w:numId w:val="1005"/>
+          <w:numId w:val="1006"/>
         </w:numPr>
       </w:pPr>
       <w:r>
@@ -1382,7 +1541,7 @@
         <w:t xml:space="preserve"> </w:t>
       </w:r>
       <w:r>
-        <w:t xml:space="preserve">como robustez (31,3% en 2031).</w:t>
+        <w:t xml:space="preserve">como robustez (30,1% en 2031).</w:t>
       </w:r>
     </w:p>
     <w:bookmarkEnd w:id="14"/>
@@ -1400,7 +1559,7 @@
         <w:pStyle w:val="Compact"/>
         <w:numPr>
           <w:ilvl w:val="0"/>
-          <w:numId w:val="1006"/>
+          <w:numId w:val="1007"/>
         </w:numPr>
       </w:pPr>
       <w:r>
@@ -1435,7 +1594,7 @@
         <w:pStyle w:val="Compact"/>
         <w:numPr>
           <w:ilvl w:val="0"/>
-          <w:numId w:val="1006"/>
+          <w:numId w:val="1007"/>
         </w:numPr>
       </w:pPr>
       <w:r>
@@ -1473,7 +1632,7 @@
         <w:pStyle w:val="Compact"/>
         <w:numPr>
           <w:ilvl w:val="0"/>
-          <w:numId w:val="1006"/>
+          <w:numId w:val="1007"/>
         </w:numPr>
       </w:pPr>
       <w:r>
@@ -1487,7 +1646,7 @@
         <w:t xml:space="preserve"> </w:t>
       </w:r>
       <w:r>
-        <w:t xml:space="preserve">el VIX y el nivel de la tasa de la FED siguen procesos AR(1) estimados en la muestra (0,700 y 0,960); sus innovaciones se remuestrean junto con los</w:t>
+        <w:t xml:space="preserve">el VIX y el nivel de la tasa de la FED siguen procesos AR(1) estimados en la muestra (0,703 y 0,970); sus innovaciones se remuestrean junto con los</w:t>
       </w:r>
       <w:r>
         <w:t xml:space="preserve"> </w:t>
@@ -1511,7 +1670,7 @@
         <w:pStyle w:val="Compact"/>
         <w:numPr>
           <w:ilvl w:val="0"/>
-          <w:numId w:val="1006"/>
+          <w:numId w:val="1007"/>
         </w:numPr>
       </w:pPr>
       <w:r>
@@ -1546,7 +1705,7 @@
         <w:pStyle w:val="Compact"/>
         <w:numPr>
           <w:ilvl w:val="0"/>
-          <w:numId w:val="1006"/>
+          <w:numId w:val="1007"/>
         </w:numPr>
       </w:pPr>
       <w:r>
@@ -1581,7 +1740,7 @@
         <w:pStyle w:val="Compact"/>
         <w:numPr>
           <w:ilvl w:val="0"/>
-          <w:numId w:val="1006"/>
+          <w:numId w:val="1007"/>
         </w:numPr>
       </w:pPr>
       <w:r>
@@ -1595,7 +1754,7 @@
         <w:t xml:space="preserve"> </w:t>
       </w:r>
       <w:r>
-        <w:t xml:space="preserve">(i) nivel 0,504 puntos más alto en forma permanente desde 2026T1 (un desvío estándar de la variación trimestral); (ii) repetición de la senda trimestral de 2022-2025 en 2026-2029: sube 5,25 puntos, baja 1,43 y desde 2030 queda 3,82 puntos por encima del base hasta 2035.</w:t>
+        <w:t xml:space="preserve">(i) nivel 0,494 puntos más alto en forma permanente desde 2026T1 (un desvío estándar de la variación trimestral); (ii) repetición de la senda trimestral de 2022-2025 en 2026-2029: sube 5,25 puntos, baja 1,43 y desde 2030 queda 3,82 puntos por encima del base hasta 2035.</w:t>
       </w:r>
     </w:p>
     <w:bookmarkEnd w:id="15"/>
@@ -1613,7 +1772,7 @@
         <w:pStyle w:val="Compact"/>
         <w:numPr>
           <w:ilvl w:val="0"/>
-          <w:numId w:val="1007"/>
+          <w:numId w:val="1008"/>
         </w:numPr>
       </w:pPr>
       <w:r>
@@ -1627,15 +1786,15 @@
         <w:t xml:space="preserve"> </w:t>
       </w:r>
       <w:r>
-        <w:t xml:space="preserve">No fiscal menos fiscal: 82,6 puntos [65,8; 92,4]. Reparto de la varianza en 2035: externo 46,6%, cambiario y de riesgo 32,3%, actividad 12,4%, fiscal 8,7%. Se cumple en las 19 especificaciones (menor límite inferior: 31,4, Cholesky con el resultado primario primero). Complemento descriptivo: con el resultado primario en su máximo de 1999-2025 (3,58%, 2004) todos los años, la probabilidad en 2031 es 25,5%; para llevarla al 1% haría falta sumar 7,75 puntos (9,2% del PIB en 2026 y 10,0% en 2031).</w:t>
-      </w:r>
-    </w:p>
-    <w:p>
-      <w:pPr>
-        <w:pStyle w:val="Compact"/>
-        <w:numPr>
-          <w:ilvl w:val="0"/>
-          <w:numId w:val="1007"/>
+        <w:t xml:space="preserve">No fiscal menos fiscal: 78,3 puntos [57,3; 87,9]. Reparto de la varianza en 2035: externo 44,9%, cambiario y de riesgo 32,3%, actividad 12,0%, fiscal 10,8%. Se cumple en las 20 especificaciones (menor límite inferior: 25,6, con elasticidad cíclica 0, una de las variantes de robustez). Complemento descriptivo: con el resultado primario en su máximo de 1996-2025 (3,29% sin rentas, 2004) todos los años, la probabilidad en 2031 es 26,1% (24,5% con el máximo con rentas, 3,58%); para llevarla al 1% haría falta sumar 8,00 puntos (9,4% del PIB en 2026 y 10,3% en 2031).</w:t>
+      </w:r>
+    </w:p>
+    <w:p>
+      <w:pPr>
+        <w:pStyle w:val="Compact"/>
+        <w:numPr>
+          <w:ilvl w:val="0"/>
+          <w:numId w:val="1008"/>
         </w:numPr>
       </w:pPr>
       <w:r>
@@ -1649,40 +1808,40 @@
         <w:t xml:space="preserve"> </w:t>
       </w:r>
       <w:r>
-        <w:t xml:space="preserve">32,8% [26,8; 37,9] en 2031 y 31,3% [27,0; 35,3] en 2035; con Bonferroni, límites inferiores de 26,3 y 26,4. Se cumple en las 19 especificaciones (menor límite inferior 20,3, deuda consolidada).</w:t>
-      </w:r>
-    </w:p>
-    <w:p>
-      <w:pPr>
-        <w:pStyle w:val="Compact"/>
-        <w:numPr>
-          <w:ilvl w:val="0"/>
-          <w:numId w:val="1007"/>
-        </w:numPr>
-      </w:pPr>
-      <w:r>
-        <w:rPr>
-          <w:b/>
-          <w:bCs/>
-        </w:rPr>
-        <w:t xml:space="preserve">H2, respaldada en su efecto sobre la probabilidad, no en su mecanismo.</w:t>
-      </w:r>
-      <w:r>
-        <w:t xml:space="preserve"> </w:t>
-      </w:r>
-      <w:r>
-        <w:t xml:space="preserve">Senda 2022-2025: +11,3 puntos de probabilidad en 2035 [4,4; 17,9] y +12,6 de deuda [1,2; 21,8]. Nivel 0,504 más alto: +1,5 [0,5; 2,6] y +1,5 [0,1; 2,5].</w:t>
+        <w:t xml:space="preserve">31,8% [25,2; 36,4] en 2031 y 31,0% [26,8; 35,6] en 2035; con Bonferroni, límites inferiores de 24,2 y 26,6. Se cumple en las 20 especificaciones (menor límite inferior 19,1, deuda consolidada con el BCRA).</w:t>
+      </w:r>
+    </w:p>
+    <w:p>
+      <w:pPr>
+        <w:pStyle w:val="Compact"/>
+        <w:numPr>
+          <w:ilvl w:val="0"/>
+          <w:numId w:val="1008"/>
+        </w:numPr>
+      </w:pPr>
+      <w:r>
+        <w:rPr>
+          <w:b/>
+          <w:bCs/>
+        </w:rPr>
+        <w:t xml:space="preserve">H2, respaldada en parte.</w:t>
+      </w:r>
+      <w:r>
+        <w:t xml:space="preserve"> </w:t>
+      </w:r>
+      <w:r>
+        <w:t xml:space="preserve">Senda 2022-2025: +9,7 puntos de probabilidad en 2035 [4,2; 16,0], robusto, y +9,0 de deuda [0,3; 16,2], no robusto. Nivel 0,494 más alto: +1,1 [0,2; 1,9] y +1,0 [0,0; 1,8]; el efecto sobre la probabilidad no resiste Bonferroni ([-0,0; 2,0]). El 96% del efecto de la senda sobre la deuda es el costo directo de la deuda en dólares; los canales que nombra la hipótesis no se distinguen.</w:t>
       </w:r>
     </w:p>
     <w:bookmarkEnd w:id="16"/>
     <w:bookmarkEnd w:id="17"/>
-    <w:bookmarkStart w:id="18" w:name="X67d2fc20419f2ea7f451a8955a56e1f30e9bc1c"/>
+    <w:bookmarkStart w:id="18" w:name="X87ed513a485b88e12fd80f68b7e7d6f1735bdf4"/>
     <w:p>
       <w:pPr>
         <w:pStyle w:val="Heading2"/>
       </w:pPr>
       <w:r>
-        <w:t xml:space="preserve">Parte 2. Qué cambió en la versión del 12/10/2026</w:t>
+        <w:t xml:space="preserve">Parte 2. Qué cambió en la revisión de octubre de 2026</w:t>
       </w:r>
     </w:p>
     <w:tbl>
@@ -1782,7 +1941,7 @@
                 <w:rFonts w:ascii="Calibri" w:hAnsi="Calibri"/>
                 <w:sz w:val="20"/>
               </w:rPr>
-              <w:t xml:space="preserve">D1: deuda federal bruta como principal, con el punto de partida, el escenario y la métrica del FMI; consolidada como extensión</w:t>
+              <w:t xml:space="preserve">D1: deuda federal bruta como principal, con el punto de partida, el escenario y la métrica del FMI; consolidada con el BCRA como extensión</w:t>
             </w:r>
           </w:p>
         </w:tc>
@@ -1814,37 +1973,37 @@
                 <w:rFonts w:ascii="Calibri" w:hAnsi="Calibri"/>
                 <w:sz w:val="20"/>
               </w:rPr>
-              <w:t xml:space="preserve">EMBI+ de 1996-1998 transcripto y TCRM de 1996 retropolado</w:t>
-            </w:r>
-          </w:p>
-        </w:tc>
-        <w:tc>
-          <w:tcPr/>
-          <w:p>
-            <w:pPr>
-              <w:pStyle w:val="Compact"/>
-            </w:pPr>
-            <w:r>
-              <w:rPr>
-                <w:rFonts w:ascii="Calibri" w:hAnsi="Calibri"/>
-                <w:sz w:val="20"/>
-              </w:rPr>
-              <w:t xml:space="preserve">D2: datos desde 1999</w:t>
-            </w:r>
-          </w:p>
-        </w:tc>
-        <w:tc>
-          <w:tcPr/>
-          <w:p>
-            <w:pPr>
-              <w:pStyle w:val="Compact"/>
-            </w:pPr>
-            <w:r>
-              <w:rPr>
-                <w:rFonts w:ascii="Calibri" w:hAnsi="Calibri"/>
-                <w:sz w:val="20"/>
-              </w:rPr>
-              <w:t xml:space="preserve">Todas las series con fuente publicada</w:t>
+              <w:t xml:space="preserve">EMBI de 1993-1998 escrito a mano sin fuente y TCRM de 1996 sin método documentado</w:t>
+            </w:r>
+          </w:p>
+        </w:tc>
+        <w:tc>
+          <w:tcPr/>
+          <w:p>
+            <w:pPr>
+              <w:pStyle w:val="Compact"/>
+            </w:pPr>
+            <w:r>
+              <w:rPr>
+                <w:rFonts w:ascii="Calibri" w:hAnsi="Calibri"/>
+                <w:sz w:val="20"/>
+              </w:rPr>
+              <w:t xml:space="preserve">D2: ventana única 1996-2025, con empalmes documentados y validados; los valores a mano se eliminaron</w:t>
+            </w:r>
+          </w:p>
+        </w:tc>
+        <w:tc>
+          <w:tcPr/>
+          <w:p>
+            <w:pPr>
+              <w:pStyle w:val="Compact"/>
+            </w:pPr>
+            <w:r>
+              <w:rPr>
+                <w:rFonts w:ascii="Calibri" w:hAnsi="Calibri"/>
+                <w:sz w:val="20"/>
+              </w:rPr>
+              <w:t xml:space="preserve">Con datos desde 1999, sin empalme, 32,4% en 2031 contra 31,8%</w:t>
             </w:r>
           </w:p>
         </w:tc>
@@ -1861,37 +2020,52 @@
                 <w:rFonts w:ascii="Calibri" w:hAnsi="Calibri"/>
                 <w:sz w:val="20"/>
               </w:rPr>
-              <w:t xml:space="preserve">Regla de rezagos sin respaldo y cita de Ivanov y Kilian mal usada</w:t>
-            </w:r>
-          </w:p>
-        </w:tc>
-        <w:tc>
-          <w:tcPr/>
-          <w:p>
-            <w:pPr>
-              <w:pStyle w:val="Compact"/>
-            </w:pPr>
-            <w:r>
-              <w:rPr>
-                <w:rFonts w:ascii="Calibri" w:hAnsi="Calibri"/>
-                <w:sz w:val="20"/>
-              </w:rPr>
-              <w:t xml:space="preserve">D3: Schwarz más adecuación de residuos</w:t>
-            </w:r>
-          </w:p>
-        </w:tc>
-        <w:tc>
-          <w:tcPr/>
-          <w:p>
-            <w:pPr>
-              <w:pStyle w:val="Compact"/>
-            </w:pPr>
-            <w:r>
-              <w:rPr>
-                <w:rFonts w:ascii="Calibri" w:hAnsi="Calibri"/>
-                <w:sz w:val="20"/>
-              </w:rPr>
-              <w:t xml:space="preserve">2 rezagos, residuos sin autocorrelación (p = 0,296)</w:t>
+              <w:t xml:space="preserve">Período de estudio y nombres de variables distintos entre documentos</w:t>
+            </w:r>
+          </w:p>
+        </w:tc>
+        <w:tc>
+          <w:tcPr/>
+          <w:p>
+            <w:pPr>
+              <w:pStyle w:val="Compact"/>
+            </w:pPr>
+            <w:r>
+              <w:rPr>
+                <w:rFonts w:ascii="Calibri" w:hAnsi="Calibri"/>
+                <w:sz w:val="20"/>
+              </w:rPr>
+              <w:t xml:space="preserve">D2b: reglas de consistencia y control automático (</w:t>
+            </w:r>
+            <w:r>
+              <w:rPr>
+                <w:rStyle w:val="VerbatimChar"/>
+                <w:rFonts w:ascii="Calibri" w:hAnsi="Calibri"/>
+                <w:sz w:val="20"/>
+              </w:rPr>
+              <w:t xml:space="preserve">verificar_consistencia.py</w:t>
+            </w:r>
+            <w:r>
+              <w:rPr>
+                <w:rFonts w:ascii="Calibri" w:hAnsi="Calibri"/>
+                <w:sz w:val="20"/>
+              </w:rPr>
+              <w:t xml:space="preserve">)</w:t>
+            </w:r>
+          </w:p>
+        </w:tc>
+        <w:tc>
+          <w:tcPr/>
+          <w:p>
+            <w:pPr>
+              <w:pStyle w:val="Compact"/>
+            </w:pPr>
+            <w:r>
+              <w:rPr>
+                <w:rFonts w:ascii="Calibri" w:hAnsi="Calibri"/>
+                <w:sz w:val="20"/>
+              </w:rPr>
+              <w:t xml:space="preserve">Un solo período, un solo nombre para el EMBI y para la identificación</w:t>
             </w:r>
           </w:p>
         </w:tc>
@@ -1908,37 +2082,37 @@
                 <w:rFonts w:ascii="Calibri" w:hAnsi="Calibri"/>
                 <w:sz w:val="20"/>
               </w:rPr>
-              <w:t xml:space="preserve">Resultado primario con perímetro distinto del de la deuda</w:t>
-            </w:r>
-          </w:p>
-        </w:tc>
-        <w:tc>
-          <w:tcPr/>
-          <w:p>
-            <w:pPr>
-              <w:pStyle w:val="Compact"/>
-            </w:pPr>
-            <w:r>
-              <w:rPr>
-                <w:rFonts w:ascii="Calibri" w:hAnsi="Calibri"/>
-                <w:sz w:val="20"/>
-              </w:rPr>
-              <w:t xml:space="preserve">D4: definición por perímetro</w:t>
-            </w:r>
-          </w:p>
-        </w:tc>
-        <w:tc>
-          <w:tcPr/>
-          <w:p>
-            <w:pPr>
-              <w:pStyle w:val="Compact"/>
-            </w:pPr>
-            <w:r>
-              <w:rPr>
-                <w:rFonts w:ascii="Calibri" w:hAnsi="Calibri"/>
-                <w:sz w:val="20"/>
-              </w:rPr>
-              <w:t xml:space="preserve">Coincide con el FMI en 2024 y 2025</w:t>
+              <w:t xml:space="preserve">Regla de rezagos sin respaldo y cita de Ivanov y Kilian mal usada</w:t>
+            </w:r>
+          </w:p>
+        </w:tc>
+        <w:tc>
+          <w:tcPr/>
+          <w:p>
+            <w:pPr>
+              <w:pStyle w:val="Compact"/>
+            </w:pPr>
+            <w:r>
+              <w:rPr>
+                <w:rFonts w:ascii="Calibri" w:hAnsi="Calibri"/>
+                <w:sz w:val="20"/>
+              </w:rPr>
+              <w:t xml:space="preserve">D3: Schwarz más adecuación de residuos</w:t>
+            </w:r>
+          </w:p>
+        </w:tc>
+        <w:tc>
+          <w:tcPr/>
+          <w:p>
+            <w:pPr>
+              <w:pStyle w:val="Compact"/>
+            </w:pPr>
+            <w:r>
+              <w:rPr>
+                <w:rFonts w:ascii="Calibri" w:hAnsi="Calibri"/>
+                <w:sz w:val="20"/>
+              </w:rPr>
+              <w:t xml:space="preserve">2 rezagos, residuos sin autocorrelación (p = 0,056)</w:t>
             </w:r>
           </w:p>
         </w:tc>
@@ -1955,37 +2129,37 @@
                 <w:rFonts w:ascii="Calibri" w:hAnsi="Calibri"/>
                 <w:sz w:val="20"/>
               </w:rPr>
-              <w:t xml:space="preserve">Salto de la FED en 2022T1 por cambio de serie</w:t>
-            </w:r>
-          </w:p>
-        </w:tc>
-        <w:tc>
-          <w:tcPr/>
-          <w:p>
-            <w:pPr>
-              <w:pStyle w:val="Compact"/>
-            </w:pPr>
-            <w:r>
-              <w:rPr>
-                <w:rFonts w:ascii="Calibri" w:hAnsi="Calibri"/>
-                <w:sz w:val="20"/>
-              </w:rPr>
-              <w:t xml:space="preserve">D5: variación con la tasa efectiva en los dos trimestres</w:t>
-            </w:r>
-          </w:p>
-        </w:tc>
-        <w:tc>
-          <w:tcPr/>
-          <w:p>
-            <w:pPr>
-              <w:pStyle w:val="Compact"/>
-            </w:pPr>
-            <w:r>
-              <w:rPr>
-                <w:rFonts w:ascii="Calibri" w:hAnsi="Calibri"/>
-                <w:sz w:val="20"/>
-              </w:rPr>
-              <w:t xml:space="preserve">El desvío (0,504) no incluye el cambio de serie</w:t>
+              <w:t xml:space="preserve">Resultado primario con utilidades del BCRA, justificado con una definición del FMI que era falsa</w:t>
+            </w:r>
+          </w:p>
+        </w:tc>
+        <w:tc>
+          <w:tcPr/>
+          <w:p>
+            <w:pPr>
+              <w:pStyle w:val="Compact"/>
+            </w:pPr>
+            <w:r>
+              <w:rPr>
+                <w:rFonts w:ascii="Calibri" w:hAnsi="Calibri"/>
+                <w:sz w:val="20"/>
+              </w:rPr>
+              <w:t xml:space="preserve">D4: una sola definición, sin rentas de la propiedad, que excluye las utilidades del BCRA como el FMI</w:t>
+            </w:r>
+          </w:p>
+        </w:tc>
+        <w:tc>
+          <w:tcPr/>
+          <w:p>
+            <w:pPr>
+              <w:pStyle w:val="Compact"/>
+            </w:pPr>
+            <w:r>
+              <w:rPr>
+                <w:rFonts w:ascii="Calibri" w:hAnsi="Calibri"/>
+                <w:sz w:val="20"/>
+              </w:rPr>
+              <w:t xml:space="preserve">Con rentas, como robustez; los resultados casi no cambian</w:t>
             </w:r>
           </w:p>
         </w:tc>
@@ -2002,37 +2176,37 @@
                 <w:rFonts w:ascii="Calibri" w:hAnsi="Calibri"/>
                 <w:sz w:val="20"/>
               </w:rPr>
-              <w:t xml:space="preserve">VIX y FED fijos en la simulación</w:t>
-            </w:r>
-          </w:p>
-        </w:tc>
-        <w:tc>
-          <w:tcPr/>
-          <w:p>
-            <w:pPr>
-              <w:pStyle w:val="Compact"/>
-            </w:pPr>
-            <w:r>
-              <w:rPr>
-                <w:rFonts w:ascii="Calibri" w:hAnsi="Calibri"/>
-                <w:sz w:val="20"/>
-              </w:rPr>
-              <w:t xml:space="preserve">D6: procesos AR(1) con innovaciones remuestreadas</w:t>
-            </w:r>
-          </w:p>
-        </w:tc>
-        <w:tc>
-          <w:tcPr/>
-          <w:p>
-            <w:pPr>
-              <w:pStyle w:val="Compact"/>
-            </w:pPr>
-            <w:r>
-              <w:rPr>
-                <w:rFonts w:ascii="Calibri" w:hAnsi="Calibri"/>
-                <w:sz w:val="20"/>
-              </w:rPr>
-              <w:t xml:space="preserve">Bloque externo en la varianza</w:t>
+              <w:t xml:space="preserve">Salto de la FED en 2022T1 por cambio de serie</w:t>
+            </w:r>
+          </w:p>
+        </w:tc>
+        <w:tc>
+          <w:tcPr/>
+          <w:p>
+            <w:pPr>
+              <w:pStyle w:val="Compact"/>
+            </w:pPr>
+            <w:r>
+              <w:rPr>
+                <w:rFonts w:ascii="Calibri" w:hAnsi="Calibri"/>
+                <w:sz w:val="20"/>
+              </w:rPr>
+              <w:t xml:space="preserve">D5: variación con la tasa efectiva en los dos trimestres</w:t>
+            </w:r>
+          </w:p>
+        </w:tc>
+        <w:tc>
+          <w:tcPr/>
+          <w:p>
+            <w:pPr>
+              <w:pStyle w:val="Compact"/>
+            </w:pPr>
+            <w:r>
+              <w:rPr>
+                <w:rFonts w:ascii="Calibri" w:hAnsi="Calibri"/>
+                <w:sz w:val="20"/>
+              </w:rPr>
+              <w:t xml:space="preserve">El desvío (0,494) no incluye el cambio de serie</w:t>
             </w:r>
           </w:p>
         </w:tc>
@@ -2049,37 +2223,37 @@
                 <w:rFonts w:ascii="Calibri" w:hAnsi="Calibri"/>
                 <w:sz w:val="20"/>
               </w:rPr>
-              <w:t xml:space="preserve">Remuestreo independiente con residuos autocorrelacionados</w:t>
-            </w:r>
-          </w:p>
-        </w:tc>
-        <w:tc>
-          <w:tcPr/>
-          <w:p>
-            <w:pPr>
-              <w:pStyle w:val="Compact"/>
-            </w:pPr>
-            <w:r>
-              <w:rPr>
-                <w:rFonts w:ascii="Calibri" w:hAnsi="Calibri"/>
-                <w:sz w:val="20"/>
-              </w:rPr>
-              <w:t xml:space="preserve">D7: bloques de ocho trimestres</w:t>
-            </w:r>
-          </w:p>
-        </w:tc>
-        <w:tc>
-          <w:tcPr/>
-          <w:p>
-            <w:pPr>
-              <w:pStyle w:val="Compact"/>
-            </w:pPr>
-            <w:r>
-              <w:rPr>
-                <w:rFonts w:ascii="Calibri" w:hAnsi="Calibri"/>
-                <w:sz w:val="20"/>
-              </w:rPr>
-              <w:t xml:space="preserve">Conserva la autocorrelación remanente</w:t>
+              <w:t xml:space="preserve">VIX y FED fijos en la simulación</w:t>
+            </w:r>
+          </w:p>
+        </w:tc>
+        <w:tc>
+          <w:tcPr/>
+          <w:p>
+            <w:pPr>
+              <w:pStyle w:val="Compact"/>
+            </w:pPr>
+            <w:r>
+              <w:rPr>
+                <w:rFonts w:ascii="Calibri" w:hAnsi="Calibri"/>
+                <w:sz w:val="20"/>
+              </w:rPr>
+              <w:t xml:space="preserve">D6: procesos AR(1) con innovaciones remuestreadas</w:t>
+            </w:r>
+          </w:p>
+        </w:tc>
+        <w:tc>
+          <w:tcPr/>
+          <w:p>
+            <w:pPr>
+              <w:pStyle w:val="Compact"/>
+            </w:pPr>
+            <w:r>
+              <w:rPr>
+                <w:rFonts w:ascii="Calibri" w:hAnsi="Calibri"/>
+                <w:sz w:val="20"/>
+              </w:rPr>
+              <w:t xml:space="preserve">Bloque externo en la varianza</w:t>
             </w:r>
           </w:p>
         </w:tc>
@@ -2096,6 +2270,53 @@
                 <w:rFonts w:ascii="Calibri" w:hAnsi="Calibri"/>
                 <w:sz w:val="20"/>
               </w:rPr>
+              <w:t xml:space="preserve">Remuestreo independiente con residuos autocorrelacionados</w:t>
+            </w:r>
+          </w:p>
+        </w:tc>
+        <w:tc>
+          <w:tcPr/>
+          <w:p>
+            <w:pPr>
+              <w:pStyle w:val="Compact"/>
+            </w:pPr>
+            <w:r>
+              <w:rPr>
+                <w:rFonts w:ascii="Calibri" w:hAnsi="Calibri"/>
+                <w:sz w:val="20"/>
+              </w:rPr>
+              <w:t xml:space="preserve">D7: bloques de ocho trimestres</w:t>
+            </w:r>
+          </w:p>
+        </w:tc>
+        <w:tc>
+          <w:tcPr/>
+          <w:p>
+            <w:pPr>
+              <w:pStyle w:val="Compact"/>
+            </w:pPr>
+            <w:r>
+              <w:rPr>
+                <w:rFonts w:ascii="Calibri" w:hAnsi="Calibri"/>
+                <w:sz w:val="20"/>
+              </w:rPr>
+              <w:t xml:space="preserve">Conserva la autocorrelación remanente</w:t>
+            </w:r>
+          </w:p>
+        </w:tc>
+      </w:tr>
+      <w:tr>
+        <w:tc>
+          <w:tcPr/>
+          <w:p>
+            <w:pPr>
+              <w:pStyle w:val="Compact"/>
+            </w:pPr>
+            <w:r>
+              <w:rPr>
+                <w:rFonts w:ascii="Calibri" w:hAnsi="Calibri"/>
+                <w:sz w:val="20"/>
+              </w:rPr>
               <w:t xml:space="preserve">Estimación central casi con raíz unitaria e intervalos descentrados</w:t>
             </w:r>
           </w:p>
@@ -2156,7 +2377,7 @@
                 <w:rFonts w:ascii="Calibri" w:hAnsi="Calibri"/>
                 <w:sz w:val="20"/>
               </w:rPr>
-              <w:t xml:space="preserve">Autovalor 0,849; Kilian como robustez</w:t>
+              <w:t xml:space="preserve">Autovalor 0,896; Kilian como robustez</w:t>
             </w:r>
           </w:p>
         </w:tc>
@@ -2273,7 +2494,7 @@
                 <w:rFonts w:ascii="Calibri" w:hAnsi="Calibri"/>
                 <w:sz w:val="20"/>
               </w:rPr>
-              <w:t xml:space="preserve">Se cumple en las 19 especificaciones</w:t>
+              <w:t xml:space="preserve">Se cumple en las 20 especificaciones</w:t>
             </w:r>
           </w:p>
         </w:tc>
@@ -2320,7 +2541,7 @@
                 <w:rFonts w:ascii="Calibri" w:hAnsi="Calibri"/>
                 <w:sz w:val="20"/>
               </w:rPr>
-              <w:t xml:space="preserve">Se cumple en las 19 especificaciones</w:t>
+              <w:t xml:space="preserve">Se cumple en las 20 especificaciones</w:t>
             </w:r>
           </w:p>
         </w:tc>
@@ -2367,7 +2588,7 @@
                 <w:rFonts w:ascii="Calibri" w:hAnsi="Calibri"/>
                 <w:sz w:val="20"/>
               </w:rPr>
-              <w:t xml:space="preserve">Se cumple en la principal; mecanismo no distinguible</w:t>
+              <w:t xml:space="preserve">Se cumple en la principal; robusto solo el efecto de la senda sobre la probabilidad; mecanismo no distinguible</w:t>
             </w:r>
           </w:p>
         </w:tc>
@@ -2397,7 +2618,7 @@
         <w:pStyle w:val="Compact"/>
         <w:numPr>
           <w:ilvl w:val="0"/>
-          <w:numId w:val="1008"/>
+          <w:numId w:val="1009"/>
         </w:numPr>
       </w:pPr>
       <w:r>
@@ -2435,7 +2656,7 @@
         <w:pStyle w:val="Compact"/>
         <w:numPr>
           <w:ilvl w:val="0"/>
-          <w:numId w:val="1008"/>
+          <w:numId w:val="1009"/>
         </w:numPr>
       </w:pPr>
       <w:r>
@@ -2465,7 +2686,7 @@
         <w:t xml:space="preserve"> </w:t>
       </w:r>
       <w:r>
-        <w:t xml:space="preserve">del FMI aplicado a la historia argentina sobre el mismo perímetro se obtiene 16,6% en 2031 y un ancho de 151,1, así que tampoco se reproduce el 1%. La diferencia viene de la distribución de</w:t>
+        <w:t xml:space="preserve">del FMI aplicado a la historia argentina de la ventana, sobre el mismo perímetro, se obtiene 24,1% en 2031 y un ancho de 148,4, así que tampoco se reproduce el 1%. La diferencia viene de la distribución de</w:t>
       </w:r>
       <w:r>
         <w:t xml:space="preserve"> </w:t>
@@ -2489,7 +2710,7 @@
         <w:pStyle w:val="Compact"/>
         <w:numPr>
           <w:ilvl w:val="0"/>
-          <w:numId w:val="1008"/>
+          <w:numId w:val="1009"/>
         </w:numPr>
       </w:pPr>
       <w:r>
@@ -2503,7 +2724,7 @@
         <w:t xml:space="preserve"> </w:t>
       </w:r>
       <w:r>
-        <w:t xml:space="preserve">Ya no. La estimación central usa MCO, con autovalor máximo 0,849; la mediana de las réplicas es 0,818. Los percentiles de Hall corrigen el sesgo de la distribución</w:t>
+        <w:t xml:space="preserve">Ya no. La estimación central usa MCO, con autovalor máximo 0,896; la mediana de las réplicas es 0,842. Los percentiles de Hall corrigen el sesgo de la distribución</w:t>
       </w:r>
       <w:r>
         <w:t xml:space="preserve"> </w:t>
@@ -2516,15 +2737,15 @@
         <w:t xml:space="preserve">bootstrap</w:t>
       </w:r>
       <w:r>
-        <w:t xml:space="preserve">. La corrección de Kilian (1998) queda como robustez y da 31,3% en 2031.</w:t>
-      </w:r>
-    </w:p>
-    <w:p>
-      <w:pPr>
-        <w:pStyle w:val="Compact"/>
-        <w:numPr>
-          <w:ilvl w:val="0"/>
-          <w:numId w:val="1008"/>
+        <w:t xml:space="preserve">. La corrección de Kilian (1998) queda como robustez y da 30,1% en 2031.</w:t>
+      </w:r>
+    </w:p>
+    <w:p>
+      <w:pPr>
+        <w:pStyle w:val="Compact"/>
+        <w:numPr>
+          <w:ilvl w:val="0"/>
+          <w:numId w:val="1009"/>
         </w:numPr>
       </w:pPr>
       <w:r>
@@ -2538,15 +2759,15 @@
         <w:t xml:space="preserve"> </w:t>
       </w:r>
       <w:r>
-        <w:t xml:space="preserve">La regla tiene respaldo citado: Schwarz entre los órdenes estables, que Ivanov y Kilian (2005) recomiendan para datos trimestrales con menos de 120 observaciones, y adecuación de residuos (Lütkepohl, 2005, sec. 4.4). La versión anterior citaba a Ivanov y Kilian para el AIC, y esa cita era incorrecta. Con 1 y 3 rezagos la probabilidad en 2031 es 32,4% y 30,3%.</w:t>
-      </w:r>
-    </w:p>
-    <w:p>
-      <w:pPr>
-        <w:pStyle w:val="Compact"/>
-        <w:numPr>
-          <w:ilvl w:val="0"/>
-          <w:numId w:val="1008"/>
+        <w:t xml:space="preserve">La regla tiene respaldo citado: Schwarz entre los órdenes estables, que Ivanov y Kilian (2005) recomiendan para datos trimestrales con menos de 120 observaciones, y adecuación de residuos (Lütkepohl, 2005, sec. 4.4). La versión anterior citaba a Ivanov y Kilian para el AIC, y esa cita era incorrecta. Con 1 y 3 rezagos la probabilidad en 2031 es 31,4% y 30,0%.</w:t>
+      </w:r>
+    </w:p>
+    <w:p>
+      <w:pPr>
+        <w:pStyle w:val="Compact"/>
+        <w:numPr>
+          <w:ilvl w:val="0"/>
+          <w:numId w:val="1009"/>
         </w:numPr>
       </w:pPr>
       <w:r>
@@ -2560,15 +2781,15 @@
         <w:t xml:space="preserve"> </w:t>
       </w:r>
       <w:r>
-        <w:t xml:space="preserve">Con 2 rezagos los residuos no rechazan la ausencia de autocorrelación (p = 0,296). La simulación remuestrea en bloques de ocho trimestres y la inferencia usa bloques móviles de cuatro, que conservan la autocorrelación remanente.</w:t>
-      </w:r>
-    </w:p>
-    <w:p>
-      <w:pPr>
-        <w:pStyle w:val="Compact"/>
-        <w:numPr>
-          <w:ilvl w:val="0"/>
-          <w:numId w:val="1008"/>
+        <w:t xml:space="preserve">Con 2 rezagos los residuos no rechazan la ausencia de autocorrelación (p = 0,056). La simulación remuestrea en bloques de ocho trimestres y la inferencia usa bloques móviles de cuatro, que conservan la autocorrelación remanente.</w:t>
+      </w:r>
+    </w:p>
+    <w:p>
+      <w:pPr>
+        <w:pStyle w:val="Compact"/>
+        <w:numPr>
+          <w:ilvl w:val="0"/>
+          <w:numId w:val="1009"/>
         </w:numPr>
       </w:pPr>
       <w:r>
@@ -2612,7 +2833,7 @@
         <w:t xml:space="preserve"> </w:t>
       </w:r>
       <w:r>
-        <w:t xml:space="preserve">Se abandonó. Las pruebas ARCH no rechazan (p entre 0,114 y 0,998), y Brüggemann et al. (2016) muestran que el</w:t>
+        <w:t xml:space="preserve">Se abandonó. Las pruebas ARCH no rechazan al 5% (en la principal, p entre 0,108 y 0,996), y Brüggemann et al. (2016) muestran que el</w:t>
       </w:r>
       <w:r>
         <w:t xml:space="preserve"> </w:t>
@@ -2636,7 +2857,7 @@
         <w:pStyle w:val="Compact"/>
         <w:numPr>
           <w:ilvl w:val="0"/>
-          <w:numId w:val="1008"/>
+          <w:numId w:val="1009"/>
         </w:numPr>
       </w:pPr>
       <w:r>
@@ -2650,15 +2871,15 @@
         <w:t xml:space="preserve"> </w:t>
       </w:r>
       <w:r>
-        <w:t xml:space="preserve">La definición depende del perímetro (D4). Para la deuda federal se incluyen, porque son ingreso del Tesoro y es la definición del FMI; para la consolidada se excluyen, porque son un flujo interno. Sin rentas, la probabilidad federal es 32,4% en 2031.</w:t>
-      </w:r>
-    </w:p>
-    <w:p>
-      <w:pPr>
-        <w:pStyle w:val="Compact"/>
-        <w:numPr>
-          <w:ilvl w:val="0"/>
-          <w:numId w:val="1008"/>
+        <w:t xml:space="preserve">Ya no. La versión anterior usaba para la deuda federal el resultado primario con rentas de la propiedad y lo justificaba como la definición del FMI. Era falso: el FMI excluye de su resultado primario las transferencias de utilidades del BCRA (FMI, 2026, cuadro 1, nota 4). Lo detectamos nosotros en la lectura final. Como el MECON no publica esas transferencias separadas del resto de las rentas de la propiedad, la única serie pública que las deja afuera es la que excluye todas las rentas. Por eso la tesis usa una sola definición, sin rentas, para los dos perímetros (D4); en el consolidado esas utilidades también son un flujo interno. La serie con rentas queda como robustez. El costo de la corrección es mínimo: la probabilidad de 2031 es 31,8% [25,2; 36,4] sin rentas, y las conclusiones de H1a, H1b y H2 no cambian (Apéndice A.9). Si el jurado pregunta por qué no se separan solo las utilidades, la respuesta es que la fuente pública no lo permite y que excluir todas las rentas es el criterio más cercano al del FMI que se puede replicar.</w:t>
+      </w:r>
+    </w:p>
+    <w:p>
+      <w:pPr>
+        <w:pStyle w:val="Compact"/>
+        <w:numPr>
+          <w:ilvl w:val="0"/>
+          <w:numId w:val="1009"/>
         </w:numPr>
       </w:pPr>
       <w:r>
@@ -2680,29 +2901,29 @@
         <w:pStyle w:val="Compact"/>
         <w:numPr>
           <w:ilvl w:val="0"/>
-          <w:numId w:val="1008"/>
-        </w:numPr>
-      </w:pPr>
-      <w:r>
-        <w:rPr>
-          <w:b/>
-          <w:bCs/>
-        </w:rPr>
-        <w:t xml:space="preserve">“El EMBI+ de 1996-1998 no es el EMBI+.”</w:t>
-      </w:r>
-      <w:r>
-        <w:t xml:space="preserve"> </w:t>
-      </w:r>
-      <w:r>
-        <w:t xml:space="preserve">Esos años salieron de la muestra (D2): los datos empiezan en 1999, con el EMBI+ de la serie diaria de Ámbito Financiero.</w:t>
-      </w:r>
-    </w:p>
-    <w:p>
-      <w:pPr>
-        <w:pStyle w:val="Compact"/>
-        <w:numPr>
-          <w:ilvl w:val="0"/>
-          <w:numId w:val="1008"/>
+          <w:numId w:val="1009"/>
+        </w:numPr>
+      </w:pPr>
+      <w:r>
+        <w:rPr>
+          <w:b/>
+          <w:bCs/>
+        </w:rPr>
+        <w:t xml:space="preserve">“El EMBI de 1996-1998 es inventado.”</w:t>
+      </w:r>
+      <w:r>
+        <w:t xml:space="preserve"> </w:t>
+      </w:r>
+      <w:r>
+        <w:t xml:space="preserve">El EMBI de 1996T1-1998T3 sale de un empalme con series oficiales (la tasa interfinanciera en dólares del BCRA menos la tasa de fondos federales), estimado en la superposición 1998T4-2001T3 con R² = 0,89, error típico de 102 puntos básicos dejando un trimestre afuera y un pronóstico fuera de muestra de 2001 que acierta el nivel. Con datos desde 1999, solo con el EMBI observado, la probabilidad en 2031 es 32,4% contra 31,8%, y H1a y H2 no cambian. Los valores de 1993-1998 escritos a mano de la base anterior se eliminaron.</w:t>
+      </w:r>
+    </w:p>
+    <w:p>
+      <w:pPr>
+        <w:pStyle w:val="Compact"/>
+        <w:numPr>
+          <w:ilvl w:val="0"/>
+          <w:numId w:val="1009"/>
         </w:numPr>
       </w:pPr>
       <w:r>
@@ -2732,15 +2953,15 @@
         <w:t xml:space="preserve"> </w:t>
       </w:r>
       <w:r>
-        <w:t xml:space="preserve">fiscal. Con Cholesky el reparto cambia (63,9 y 95,8 puntos), pero el criterio de H1a se cumple en todas las variantes.</w:t>
-      </w:r>
-    </w:p>
-    <w:p>
-      <w:pPr>
-        <w:pStyle w:val="Compact"/>
-        <w:numPr>
-          <w:ilvl w:val="0"/>
-          <w:numId w:val="1008"/>
+        <w:t xml:space="preserve">fiscal. Con los dos ordenamientos de Cholesky de robustez el reparto cambia (60,7 y 91,9 puntos), y el criterio de H1a se cumple en todas las variantes.</w:t>
+      </w:r>
+    </w:p>
+    <w:p>
+      <w:pPr>
+        <w:pStyle w:val="Compact"/>
+        <w:numPr>
+          <w:ilvl w:val="0"/>
+          <w:numId w:val="1009"/>
         </w:numPr>
       </w:pPr>
       <w:r>
@@ -2754,15 +2975,15 @@
         <w:t xml:space="preserve"> </w:t>
       </w:r>
       <w:r>
-        <w:t xml:space="preserve">Solo afecta el reparto de la varianza. Con 0 y 0,5 la diferencia no fiscal menos fiscal es 63,9 y 96,5, y las dos excluyen el cero.</w:t>
-      </w:r>
-    </w:p>
-    <w:p>
-      <w:pPr>
-        <w:pStyle w:val="Compact"/>
-        <w:numPr>
-          <w:ilvl w:val="0"/>
-          <w:numId w:val="1008"/>
+        <w:t xml:space="preserve">Solo afecta el reparto de la varianza. Con 0 y 0,5 la diferencia no fiscal menos fiscal es 60,7 y 94,4, y las dos excluyen el cero.</w:t>
+      </w:r>
+    </w:p>
+    <w:p>
+      <w:pPr>
+        <w:pStyle w:val="Compact"/>
+        <w:numPr>
+          <w:ilvl w:val="0"/>
+          <w:numId w:val="1009"/>
         </w:numPr>
       </w:pPr>
       <w:r>
@@ -2776,7 +2997,7 @@
         <w:t xml:space="preserve"> </w:t>
       </w:r>
       <w:r>
-        <w:t xml:space="preserve">Ahora se simulan con sus procesos AR(1), y el bloque externo explica 46,6% de la varianza en 2035.</w:t>
+        <w:t xml:space="preserve">Ahora se simulan con sus procesos AR(1), y el bloque externo explica 44,9% de la varianza en 2035.</w:t>
       </w:r>
     </w:p>
     <w:bookmarkEnd w:id="19"/>
@@ -2794,7 +3015,7 @@
         <w:pStyle w:val="Compact"/>
         <w:numPr>
           <w:ilvl w:val="0"/>
-          <w:numId w:val="1009"/>
+          <w:numId w:val="1010"/>
         </w:numPr>
       </w:pPr>
       <w:r>
@@ -2808,37 +3029,37 @@
         <w:t xml:space="preserve"> </w:t>
       </w:r>
       <w:r>
-        <w:t xml:space="preserve">Solo 3 de 84 intervalos de respuesta excluyen el cero, todos del TCRM y con signo de apreciación. El 75% del efecto sobre la deuda en 2035 es el costo directo de la deuda en dólares, que la identidad incorpora (9,4 de 12,6 puntos). H2 se respalda en su efecto sobre la probabilidad, no en sus canales.</w:t>
-      </w:r>
-    </w:p>
-    <w:p>
-      <w:pPr>
-        <w:pStyle w:val="Compact"/>
-        <w:numPr>
-          <w:ilvl w:val="0"/>
-          <w:numId w:val="1009"/>
-        </w:numPr>
-      </w:pPr>
-      <w:r>
-        <w:rPr>
-          <w:b/>
-          <w:bCs/>
-        </w:rPr>
-        <w:t xml:space="preserve">El efecto sobre la deuda esperada no es robusto.</w:t>
-      </w:r>
-      <w:r>
-        <w:t xml:space="preserve"> </w:t>
-      </w:r>
-      <w:r>
-        <w:t xml:space="preserve">Con Bonferroni no excluye el cero (límites inferiores -0,0 y -0,5). En las robusteces, el efecto de la senda sobre la deuda excluye el cero en 12 de 19 especificaciones; sobre la probabilidad, en 18 de 19.</w:t>
-      </w:r>
-    </w:p>
-    <w:p>
-      <w:pPr>
-        <w:pStyle w:val="Compact"/>
-        <w:numPr>
-          <w:ilvl w:val="0"/>
-          <w:numId w:val="1009"/>
+        <w:t xml:space="preserve">Solo 2 de 84 intervalos de respuesta excluyen el cero, los dos del TCRM y con signo de apreciación. El 96% del efecto de la senda sobre la deuda en 2035 es el costo directo de la deuda en dólares, que la identidad incorpora (8,6 de 9,0 puntos). H2 se respalda en el efecto de la senda sobre la probabilidad; sus canales no se distinguen.</w:t>
+      </w:r>
+    </w:p>
+    <w:p>
+      <w:pPr>
+        <w:pStyle w:val="Compact"/>
+        <w:numPr>
+          <w:ilvl w:val="0"/>
+          <w:numId w:val="1010"/>
+        </w:numPr>
+      </w:pPr>
+      <w:r>
+        <w:rPr>
+          <w:b/>
+          <w:bCs/>
+        </w:rPr>
+        <w:t xml:space="preserve">El efecto sobre la deuda esperada y el del desvío estándar no son robustos.</w:t>
+      </w:r>
+      <w:r>
+        <w:t xml:space="preserve"> </w:t>
+      </w:r>
+      <w:r>
+        <w:t xml:space="preserve">Con Bonferroni (95%), el efecto sobre la deuda no excluye el cero en ningún escenario ([-0,5; 2,0] y [-4,1; 17,4]), y el del desvío estándar sobre la probabilidad tampoco ([-0,0; 2,0]). Solo el efecto de la senda sobre la probabilidad lo excluye ([3,6; 16,8]). En las robusteces, el efecto de la senda sobre la probabilidad excluye el cero en 18 de 20 especificaciones (no con datos desde 2004 ni con la corrección de Kilian); sobre la deuda, en 9 de 20.</w:t>
+      </w:r>
+    </w:p>
+    <w:p>
+      <w:pPr>
+        <w:pStyle w:val="Compact"/>
+        <w:numPr>
+          <w:ilvl w:val="0"/>
+          <w:numId w:val="1010"/>
         </w:numPr>
       </w:pPr>
       <w:r>
@@ -2860,7 +3081,7 @@
         <w:pStyle w:val="Compact"/>
         <w:numPr>
           <w:ilvl w:val="0"/>
-          <w:numId w:val="1009"/>
+          <w:numId w:val="1010"/>
         </w:numPr>
       </w:pPr>
       <w:r>
@@ -2882,7 +3103,7 @@
         <w:pStyle w:val="Compact"/>
         <w:numPr>
           <w:ilvl w:val="0"/>
-          <w:numId w:val="1009"/>
+          <w:numId w:val="1010"/>
         </w:numPr>
       </w:pPr>
       <w:r>
@@ -2896,7 +3117,7 @@
         <w:t xml:space="preserve"> </w:t>
       </w:r>
       <w:r>
-        <w:t xml:space="preserve">No construimos un escenario propio. Con el escenario del FMI de 2025 la probabilidad en 2031 es 30,4%, y con el ajuste</w:t>
+        <w:t xml:space="preserve">No construimos un escenario propio. Con el escenario del FMI de 2025 la probabilidad en 2031 es 29,4%, y con el ajuste</w:t>
       </w:r>
       <w:r>
         <w:t xml:space="preserve"> </w:t>
@@ -2909,15 +3130,15 @@
         <w:t xml:space="preserve">stock</w:t>
       </w:r>
       <w:r>
-        <w:t xml:space="preserve">-flujo en cero, 29,8%.</w:t>
-      </w:r>
-    </w:p>
-    <w:p>
-      <w:pPr>
-        <w:pStyle w:val="Compact"/>
-        <w:numPr>
-          <w:ilvl w:val="0"/>
-          <w:numId w:val="1009"/>
+        <w:t xml:space="preserve">-flujo en cero, 28,9%.</w:t>
+      </w:r>
+    </w:p>
+    <w:p>
+      <w:pPr>
+        <w:pStyle w:val="Compact"/>
+        <w:numPr>
+          <w:ilvl w:val="0"/>
+          <w:numId w:val="1010"/>
         </w:numPr>
       </w:pPr>
       <w:r>
@@ -2952,7 +3173,7 @@
         <w:pStyle w:val="Compact"/>
         <w:numPr>
           <w:ilvl w:val="0"/>
-          <w:numId w:val="1009"/>
+          <w:numId w:val="1010"/>
         </w:numPr>
       </w:pPr>
       <w:r>
@@ -2990,7 +3211,7 @@
         <w:pStyle w:val="Compact"/>
         <w:numPr>
           <w:ilvl w:val="0"/>
-          <w:numId w:val="1009"/>
+          <w:numId w:val="1010"/>
         </w:numPr>
       </w:pPr>
       <w:r>
@@ -3004,15 +3225,37 @@
         <w:t xml:space="preserve"> </w:t>
       </w:r>
       <w:r>
-        <w:t xml:space="preserve">Son 102 trimestres para cuatro ecuaciones con dos rezagos, la deuda, las exógenas y las binarias.</w:t>
-      </w:r>
-    </w:p>
-    <w:p>
-      <w:pPr>
-        <w:pStyle w:val="Compact"/>
-        <w:numPr>
-          <w:ilvl w:val="0"/>
-          <w:numId w:val="1009"/>
+        <w:t xml:space="preserve">Son 111 trimestres para cuatro ecuaciones con dos rezagos, la deuda, las exógenas y las binarias.</w:t>
+      </w:r>
+    </w:p>
+    <w:p>
+      <w:pPr>
+        <w:pStyle w:val="Compact"/>
+        <w:numPr>
+          <w:ilvl w:val="0"/>
+          <w:numId w:val="1010"/>
+        </w:numPr>
+      </w:pPr>
+      <w:r>
+        <w:rPr>
+          <w:b/>
+          <w:bCs/>
+        </w:rPr>
+        <w:t xml:space="preserve">El empalme del EMBI atenúa la crisis.</w:t>
+      </w:r>
+      <w:r>
+        <w:t xml:space="preserve"> </w:t>
+      </w:r>
+      <w:r>
+        <w:t xml:space="preserve">En el pronóstico fuera de muestra subestima el salto de 2001 (1.033 contra 1.469 en 2001T3). Si sesga, atenúa la volatilidad de 1996-1998 y vuelve conservadoras las probabilidades, y la variante con datos desde 1999 da casi lo mismo.</w:t>
+      </w:r>
+    </w:p>
+    <w:p>
+      <w:pPr>
+        <w:pStyle w:val="Compact"/>
+        <w:numPr>
+          <w:ilvl w:val="0"/>
+          <w:numId w:val="1010"/>
         </w:numPr>
       </w:pPr>
       <w:r>
@@ -3050,7 +3293,7 @@
         <w:pStyle w:val="Compact"/>
         <w:numPr>
           <w:ilvl w:val="0"/>
-          <w:numId w:val="1009"/>
+          <w:numId w:val="1010"/>
         </w:numPr>
       </w:pPr>
       <w:r>
@@ -3064,15 +3307,15 @@
         <w:t xml:space="preserve"> </w:t>
       </w:r>
       <w:r>
-        <w:t xml:space="preserve">Los quiebres de Bai y Perron se estiman con la serie de deuda y entran en todas las ecuaciones. Sin esas binarias la probabilidad en 2031 es 31,2%.</w:t>
-      </w:r>
-    </w:p>
-    <w:p>
-      <w:pPr>
-        <w:pStyle w:val="Compact"/>
-        <w:numPr>
-          <w:ilvl w:val="0"/>
-          <w:numId w:val="1009"/>
+        <w:t xml:space="preserve">Los quiebres de Bai y Perron se estiman con la serie de deuda y entran en todas las ecuaciones. Sin esas binarias la probabilidad en 2031 es 30,5%.</w:t>
+      </w:r>
+    </w:p>
+    <w:p>
+      <w:pPr>
+        <w:pStyle w:val="Compact"/>
+        <w:numPr>
+          <w:ilvl w:val="0"/>
+          <w:numId w:val="1010"/>
         </w:numPr>
       </w:pPr>
       <w:r>
@@ -3246,22 +3489,22 @@
                 <w:rFonts w:ascii="Calibri" w:hAnsi="Calibri"/>
                 <w:sz w:val="20"/>
               </w:rPr>
-              <w:t xml:space="preserve">2000T3-2025T4, 102 trimestres</w:t>
-            </w:r>
-          </w:p>
-        </w:tc>
-        <w:tc>
-          <w:tcPr/>
-          <w:p>
-            <w:pPr>
-              <w:pStyle w:val="Compact"/>
-            </w:pPr>
-            <w:r>
-              <w:rPr>
-                <w:rFonts w:ascii="Calibri" w:hAnsi="Calibri"/>
-                <w:sz w:val="20"/>
-              </w:rPr>
-              <w:t xml:space="preserve">Muestra efectiva</w:t>
+              <w:t xml:space="preserve">1996-2025</w:t>
+            </w:r>
+          </w:p>
+        </w:tc>
+        <w:tc>
+          <w:tcPr/>
+          <w:p>
+            <w:pPr>
+              <w:pStyle w:val="Compact"/>
+            </w:pPr>
+            <w:r>
+              <w:rPr>
+                <w:rFonts w:ascii="Calibri" w:hAnsi="Calibri"/>
+                <w:sz w:val="20"/>
+              </w:rPr>
+              <w:t xml:space="preserve">Ventana del estudio; proyección 2026-2035</w:t>
             </w:r>
           </w:p>
         </w:tc>
@@ -3278,22 +3521,22 @@
                 <w:rFonts w:ascii="Calibri" w:hAnsi="Calibri"/>
                 <w:sz w:val="20"/>
               </w:rPr>
-              <w:t xml:space="preserve">2 rezagos</w:t>
-            </w:r>
-          </w:p>
-        </w:tc>
-        <w:tc>
-          <w:tcPr/>
-          <w:p>
-            <w:pPr>
-              <w:pStyle w:val="Compact"/>
-            </w:pPr>
-            <w:r>
-              <w:rPr>
-                <w:rFonts w:ascii="Calibri" w:hAnsi="Calibri"/>
-                <w:sz w:val="20"/>
-              </w:rPr>
-              <w:t xml:space="preserve">Schwarz elige 1 (Portmanteau p = 0,000); con 2, p = 0,296</w:t>
+              <w:t xml:space="preserve">1998T2-2025T4, 111 trimestres</w:t>
+            </w:r>
+          </w:p>
+        </w:tc>
+        <w:tc>
+          <w:tcPr/>
+          <w:p>
+            <w:pPr>
+              <w:pStyle w:val="Compact"/>
+            </w:pPr>
+            <w:r>
+              <w:rPr>
+                <w:rFonts w:ascii="Calibri" w:hAnsi="Calibri"/>
+                <w:sz w:val="20"/>
+              </w:rPr>
+              <w:t xml:space="preserve">Trimestres con que se estiman las ecuaciones (los anteriores son condiciones iniciales)</w:t>
             </w:r>
           </w:p>
         </w:tc>
@@ -3310,22 +3553,22 @@
                 <w:rFonts w:ascii="Calibri" w:hAnsi="Calibri"/>
                 <w:sz w:val="20"/>
               </w:rPr>
-              <w:t xml:space="preserve">0,849</w:t>
-            </w:r>
-          </w:p>
-        </w:tc>
-        <w:tc>
-          <w:tcPr/>
-          <w:p>
-            <w:pPr>
-              <w:pStyle w:val="Compact"/>
-            </w:pPr>
-            <w:r>
-              <w:rPr>
-                <w:rFonts w:ascii="Calibri" w:hAnsi="Calibri"/>
-                <w:sz w:val="20"/>
-              </w:rPr>
-              <w:t xml:space="preserve">Autovalor máximo del VAR principal</w:t>
+              <w:t xml:space="preserve">R² = 0,89; 102 pb</w:t>
+            </w:r>
+          </w:p>
+        </w:tc>
+        <w:tc>
+          <w:tcPr/>
+          <w:p>
+            <w:pPr>
+              <w:pStyle w:val="Compact"/>
+            </w:pPr>
+            <w:r>
+              <w:rPr>
+                <w:rFonts w:ascii="Calibri" w:hAnsi="Calibri"/>
+                <w:sz w:val="20"/>
+              </w:rPr>
+              <w:t xml:space="preserve">Empalme del EMBI: ajuste en la superposición y error típico dejando un trimestre afuera</w:t>
             </w:r>
           </w:p>
         </w:tc>
@@ -3342,22 +3585,22 @@
                 <w:rFonts w:ascii="Calibri" w:hAnsi="Calibri"/>
                 <w:sz w:val="20"/>
               </w:rPr>
-              <w:t xml:space="preserve">0,0495 [0,0099; 0,0799]</w:t>
-            </w:r>
-          </w:p>
-        </w:tc>
-        <w:tc>
-          <w:tcPr/>
-          <w:p>
-            <w:pPr>
-              <w:pStyle w:val="Compact"/>
-            </w:pPr>
-            <w:r>
-              <w:rPr>
-                <w:rFonts w:ascii="Calibri" w:hAnsi="Calibri"/>
-                <w:sz w:val="20"/>
-              </w:rPr>
-              <w:t xml:space="preserve">Reacción fiscal de impacto</w:t>
+              <w:t xml:space="preserve">32,4% contra 31,8%</w:t>
+            </w:r>
+          </w:p>
+        </w:tc>
+        <w:tc>
+          <w:tcPr/>
+          <w:p>
+            <w:pPr>
+              <w:pStyle w:val="Compact"/>
+            </w:pPr>
+            <w:r>
+              <w:rPr>
+                <w:rFonts w:ascii="Calibri" w:hAnsi="Calibri"/>
+                <w:sz w:val="20"/>
+              </w:rPr>
+              <w:t xml:space="preserve">No estabilización en 2031 con datos desde 1999 (sin empalme) y con la ventana completa</w:t>
             </w:r>
           </w:p>
         </w:tc>
@@ -3374,22 +3617,22 @@
                 <w:rFonts w:ascii="Calibri" w:hAnsi="Calibri"/>
                 <w:sz w:val="20"/>
               </w:rPr>
-              <w:t xml:space="preserve">0,167 [0,057; 0,296]</w:t>
-            </w:r>
-          </w:p>
-        </w:tc>
-        <w:tc>
-          <w:tcPr/>
-          <w:p>
-            <w:pPr>
-              <w:pStyle w:val="Compact"/>
-            </w:pPr>
-            <w:r>
-              <w:rPr>
-                <w:rFonts w:ascii="Calibri" w:hAnsi="Calibri"/>
-                <w:sz w:val="20"/>
-              </w:rPr>
-              <w:t xml:space="preserve">Reacción fiscal de largo plazo</w:t>
+              <w:t xml:space="preserve">2 rezagos</w:t>
+            </w:r>
+          </w:p>
+        </w:tc>
+        <w:tc>
+          <w:tcPr/>
+          <w:p>
+            <w:pPr>
+              <w:pStyle w:val="Compact"/>
+            </w:pPr>
+            <w:r>
+              <w:rPr>
+                <w:rFonts w:ascii="Calibri" w:hAnsi="Calibri"/>
+                <w:sz w:val="20"/>
+              </w:rPr>
+              <w:t xml:space="preserve">Schwarz elige 1 (Portmanteau p = 0,000); con 2, p = 0,056</w:t>
             </w:r>
           </w:p>
         </w:tc>
@@ -3406,22 +3649,22 @@
                 <w:rFonts w:ascii="Calibri" w:hAnsi="Calibri"/>
                 <w:sz w:val="20"/>
               </w:rPr>
-              <w:t xml:space="preserve">32,8% [26,8; 37,9]</w:t>
-            </w:r>
-          </w:p>
-        </w:tc>
-        <w:tc>
-          <w:tcPr/>
-          <w:p>
-            <w:pPr>
-              <w:pStyle w:val="Compact"/>
-            </w:pPr>
-            <w:r>
-              <w:rPr>
-                <w:rFonts w:ascii="Calibri" w:hAnsi="Calibri"/>
-                <w:sz w:val="20"/>
-              </w:rPr>
-              <w:t xml:space="preserve">No estabilización en 2031 (FMI: 1%)</w:t>
+              <w:t xml:space="preserve">0,896</w:t>
+            </w:r>
+          </w:p>
+        </w:tc>
+        <w:tc>
+          <w:tcPr/>
+          <w:p>
+            <w:pPr>
+              <w:pStyle w:val="Compact"/>
+            </w:pPr>
+            <w:r>
+              <w:rPr>
+                <w:rFonts w:ascii="Calibri" w:hAnsi="Calibri"/>
+                <w:sz w:val="20"/>
+              </w:rPr>
+              <w:t xml:space="preserve">Autovalor máximo del VAR principal</w:t>
             </w:r>
           </w:p>
         </w:tc>
@@ -3438,22 +3681,22 @@
                 <w:rFonts w:ascii="Calibri" w:hAnsi="Calibri"/>
                 <w:sz w:val="20"/>
               </w:rPr>
-              <w:t xml:space="preserve">31,3% [27,0; 35,3]</w:t>
-            </w:r>
-          </w:p>
-        </w:tc>
-        <w:tc>
-          <w:tcPr/>
-          <w:p>
-            <w:pPr>
-              <w:pStyle w:val="Compact"/>
-            </w:pPr>
-            <w:r>
-              <w:rPr>
-                <w:rFonts w:ascii="Calibri" w:hAnsi="Calibri"/>
-                <w:sz w:val="20"/>
-              </w:rPr>
-              <w:t xml:space="preserve">No estabilización en 2035 (FMI: menos de 3%)</w:t>
+              <w:t xml:space="preserve">0,0576 [0,0220; 0,0822]</w:t>
+            </w:r>
+          </w:p>
+        </w:tc>
+        <w:tc>
+          <w:tcPr/>
+          <w:p>
+            <w:pPr>
+              <w:pStyle w:val="Compact"/>
+            </w:pPr>
+            <w:r>
+              <w:rPr>
+                <w:rFonts w:ascii="Calibri" w:hAnsi="Calibri"/>
+                <w:sz w:val="20"/>
+              </w:rPr>
+              <w:t xml:space="preserve">Reacción fiscal de impacto</w:t>
             </w:r>
           </w:p>
         </w:tc>
@@ -3470,22 +3713,22 @@
                 <w:rFonts w:ascii="Calibri" w:hAnsi="Calibri"/>
                 <w:sz w:val="20"/>
               </w:rPr>
-              <w:t xml:space="preserve">26,3 y 26,4</w:t>
-            </w:r>
-          </w:p>
-        </w:tc>
-        <w:tc>
-          <w:tcPr/>
-          <w:p>
-            <w:pPr>
-              <w:pStyle w:val="Compact"/>
-            </w:pPr>
-            <w:r>
-              <w:rPr>
-                <w:rFonts w:ascii="Calibri" w:hAnsi="Calibri"/>
-                <w:sz w:val="20"/>
-              </w:rPr>
-              <w:t xml:space="preserve">Límites inferiores con Bonferroni (95%), 2031 y 2035</w:t>
+              <w:t xml:space="preserve">0,199 [0,112; 0,328]</w:t>
+            </w:r>
+          </w:p>
+        </w:tc>
+        <w:tc>
+          <w:tcPr/>
+          <w:p>
+            <w:pPr>
+              <w:pStyle w:val="Compact"/>
+            </w:pPr>
+            <w:r>
+              <w:rPr>
+                <w:rFonts w:ascii="Calibri" w:hAnsi="Calibri"/>
+                <w:sz w:val="20"/>
+              </w:rPr>
+              <w:t xml:space="preserve">Reacción fiscal de largo plazo</w:t>
             </w:r>
           </w:p>
         </w:tc>
@@ -3502,22 +3745,22 @@
                 <w:rFonts w:ascii="Calibri" w:hAnsi="Calibri"/>
                 <w:sz w:val="20"/>
               </w:rPr>
-              <w:t xml:space="preserve">82,6 [65,8; 92,4]</w:t>
-            </w:r>
-          </w:p>
-        </w:tc>
-        <w:tc>
-          <w:tcPr/>
-          <w:p>
-            <w:pPr>
-              <w:pStyle w:val="Compact"/>
-            </w:pPr>
-            <w:r>
-              <w:rPr>
-                <w:rFonts w:ascii="Calibri" w:hAnsi="Calibri"/>
-                <w:sz w:val="20"/>
-              </w:rPr>
-              <w:t xml:space="preserve">H1a: no fiscal menos fiscal, varianza de 2035</w:t>
+              <w:t xml:space="preserve">31,8% [25,2; 36,4]</w:t>
+            </w:r>
+          </w:p>
+        </w:tc>
+        <w:tc>
+          <w:tcPr/>
+          <w:p>
+            <w:pPr>
+              <w:pStyle w:val="Compact"/>
+            </w:pPr>
+            <w:r>
+              <w:rPr>
+                <w:rFonts w:ascii="Calibri" w:hAnsi="Calibri"/>
+                <w:sz w:val="20"/>
+              </w:rPr>
+              <w:t xml:space="preserve">No estabilización en 2031 (FMI: 1%)</w:t>
             </w:r>
           </w:p>
         </w:tc>
@@ -3534,22 +3777,22 @@
                 <w:rFonts w:ascii="Calibri" w:hAnsi="Calibri"/>
                 <w:sz w:val="20"/>
               </w:rPr>
-              <w:t xml:space="preserve">46,6 / 32,3 / 12,4 / 8,7</w:t>
-            </w:r>
-          </w:p>
-        </w:tc>
-        <w:tc>
-          <w:tcPr/>
-          <w:p>
-            <w:pPr>
-              <w:pStyle w:val="Compact"/>
-            </w:pPr>
-            <w:r>
-              <w:rPr>
-                <w:rFonts w:ascii="Calibri" w:hAnsi="Calibri"/>
-                <w:sz w:val="20"/>
-              </w:rPr>
-              <w:t xml:space="preserve">Varianza de 2035: externo / cambiario y de riesgo / actividad / fiscal (%)</w:t>
+              <w:t xml:space="preserve">31,0% [26,8; 35,6]</w:t>
+            </w:r>
+          </w:p>
+        </w:tc>
+        <w:tc>
+          <w:tcPr/>
+          <w:p>
+            <w:pPr>
+              <w:pStyle w:val="Compact"/>
+            </w:pPr>
+            <w:r>
+              <w:rPr>
+                <w:rFonts w:ascii="Calibri" w:hAnsi="Calibri"/>
+                <w:sz w:val="20"/>
+              </w:rPr>
+              <w:t xml:space="preserve">No estabilización en 2035 (FMI: menos de 3%)</w:t>
             </w:r>
           </w:p>
         </w:tc>
@@ -3566,22 +3809,22 @@
                 <w:rFonts w:ascii="Calibri" w:hAnsi="Calibri"/>
                 <w:sz w:val="20"/>
               </w:rPr>
-              <w:t xml:space="preserve">3,58% del PIB</w:t>
-            </w:r>
-          </w:p>
-        </w:tc>
-        <w:tc>
-          <w:tcPr/>
-          <w:p>
-            <w:pPr>
-              <w:pStyle w:val="Compact"/>
-            </w:pPr>
-            <w:r>
-              <w:rPr>
-                <w:rFonts w:ascii="Calibri" w:hAnsi="Calibri"/>
-                <w:sz w:val="20"/>
-              </w:rPr>
-              <w:t xml:space="preserve">Máximo anual del resultado primario 1999-2025 (2004); sin rentas, 3,29%</w:t>
+              <w:t xml:space="preserve">24,2 y 26,6</w:t>
+            </w:r>
+          </w:p>
+        </w:tc>
+        <w:tc>
+          <w:tcPr/>
+          <w:p>
+            <w:pPr>
+              <w:pStyle w:val="Compact"/>
+            </w:pPr>
+            <w:r>
+              <w:rPr>
+                <w:rFonts w:ascii="Calibri" w:hAnsi="Calibri"/>
+                <w:sz w:val="20"/>
+              </w:rPr>
+              <w:t xml:space="preserve">Límites inferiores con Bonferroni (95%), 2031 y 2035</w:t>
             </w:r>
           </w:p>
         </w:tc>
@@ -3598,22 +3841,22 @@
                 <w:rFonts w:ascii="Calibri" w:hAnsi="Calibri"/>
                 <w:sz w:val="20"/>
               </w:rPr>
-              <w:t xml:space="preserve">25,5%</w:t>
-            </w:r>
-          </w:p>
-        </w:tc>
-        <w:tc>
-          <w:tcPr/>
-          <w:p>
-            <w:pPr>
-              <w:pStyle w:val="Compact"/>
-            </w:pPr>
-            <w:r>
-              <w:rPr>
-                <w:rFonts w:ascii="Calibri" w:hAnsi="Calibri"/>
-                <w:sz w:val="20"/>
-              </w:rPr>
-              <w:t xml:space="preserve">Probabilidad en 2031 con el resultado primario en su máximo histórico todos los años</w:t>
+              <w:t xml:space="preserve">78,3 [57,3; 87,9]</w:t>
+            </w:r>
+          </w:p>
+        </w:tc>
+        <w:tc>
+          <w:tcPr/>
+          <w:p>
+            <w:pPr>
+              <w:pStyle w:val="Compact"/>
+            </w:pPr>
+            <w:r>
+              <w:rPr>
+                <w:rFonts w:ascii="Calibri" w:hAnsi="Calibri"/>
+                <w:sz w:val="20"/>
+              </w:rPr>
+              <w:t xml:space="preserve">H1a: no fiscal menos fiscal, varianza de 2035</w:t>
             </w:r>
           </w:p>
         </w:tc>
@@ -3630,22 +3873,22 @@
                 <w:rFonts w:ascii="Calibri" w:hAnsi="Calibri"/>
                 <w:sz w:val="20"/>
               </w:rPr>
-              <w:t xml:space="preserve">+7,75 puntos</w:t>
-            </w:r>
-          </w:p>
-        </w:tc>
-        <w:tc>
-          <w:tcPr/>
-          <w:p>
-            <w:pPr>
-              <w:pStyle w:val="Compact"/>
-            </w:pPr>
-            <w:r>
-              <w:rPr>
-                <w:rFonts w:ascii="Calibri" w:hAnsi="Calibri"/>
-                <w:sz w:val="20"/>
-              </w:rPr>
-              <w:t xml:space="preserve">Aumento del resultado primario necesario para llevar la probabilidad de 2031 al 1%</w:t>
+              <w:t xml:space="preserve">44,9 / 32,3 / 12,0 / 10,8</w:t>
+            </w:r>
+          </w:p>
+        </w:tc>
+        <w:tc>
+          <w:tcPr/>
+          <w:p>
+            <w:pPr>
+              <w:pStyle w:val="Compact"/>
+            </w:pPr>
+            <w:r>
+              <w:rPr>
+                <w:rFonts w:ascii="Calibri" w:hAnsi="Calibri"/>
+                <w:sz w:val="20"/>
+              </w:rPr>
+              <w:t xml:space="preserve">Varianza de 2035: externo / cambiario y de riesgo / actividad / fiscal (%)</w:t>
             </w:r>
           </w:p>
         </w:tc>
@@ -3662,22 +3905,22 @@
                 <w:rFonts w:ascii="Calibri" w:hAnsi="Calibri"/>
                 <w:sz w:val="20"/>
               </w:rPr>
-              <w:t xml:space="preserve">+11,3 [4,4; 17,9]</w:t>
-            </w:r>
-          </w:p>
-        </w:tc>
-        <w:tc>
-          <w:tcPr/>
-          <w:p>
-            <w:pPr>
-              <w:pStyle w:val="Compact"/>
-            </w:pPr>
-            <w:r>
-              <w:rPr>
-                <w:rFonts w:ascii="Calibri" w:hAnsi="Calibri"/>
-                <w:sz w:val="20"/>
-              </w:rPr>
-              <w:t xml:space="preserve">Senda de la FED 2022-2025: efecto sobre la probabilidad en 2035 (pp)</w:t>
+              <w:t xml:space="preserve">3,29% del PIB</w:t>
+            </w:r>
+          </w:p>
+        </w:tc>
+        <w:tc>
+          <w:tcPr/>
+          <w:p>
+            <w:pPr>
+              <w:pStyle w:val="Compact"/>
+            </w:pPr>
+            <w:r>
+              <w:rPr>
+                <w:rFonts w:ascii="Calibri" w:hAnsi="Calibri"/>
+                <w:sz w:val="20"/>
+              </w:rPr>
+              <w:t xml:space="preserve">Máximo anual del resultado primario sin rentas 1996-2025 (2004), definición principal; con rentas, 3,58%</w:t>
             </w:r>
           </w:p>
         </w:tc>
@@ -3694,22 +3937,22 @@
                 <w:rFonts w:ascii="Calibri" w:hAnsi="Calibri"/>
                 <w:sz w:val="20"/>
               </w:rPr>
-              <w:t xml:space="preserve">+12,6 [1,2; 21,8]</w:t>
-            </w:r>
-          </w:p>
-        </w:tc>
-        <w:tc>
-          <w:tcPr/>
-          <w:p>
-            <w:pPr>
-              <w:pStyle w:val="Compact"/>
-            </w:pPr>
-            <w:r>
-              <w:rPr>
-                <w:rFonts w:ascii="Calibri" w:hAnsi="Calibri"/>
-                <w:sz w:val="20"/>
-              </w:rPr>
-              <w:t xml:space="preserve">Senda de la FED 2022-2025: efecto sobre la deuda en 2035 (pp del PIB)</w:t>
+              <w:t xml:space="preserve">26,1%</w:t>
+            </w:r>
+          </w:p>
+        </w:tc>
+        <w:tc>
+          <w:tcPr/>
+          <w:p>
+            <w:pPr>
+              <w:pStyle w:val="Compact"/>
+            </w:pPr>
+            <w:r>
+              <w:rPr>
+                <w:rFonts w:ascii="Calibri" w:hAnsi="Calibri"/>
+                <w:sz w:val="20"/>
+              </w:rPr>
+              <w:t xml:space="preserve">Probabilidad en 2031 con el resultado primario en su máximo histórico (3,29%) todos los años</w:t>
             </w:r>
           </w:p>
         </w:tc>
@@ -3726,22 +3969,22 @@
                 <w:rFonts w:ascii="Calibri" w:hAnsi="Calibri"/>
                 <w:sz w:val="20"/>
               </w:rPr>
-              <w:t xml:space="preserve">9,4 de 12,6</w:t>
-            </w:r>
-          </w:p>
-        </w:tc>
-        <w:tc>
-          <w:tcPr/>
-          <w:p>
-            <w:pPr>
-              <w:pStyle w:val="Compact"/>
-            </w:pPr>
-            <w:r>
-              <w:rPr>
-                <w:rFonts w:ascii="Calibri" w:hAnsi="Calibri"/>
-                <w:sz w:val="20"/>
-              </w:rPr>
-              <w:t xml:space="preserve">Costo directo de la deuda en dólares en el efecto de la senda (75%)</w:t>
+              <w:t xml:space="preserve">+8,00 puntos</w:t>
+            </w:r>
+          </w:p>
+        </w:tc>
+        <w:tc>
+          <w:tcPr/>
+          <w:p>
+            <w:pPr>
+              <w:pStyle w:val="Compact"/>
+            </w:pPr>
+            <w:r>
+              <w:rPr>
+                <w:rFonts w:ascii="Calibri" w:hAnsi="Calibri"/>
+                <w:sz w:val="20"/>
+              </w:rPr>
+              <w:t xml:space="preserve">Aumento del resultado primario necesario para llevar la probabilidad de 2031 al 1%</w:t>
             </w:r>
           </w:p>
         </w:tc>
@@ -3758,22 +4001,22 @@
                 <w:rFonts w:ascii="Calibri" w:hAnsi="Calibri"/>
                 <w:sz w:val="20"/>
               </w:rPr>
-              <w:t xml:space="preserve">3 de 84</w:t>
-            </w:r>
-          </w:p>
-        </w:tc>
-        <w:tc>
-          <w:tcPr/>
-          <w:p>
-            <w:pPr>
-              <w:pStyle w:val="Compact"/>
-            </w:pPr>
-            <w:r>
-              <w:rPr>
-                <w:rFonts w:ascii="Calibri" w:hAnsi="Calibri"/>
-                <w:sz w:val="20"/>
-              </w:rPr>
-              <w:t xml:space="preserve">Intervalos de respuesta a la FED que excluyen el cero</w:t>
+              <w:t xml:space="preserve">+9,7 [4,2; 16,0]</w:t>
+            </w:r>
+          </w:p>
+        </w:tc>
+        <w:tc>
+          <w:tcPr/>
+          <w:p>
+            <w:pPr>
+              <w:pStyle w:val="Compact"/>
+            </w:pPr>
+            <w:r>
+              <w:rPr>
+                <w:rFonts w:ascii="Calibri" w:hAnsi="Calibri"/>
+                <w:sz w:val="20"/>
+              </w:rPr>
+              <w:t xml:space="preserve">Senda de la FED 2022-2025: efecto sobre la probabilidad en 2035 (pp), robusto</w:t>
             </w:r>
           </w:p>
         </w:tc>
@@ -3790,7 +4033,135 @@
                 <w:rFonts w:ascii="Calibri" w:hAnsi="Calibri"/>
                 <w:sz w:val="20"/>
               </w:rPr>
-              <w:t xml:space="preserve">16,6%</w:t>
+              <w:t xml:space="preserve">+9,0 [0,3; 16,2]</w:t>
+            </w:r>
+          </w:p>
+        </w:tc>
+        <w:tc>
+          <w:tcPr/>
+          <w:p>
+            <w:pPr>
+              <w:pStyle w:val="Compact"/>
+            </w:pPr>
+            <w:r>
+              <w:rPr>
+                <w:rFonts w:ascii="Calibri" w:hAnsi="Calibri"/>
+                <w:sz w:val="20"/>
+              </w:rPr>
+              <w:t xml:space="preserve">Senda de la FED 2022-2025: efecto sobre la deuda en 2035 (pp del PIB), no robusto</w:t>
+            </w:r>
+          </w:p>
+        </w:tc>
+      </w:tr>
+      <w:tr>
+        <w:tc>
+          <w:tcPr/>
+          <w:p>
+            <w:pPr>
+              <w:pStyle w:val="Compact"/>
+            </w:pPr>
+            <w:r>
+              <w:rPr>
+                <w:rFonts w:ascii="Calibri" w:hAnsi="Calibri"/>
+                <w:sz w:val="20"/>
+              </w:rPr>
+              <w:t xml:space="preserve">+1,1 [0,2; 1,9]</w:t>
+            </w:r>
+          </w:p>
+        </w:tc>
+        <w:tc>
+          <w:tcPr/>
+          <w:p>
+            <w:pPr>
+              <w:pStyle w:val="Compact"/>
+            </w:pPr>
+            <w:r>
+              <w:rPr>
+                <w:rFonts w:ascii="Calibri" w:hAnsi="Calibri"/>
+                <w:sz w:val="20"/>
+              </w:rPr>
+              <w:t xml:space="preserve">Nivel de la FED 0,494 más alto: efecto sobre la probabilidad en 2035 (pp), no resiste Bonferroni</w:t>
+            </w:r>
+          </w:p>
+        </w:tc>
+      </w:tr>
+      <w:tr>
+        <w:tc>
+          <w:tcPr/>
+          <w:p>
+            <w:pPr>
+              <w:pStyle w:val="Compact"/>
+            </w:pPr>
+            <w:r>
+              <w:rPr>
+                <w:rFonts w:ascii="Calibri" w:hAnsi="Calibri"/>
+                <w:sz w:val="20"/>
+              </w:rPr>
+              <w:t xml:space="preserve">8,6 de 9,0</w:t>
+            </w:r>
+          </w:p>
+        </w:tc>
+        <w:tc>
+          <w:tcPr/>
+          <w:p>
+            <w:pPr>
+              <w:pStyle w:val="Compact"/>
+            </w:pPr>
+            <w:r>
+              <w:rPr>
+                <w:rFonts w:ascii="Calibri" w:hAnsi="Calibri"/>
+                <w:sz w:val="20"/>
+              </w:rPr>
+              <w:t xml:space="preserve">Costo directo de la deuda en dólares en el efecto de la senda (96%)</w:t>
+            </w:r>
+          </w:p>
+        </w:tc>
+      </w:tr>
+      <w:tr>
+        <w:tc>
+          <w:tcPr/>
+          <w:p>
+            <w:pPr>
+              <w:pStyle w:val="Compact"/>
+            </w:pPr>
+            <w:r>
+              <w:rPr>
+                <w:rFonts w:ascii="Calibri" w:hAnsi="Calibri"/>
+                <w:sz w:val="20"/>
+              </w:rPr>
+              <w:t xml:space="preserve">2 de 84</w:t>
+            </w:r>
+          </w:p>
+        </w:tc>
+        <w:tc>
+          <w:tcPr/>
+          <w:p>
+            <w:pPr>
+              <w:pStyle w:val="Compact"/>
+            </w:pPr>
+            <w:r>
+              <w:rPr>
+                <w:rFonts w:ascii="Calibri" w:hAnsi="Calibri"/>
+                <w:sz w:val="20"/>
+              </w:rPr>
+              <w:t xml:space="preserve">Intervalos de respuesta a la FED que excluyen el cero</w:t>
+            </w:r>
+          </w:p>
+        </w:tc>
+      </w:tr>
+      <w:tr>
+        <w:tc>
+          <w:tcPr/>
+          <w:p>
+            <w:pPr>
+              <w:pStyle w:val="Compact"/>
+            </w:pPr>
+            <w:r>
+              <w:rPr>
+                <w:rFonts w:ascii="Calibri" w:hAnsi="Calibri"/>
+                <w:sz w:val="20"/>
+              </w:rPr>
+              <w:t xml:space="preserve">24,1%</w:t>
             </w:r>
           </w:p>
         </w:tc>
@@ -3852,7 +4223,7 @@
                 <w:rFonts w:ascii="Calibri" w:hAnsi="Calibri"/>
                 <w:sz w:val="20"/>
               </w:rPr>
-              <w:t xml:space="preserve">48,3 contra 71,5</w:t>
+              <w:t xml:space="preserve">46,6 contra 71,5</w:t>
             </w:r>
           </w:p>
         </w:tc>
@@ -3884,7 +4255,7 @@
                 <w:rFonts w:ascii="Calibri" w:hAnsi="Calibri"/>
                 <w:sz w:val="20"/>
               </w:rPr>
-              <w:t xml:space="preserve">26,8% y 24,1%</w:t>
+              <w:t xml:space="preserve">26,5% y 24,1%</w:t>
             </w:r>
           </w:p>
         </w:tc>
@@ -3916,22 +4287,22 @@
                 <w:rFonts w:ascii="Calibri" w:hAnsi="Calibri"/>
                 <w:sz w:val="20"/>
               </w:rPr>
-              <w:t xml:space="preserve">19</w:t>
-            </w:r>
-          </w:p>
-        </w:tc>
-        <w:tc>
-          <w:tcPr/>
-          <w:p>
-            <w:pPr>
-              <w:pStyle w:val="Compact"/>
-            </w:pPr>
-            <w:r>
-              <w:rPr>
-                <w:rFonts w:ascii="Calibri" w:hAnsi="Calibri"/>
-                <w:sz w:val="20"/>
-              </w:rPr>
-              <w:t xml:space="preserve">Especificaciones de robustez del SVARX (Apéndice A.8)</w:t>
+              <w:t xml:space="preserve">20</w:t>
+            </w:r>
+          </w:p>
+        </w:tc>
+        <w:tc>
+          <w:tcPr/>
+          <w:p>
+            <w:pPr>
+              <w:pStyle w:val="Compact"/>
+            </w:pPr>
+            <w:r>
+              <w:rPr>
+                <w:rFonts w:ascii="Calibri" w:hAnsi="Calibri"/>
+                <w:sz w:val="20"/>
+              </w:rPr>
+              <w:t xml:space="preserve">Especificaciones de robustez del SVARX (Apéndice A.9)</w:t>
             </w:r>
           </w:p>
         </w:tc>
@@ -4256,6 +4627,9 @@
     <w:abstractNumId w:val="991"/>
   </w:num>
   <w:num w:numId="1006">
+    <w:abstractNumId w:val="991"/>
+  </w:num>
+  <w:num w:numId="1007">
     <w:abstractNumId w:val="99411"/>
     <w:lvlOverride w:ilvl="0">
       <w:startOverride w:val="1"/>
@@ -4285,10 +4659,10 @@
       <w:startOverride w:val="1"/>
     </w:lvlOverride>
   </w:num>
-  <w:num w:numId="1007">
+  <w:num w:numId="1008">
     <w:abstractNumId w:val="991"/>
   </w:num>
-  <w:num w:numId="1008">
+  <w:num w:numId="1009">
     <w:abstractNumId w:val="99411"/>
     <w:lvlOverride w:ilvl="0">
       <w:startOverride w:val="1"/>
@@ -4318,7 +4692,7 @@
       <w:startOverride w:val="1"/>
     </w:lvlOverride>
   </w:num>
-  <w:num w:numId="1009">
+  <w:num w:numId="1010">
     <w:abstractNumId w:val="99411"/>
     <w:lvlOverride w:ilvl="0">
       <w:startOverride w:val="1"/>

</xml_diff>

<commit_message>
tesis: compilar el PDF con Liberation Sans y alinear la guía de defensa con los veredictos de D16
La guía de defensa decía que la métrica principal era una decisión
pendiente; ahora informa H1a y H1b no respaldadas y H2 parcialmente
respaldada. El PDF se compila con Liberation Sans (equivalente a Arial)
porque Times New Roman no está disponible.

Co-Authored-By: Claude Opus 5.5 <noreply@anthropic.com>
Claude-Session: https://claude.ai/code/session_018bgUgSbAMcEtYJMckDB2k6
</commit_message>
<xml_diff>
--- a/tesis_oficial_borradores/para_el_grupo/Guia_de_defensa.docx
+++ b/tesis_oficial_borradores/para_el_grupo/Guia_de_defensa.docx
@@ -104,35 +104,33 @@
         <w:t xml:space="preserve">stock</w:t>
       </w:r>
       <w:r>
-        <w:t xml:space="preserve">-flujo; FMI, 2022, recuadro 3), que es la que produce el 1% del FMI, da 3,1% [0,0; 6,3] y H1b no se cumple. La tesis informa las dos con el mismo peso y no elige;</w:t>
-      </w:r>
-      <w:r>
-        <w:t xml:space="preserve"> </w:t>
-      </w:r>
-      <w:r>
-        <w:rPr>
-          <w:bCs/>
-          <w:b/>
-        </w:rPr>
-        <w:t xml:space="preserve">cuál es la principal es una decisión del grupo con Pablo, antes de la defensa</w:t>
-      </w:r>
-      <w:r>
-        <w:t xml:space="preserve"> </w:t>
-      </w:r>
-      <w:r>
-        <w:t xml:space="preserve">(ver D16 en</w:t>
-      </w:r>
-      <w:r>
-        <w:t xml:space="preserve"> </w:t>
-      </w:r>
-      <w:r>
-        <w:rPr>
-          <w:rStyle w:val="VerbatimChar"/>
-        </w:rPr>
-        <w:t xml:space="preserve">_decisiones_finales.md</w:t>
-      </w:r>
-      <w:r>
-        <w:t xml:space="preserve">). Hay que saber explicar esto mejor que cualquier otra cosa: es lo primero que va a preguntar un jurado que conozca el marco del FMI.</w:t>
+        <w:t xml:space="preserve">-flujo; FMI, 2022, recuadro 3), que es la que produce el 1% del FMI, da 3,1% [0,0; 6,3] y H1b no se cumple.</w:t>
+      </w:r>
+      <w:r>
+        <w:t xml:space="preserve"> </w:t>
+      </w:r>
+      <w:r>
+        <w:rPr>
+          <w:bCs/>
+          <w:b/>
+        </w:rPr>
+        <w:t xml:space="preserve">Decidimos (D16, 20/10) que la definición del FMI decide el contraste</w:t>
+      </w:r>
+      <w:r>
+        <w:t xml:space="preserve">, porque H1b compara con cifras que salen de ella; la métrica anual queda como complemento. Resultado:</w:t>
+      </w:r>
+      <w:r>
+        <w:t xml:space="preserve"> </w:t>
+      </w:r>
+      <w:r>
+        <w:rPr>
+          <w:bCs/>
+          <w:b/>
+        </w:rPr>
+        <w:t xml:space="preserve">H1a y H1b no quedan respaldadas; H2, parcialmente</w:t>
+      </w:r>
+      <w:r>
+        <w:t xml:space="preserve">. El mensaje para defender: medido como lo mide el FMI, el riesgo es del mismo orden que el que informa el organismo; lo que su métrica deja afuera por construcción es la valuación anual de la deuda en dólares (57,8% de la deuda), y al incorporarla la probabilidad sube a 27,7%. Una hipótesis no respaldada es un resultado válido: no hay que presentarlo como un fracaso. Hay que saber explicar esto mejor que cualquier otra cosa: es lo primero que va a preguntar un jurado que conozca el marco del FMI.</w:t>
       </w:r>
     </w:p>
     <w:p>
@@ -1491,13 +1489,13 @@
           <w:bCs/>
           <w:b/>
         </w:rPr>
-        <w:t xml:space="preserve">H1b: depende de la métrica.</w:t>
-      </w:r>
-      <w:r>
-        <w:t xml:space="preserve"> </w:t>
-      </w:r>
-      <w:r>
-        <w:t xml:space="preserve">Métrica anual: 27,7% [20,6; 34,7] en 2031 y 29,0% [25,0; 36,1] en 2035, contra 1% y menos de 3% del FMI; con Bonferroni, límites inferiores de 19,0 y 24,1; se cumple en las 21 especificaciones (menor límite inferior: 16,2 en 2031, con tres rezagos; 18,0 en 2035, sin ajuste</w:t>
+        <w:t xml:space="preserve">H1b: no respaldada (se decide con la definición del FMI).</w:t>
+      </w:r>
+      <w:r>
+        <w:t xml:space="preserve"> </w:t>
+      </w:r>
+      <w:r>
+        <w:t xml:space="preserve">Métrica anual, como complemento: 27,7% [20,6; 34,7] en 2031 y 29,0% [25,0; 36,1] en 2035, contra 1% y menos de 3% del FMI; con Bonferroni, límites inferiores de 19,0 y 24,1; se cumple en las 21 especificaciones (menor límite inferior: 16,2 en 2031, con tres rezagos; 18,0 en 2035, sin ajuste</w:t>
       </w:r>
       <w:r>
         <w:t xml:space="preserve"> </w:t>
@@ -1520,13 +1518,13 @@
           <w:bCs/>
           <w:b/>
         </w:rPr>
-        <w:t xml:space="preserve">Respaldada con la anual, no respaldada con la del FMI.</w:t>
-      </w:r>
-      <w:r>
-        <w:t xml:space="preserve"> </w:t>
-      </w:r>
-      <w:r>
-        <w:t xml:space="preserve">Medidas alternativas: con el resultado primario simulado, 29,7%; probabilidad de que la deuda de 2031 supere a la de 2029, 20,0% [17,3; 26,7].</w:t>
+        <w:t xml:space="preserve">Veredicto: no respaldada.</w:t>
+      </w:r>
+      <w:r>
+        <w:t xml:space="preserve"> </w:t>
+      </w:r>
+      <w:r>
+        <w:t xml:space="preserve">Con la anual la supera, pero eso mide el riesgo de valuación anual, no prueba que el FMI subestime. Medidas alternativas: con el resultado primario simulado, 29,7%; probabilidad de que la deuda de 2031 supere a la de 2029, 20,0% [17,3; 26,7].</w:t>
       </w:r>
     </w:p>
     <w:p>
@@ -1542,7 +1540,7 @@
           <w:bCs/>
           <w:b/>
         </w:rPr>
-        <w:t xml:space="preserve">H1a: depende de la métrica en la condición (ii).</w:t>
+        <w:t xml:space="preserve">H1a: no respaldada; se cumple (i) y no (ii).</w:t>
       </w:r>
       <w:r>
         <w:t xml:space="preserve"> </w:t>
@@ -2422,23 +2420,23 @@
                 <w:rFonts w:ascii="Calibri" w:hAnsi="Calibri"/>
                 <w:sz w:val="20"/>
               </w:rPr>
-              <w:t xml:space="preserve">D16: se informan la métrica anual y la definición operativa del FMI con el mismo peso</w:t>
-            </w:r>
-          </w:p>
-        </w:tc>
-        <w:tc>
-          <w:tcPr/>
-          <w:p>
-            <w:pPr>
-              <w:pStyle w:val="Compact"/>
-              <w:jc w:val="left"/>
-            </w:pPr>
-            <w:r>
-              <w:rPr>
-                <w:rFonts w:ascii="Calibri" w:hAnsi="Calibri"/>
-                <w:sz w:val="20"/>
-              </w:rPr>
-              <w:t xml:space="preserve">H1b y H1a (ii) dependen de la métrica; decisión pendiente</w:t>
+              <w:t xml:space="preserve">D16: la definición operativa del FMI decide el contraste; la métrica anual queda como complemento</w:t>
+            </w:r>
+          </w:p>
+        </w:tc>
+        <w:tc>
+          <w:tcPr/>
+          <w:p>
+            <w:pPr>
+              <w:pStyle w:val="Compact"/>
+              <w:jc w:val="left"/>
+            </w:pPr>
+            <w:r>
+              <w:rPr>
+                <w:rFonts w:ascii="Calibri" w:hAnsi="Calibri"/>
+                <w:sz w:val="20"/>
+              </w:rPr>
+              <w:t xml:space="preserve">H1b y H1a (ii) no respaldadas</w:t>
             </w:r>
           </w:p>
         </w:tc>
@@ -3428,7 +3426,7 @@
         <w:pStyle w:val="Compact"/>
       </w:pPr>
       <w:r>
-        <w:t xml:space="preserve">La conclusión sobre el FMI (H1b) y la condición (ii) de H1a dependen de la métrica. Es la debilidad más importante, y conviene plantearla nosotros antes que el jurado.</w:t>
+        <w:t xml:space="preserve">La tesis dijo durante meses que el riesgo era mucho mayor que el del FMI, y con la métrica del FMI no lo es. Si preguntan por qué cambió: detectamos que estábamos comparando con otra métrica, la corregimos y dejamos que el resultado sea el que es. Conviene plantearlo nosotros antes que el jurado.</w:t>
       </w:r>
     </w:p>
     <w:p>

</xml_diff>